<commit_message>
Added A1 print outs
</commit_message>
<xml_diff>
--- a/Module_2_Oct_2026_v2/Module2_exercise_plan_v3.docx
+++ b/Module_2_Oct_2026_v2/Module2_exercise_plan_v3.docx
@@ -48,7 +48,7 @@
         <w:pStyle w:val="BodyText"/>
       </w:pPr>
       <w:r>
-        <w:t xml:space="preserve">Revised 6 Oct: a new column, Print, make or bring, says for every exercise what has to be printed (and how many copies), what has to be cut, what has to be made (a wall board, a Menti poll) and what to bring into the room (markers, sticky notes, tape, AI devices). Counts assume 8 groups (tables of 2 to 5 people) and up to 40 participants; adjust them to the final list.</w:t>
+        <w:t xml:space="preserve">Revised 6 Oct: a new column, Print, make or bring, says for every exercise what has to be printed (and how many copies), what has to be cut, what has to be made (a Menti poll) and what to bring into the room (markers, sticky notes, tape, AI devices). Counts assume 8 groups (tables of 2 to 5 people) and up to 40 participants; adjust them to the final list.</w:t>
       </w:r>
     </w:p>
     <w:p>
@@ -56,7 +56,10 @@
         <w:pStyle w:val="BodyText"/>
       </w:pPr>
       <w:r>
-        <w:t xml:space="preserve">Five exercises now use wall boards, so the room sees every group’s answer at once without anyone voting in front of their peers: Oct 12 S3 and Oct 13 S1 (AI Snapshot claim strips with green, yellow and red dots), Oct 13 S2 (the jump at the line, now eight cards and a number line), Oct 14 S1 (the ratio wall) and Oct 15 S1 (the credibility grid). Two more are optional, alongside the worksheet: Oct 12 S1 (a triage matrix, now with four excerpts) and Oct 13 S3 (find the twins, with profile cards per group and a walking version). Every board’s setup is in the facilitator key of its pack, and the large signs, strips and cards are printed in the pack.</w:t>
+        <w:t xml:space="preserve">Four sessions use a wall board, so the room sees every group’s answer at once without anyone voting in front of their peers: Oct 12 S1 (an optional triage grid beside the worksheet, now with four excerpts), Oct 13 S2 (the jump at the line: eight cards and a number line), Oct 14 S1 (the ratio wall) and Oct 15 S1 (the credibility grid, two sheets). Each board is a ready-made poster: send its PDF (</w:t>
+      </w:r>
+      <w:r>
+        <w:t xml:space="preserve">_board_A1.pdf, in the Module_2_Oct_2026_v2 folder) to the printer at A1 landscape and tape it up; nothing to cut or assemble. A preview and the setup notes are in each pack’s facilitator key. Oct 13 S3’s find the twins also gets profile cards per group, with an optional walking version.</w:t>
       </w:r>
     </w:p>
     <w:bookmarkStart w:id="20" w:name="room-kit-for-the-week"/>
@@ -117,19 +120,19 @@
               <w:jc w:val="left"/>
             </w:pPr>
             <w:r>
-              <w:t xml:space="preserve">Markers</w:t>
-            </w:r>
-          </w:p>
-        </w:tc>
-        <w:tc>
-          <w:tcPr/>
-          <w:p>
-            <w:pPr>
-              <w:pStyle w:val="Compact"/>
-              <w:jc w:val="left"/>
-            </w:pPr>
-            <w:r>
-              <w:t xml:space="preserve">8 markers in 8 different colours, one per group (Oct 12 S1 matrix). One green, one yellow and one red per group: 8 of each (Oct 12 S3 and Oct 13 S1; reuse the same set). Dot stickers in the same three colours work instead. Plus one dark marker per group for sticky notes, and a red marker for the boards.</w:t>
+              <w:t xml:space="preserve">A1 posters</w:t>
+            </w:r>
+          </w:p>
+        </w:tc>
+        <w:tc>
+          <w:tcPr/>
+          <w:p>
+            <w:pPr>
+              <w:pStyle w:val="Compact"/>
+              <w:jc w:val="left"/>
+            </w:pPr>
+            <w:r>
+              <w:t xml:space="preserve">Five A1 landscape prints: Oct12_session1_board_A1.pdf (optional), Oct13_session2_board_A1.pdf, Oct14_session1_board_A1.pdf, and Oct15_session1_board_A1.pdf (two sheets).</w:t>
             </w:r>
           </w:p>
         </w:tc>
@@ -143,19 +146,19 @@
               <w:jc w:val="left"/>
             </w:pPr>
             <w:r>
-              <w:t xml:space="preserve">Sticky notes</w:t>
-            </w:r>
-          </w:p>
-        </w:tc>
-        <w:tc>
-          <w:tcPr/>
-          <w:p>
-            <w:pPr>
-              <w:pStyle w:val="Compact"/>
-              <w:jc w:val="left"/>
-            </w:pPr>
-            <w:r>
-              <w:t xml:space="preserve">At least 200 plain notes: about 160 for the Oct 15 S1 grid, 8 each for Oct 13 S2 and Oct 14 S1, plus spares.</w:t>
+              <w:t xml:space="preserve">Markers</w:t>
+            </w:r>
+          </w:p>
+        </w:tc>
+        <w:tc>
+          <w:tcPr/>
+          <w:p>
+            <w:pPr>
+              <w:pStyle w:val="Compact"/>
+              <w:jc w:val="left"/>
+            </w:pPr>
+            <w:r>
+              <w:t xml:space="preserve">8 markers in 8 different colours, one per group (Oct 12 S1 board), plus one dark marker per group for sticky notes.</w:t>
             </w:r>
           </w:p>
         </w:tc>
@@ -169,19 +172,19 @@
               <w:jc w:val="left"/>
             </w:pPr>
             <w:r>
-              <w:t xml:space="preserve">Wall paper</w:t>
-            </w:r>
-          </w:p>
-        </w:tc>
-        <w:tc>
-          <w:tcPr/>
-          <w:p>
-            <w:pPr>
-              <w:pStyle w:val="Compact"/>
-              <w:jc w:val="left"/>
-            </w:pPr>
-            <w:r>
-              <w:t xml:space="preserve">Brown paper roll or flipchart sheets: about 2 m by 1.5 m for the Oct 12 S1 matrix (optional), a 2 m strip for the Oct 13 S2 number line, a 2 m strip for the Oct 14 S1 ratio wall, about 3 m by 1.5 m for the Oct 15 S1 grid. The claim strips (Oct 12 S3, Oct 13 S1) go straight on the wall.</w:t>
+              <w:t xml:space="preserve">Sticky notes</w:t>
+            </w:r>
+          </w:p>
+        </w:tc>
+        <w:tc>
+          <w:tcPr/>
+          <w:p>
+            <w:pPr>
+              <w:pStyle w:val="Compact"/>
+              <w:jc w:val="left"/>
+            </w:pPr>
+            <w:r>
+              <w:t xml:space="preserve">About 160 small notes (38 x 51 mm) for the Oct 15 S1 grid, and 8 regular notes each for Oct 13 S2 and Oct 14 S1, plus spares.</w:t>
             </w:r>
           </w:p>
         </w:tc>
@@ -195,19 +198,19 @@
               <w:jc w:val="left"/>
             </w:pPr>
             <w:r>
-              <w:t xml:space="preserve">Tape and extras</w:t>
-            </w:r>
-          </w:p>
-        </w:tc>
-        <w:tc>
-          <w:tcPr/>
-          <w:p>
-            <w:pPr>
-              <w:pStyle w:val="Compact"/>
-              <w:jc w:val="left"/>
-            </w:pPr>
-            <w:r>
-              <w:t xml:space="preserve">Masking tape (3 rolls; check the venue allows taping to the walls), coloured tape or ribbon and a star sticker (the Oct 13 S2 interval).</w:t>
+              <w:t xml:space="preserve">Tape</w:t>
+            </w:r>
+          </w:p>
+        </w:tc>
+        <w:tc>
+          <w:tcPr/>
+          <w:p>
+            <w:pPr>
+              <w:pStyle w:val="Compact"/>
+              <w:jc w:val="left"/>
+            </w:pPr>
+            <w:r>
+              <w:t xml:space="preserve">Masking tape or poster putty for the posters (check the venue allows it on the walls).</w:t>
             </w:r>
           </w:p>
         </w:tc>
@@ -233,7 +236,7 @@
               <w:jc w:val="left"/>
             </w:pPr>
             <w:r>
-              <w:t xml:space="preserve">Scissors or a guillotine: claim strips, signs, scenario cards, slips and take-away cards.</w:t>
+              <w:t xml:space="preserve">Scissors or a guillotine: excerpt slips, profile cards, scenario cards and take-away cards.</w:t>
             </w:r>
           </w:p>
         </w:tc>
@@ -280,7 +283,7 @@
         <w:pStyle w:val="FirstParagraph"/>
       </w:pPr>
       <w:r>
-        <w:t xml:space="preserve">Revised 6 Oct: the triage uses four excerpts, with an optional wall matrix. Revised 25 Sep for the live deck (Oct12_session1_live.qmd): the trainer runs R in the browser and the room predicts each result before the Run button is pressed. Print materials are in Oct12_session1_materials.docx, generated by make_session_materials.R from the same data as the deck; each item opens with a print line (copies, cut or not) and the last page is the facilitator key. Polls are Menti placeholders for now; an in-slide poll is planned. One example all session: the fictional traffic-camera programme (the same data Session 2 opens in full). This session works on a ten-road slice and on average speed, so it does not give away Session 2’s collision results.</w:t>
+        <w:t xml:space="preserve">Revised 6 Oct: the triage uses four excerpts, with an optional A1 wall board. Revised 25 Sep for the live deck (Oct12_session1_live.qmd): the trainer runs R in the browser and the room predicts each result before the Run button is pressed. Print materials are in Oct12_session1_materials.docx, generated by make_session_materials.R from the same data as the deck; each item opens with a print line (copies, cut or not) and the last page is the facilitator key. Polls are Menti placeholders for now; an in-slide poll is planned. One example all session: the fictional traffic-camera programme (the same data Session 2 opens in full). This session works on a ten-road slice and on average speed, so it does not give away Session 2’s collision results.</w:t>
       </w:r>
     </w:p>
     <w:tbl>
@@ -1077,31 +1080,31 @@
               <w:jc w:val="left"/>
             </w:pPr>
             <w:r>
-              <w:t xml:space="preserve">Group decision exercise at the table; optional wall matrix</w:t>
-            </w:r>
-          </w:p>
-        </w:tc>
-        <w:tc>
-          <w:tcPr/>
-          <w:p>
-            <w:pPr>
-              <w:pStyle w:val="Compact"/>
-              <w:jc w:val="left"/>
-            </w:pPr>
-            <w:r>
-              <w:t xml:space="preserve">Triage sheet (pack page 4) and one set of four excerpt slips (page 5) per group; optional wall matrix with a marker colour per group</w:t>
-            </w:r>
-          </w:p>
-        </w:tc>
-        <w:tc>
-          <w:tcPr/>
-          <w:p>
-            <w:pPr>
-              <w:pStyle w:val="Compact"/>
-              <w:jc w:val="left"/>
-            </w:pPr>
-            <w:r>
-              <w:t xml:space="preserve">Revised 6 Oct: four excerpts instead of eight (excerpts 1 to 4). Groups act as the commissioner: for each sentence they name the unanswered question (compared to what / how big / how sure) and decide act / do not act / ask first, then say which one they were most tempted to act on. Optional wall matrix, as a back-up or an addition to the sheet: rows are the unanswered question, columns are act / ask first / do not act. Each group draws a stripe in its own marker colour across its four slips and tapes them into the matrix, so the trainer can see which groups placed the same excerpt differently and ask them why (usually excerpts 2 and 4). None of the four earns</w:t>
+              <w:t xml:space="preserve">Group decision exercise at the table; optional A1 wall board</w:t>
+            </w:r>
+          </w:p>
+        </w:tc>
+        <w:tc>
+          <w:tcPr/>
+          <w:p>
+            <w:pPr>
+              <w:pStyle w:val="Compact"/>
+              <w:jc w:val="left"/>
+            </w:pPr>
+            <w:r>
+              <w:t xml:space="preserve">Triage sheet (pack page 4) and one set of four excerpt slips (page 5) per group; optional A1 wall board with a marker colour per group</w:t>
+            </w:r>
+          </w:p>
+        </w:tc>
+        <w:tc>
+          <w:tcPr/>
+          <w:p>
+            <w:pPr>
+              <w:pStyle w:val="Compact"/>
+              <w:jc w:val="left"/>
+            </w:pPr>
+            <w:r>
+              <w:t xml:space="preserve">Revised 6 Oct: four excerpts instead of eight (excerpts 1 to 4). Groups act as the commissioner: for each sentence they name the unanswered question (compared to what / how big / how sure) and decide act / do not act / ask first, then say which one they were most tempted to act on. Optional wall board, as a back-up or an addition to the sheet: an A1 poster (Oct12_session1_board_A1.pdf) with rows for the unanswered question and columns for act / ask first / do not act. Each group writes the four excerpt numbers in the matching cells in its own marker colour, so the trainer can see which groups placed the same excerpt differently and ask them why (usually excerpts 2 and 4). None of the four earns</w:t>
             </w:r>
             <w:r>
               <w:t xml:space="preserve"> </w:t>
@@ -1128,7 +1131,7 @@
               <w:jc w:val="left"/>
             </w:pPr>
             <w:r>
-              <w:t xml:space="preserve">Print: triage sheet (pack page 4), 1 per group (8). Print and cut: excerpt slips 1 to 4 (pack page 5), 1 set per group (8 sets). Optional wall matrix: make a grid of 3 columns by 4 rows (flipchart sheets, about 2 m by 1.5 m); print and cut the matrix signs (last page of the pack); bring 8 markers in 8 different colours (one per group) and masking tape.</w:t>
+              <w:t xml:space="preserve">Print: triage sheet (pack page 4), 1 per group (8). Print and cut: excerpt slips 1 to 4 (pack page 5), 1 set per group (8 sets). Optional wall board: print Oct12_session1_board_A1.pdf at A1 (1 copy; preview at the end of the pack). Bring: 8 markers in 8 different colours (one per group) and masking tape.</w:t>
             </w:r>
           </w:p>
         </w:tc>
@@ -2142,7 +2145,7 @@
         <w:pStyle w:val="FirstParagraph"/>
       </w:pPr>
       <w:r>
-        <w:t xml:space="preserve">Revised 6 Oct: the AI Snapshot is now a wall board (claim strips and dots). Revised 25 Sep for the live deck (Oct12_session3_live.qmd): the trainer runs R in the browser and the room predicts each result before the Run button is pressed. Print materials are in Oct12_session3_materials.docx, generated by make_session_materials.R from the same data as the deck; each item opens with a print line (copies, cut or not) and the last page is the facilitator key. Polls are Menti placeholders for now; an in-slide poll is planned. One example all session: GreenWaste. The Abu Dhabi RCT slot and the school-zone case are dropped (one example per session).</w:t>
+        <w:t xml:space="preserve">Revised 25 Sep for the live deck (Oct12_session3_live.qmd): the trainer runs R in the browser and the room predicts each result before the Run button is pressed. Print materials are in Oct12_session3_materials.docx, generated by make_session_materials.R from the same data as the deck; each item opens with a print line (copies, cut or not) and the last page is the facilitator key. Polls are Menti placeholders for now; an in-slide poll is planned. One example all session: GreenWaste. The Abu Dhabi RCT slot and the school-zone case are dropped (one example per session).</w:t>
       </w:r>
     </w:p>
     <w:tbl>
@@ -2948,55 +2951,55 @@
               <w:jc w:val="left"/>
             </w:pPr>
             <w:r>
-              <w:t xml:space="preserve">Group mark-up at the table, then a wall board (dots), then AI</w:t>
-            </w:r>
-          </w:p>
-        </w:tc>
-        <w:tc>
-          <w:tcPr/>
-          <w:p>
-            <w:pPr>
-              <w:pStyle w:val="Compact"/>
-              <w:jc w:val="left"/>
-            </w:pPr>
-            <w:r>
-              <w:t xml:space="preserve">AI handout (pack page 2), 1 per group; claim strips on the wall; green, yellow and red markers per group; one AI device per group</w:t>
-            </w:r>
-          </w:p>
-        </w:tc>
-        <w:tc>
-          <w:tcPr/>
-          <w:p>
-            <w:pPr>
-              <w:pStyle w:val="Compact"/>
-              <w:jc w:val="left"/>
-            </w:pPr>
-            <w:r>
-              <w:t xml:space="preserve">Revised 6 Oct: a wall board. The AI paragraph is split into six numbered claims, printed on the handout and as large strips taped down the wall. At the table, each group marks every claim with the marker rules on the handout: green (the evidence supports it), yellow (partly true, or true but not enough to act on), red (not supported). One person per group then puts one dot of each claim’s colour on its strip. The trainer reads the wall before the debrief slide: strips 2, 4 and 5 should be red, and strip 3 (half right) is where groups disagree. The claims are no longer flagged on the exercise slide, so groups find the errors themselves. Then groups run the same prompt, then the better prompt printed below it, and paste the better answer into a fresh chat to check. Setup and expected wall are in the facilitator key.</w:t>
-            </w:r>
-          </w:p>
-        </w:tc>
-        <w:tc>
-          <w:tcPr/>
-          <w:p>
-            <w:pPr>
-              <w:pStyle w:val="Compact"/>
-              <w:jc w:val="left"/>
-            </w:pPr>
-            <w:r>
-              <w:t xml:space="preserve">Print: AI handout (pack page 2), 1 per group (8). Print and cut: the six claim strips (last pages of the pack), 1 set for the wall. Make: tape the strips down one wall in order, with room beside each for 8 dots. Bring: one green, one yellow and one red marker per group (8 of each) or dot stickers in the same colours; masking tape. Bring: one device with an AI tool per group.</w:t>
-            </w:r>
-          </w:p>
-        </w:tc>
-        <w:tc>
-          <w:tcPr/>
-          <w:p>
-            <w:pPr>
-              <w:pStyle w:val="Compact"/>
-              <w:jc w:val="left"/>
-            </w:pPr>
-            <w:r>
-              <w:t xml:space="preserve">Built: print, cut and set up the wall</w:t>
+              <w:t xml:space="preserve">Pair hands-on + AI</w:t>
+            </w:r>
+          </w:p>
+        </w:tc>
+        <w:tc>
+          <w:tcPr/>
+          <w:p>
+            <w:pPr>
+              <w:pStyle w:val="Compact"/>
+              <w:jc w:val="left"/>
+            </w:pPr>
+            <w:r>
+              <w:t xml:space="preserve">Handout (pack page 2), 1 per pair; one AI device per pair</w:t>
+            </w:r>
+          </w:p>
+        </w:tc>
+        <w:tc>
+          <w:tcPr/>
+          <w:p>
+            <w:pPr>
+              <w:pStyle w:val="Compact"/>
+              <w:jc w:val="left"/>
+            </w:pPr>
+            <w:r>
+              <w:t xml:space="preserve">Pairs mark up the flawed paragraph, run the same short prompt, then the better prompt printed below it, and paste the better answer into a fresh chat to check. Facilitator key in the pack.</w:t>
+            </w:r>
+          </w:p>
+        </w:tc>
+        <w:tc>
+          <w:tcPr/>
+          <w:p>
+            <w:pPr>
+              <w:pStyle w:val="Compact"/>
+              <w:jc w:val="left"/>
+            </w:pPr>
+            <w:r>
+              <w:t xml:space="preserve">Print: AI handout (pack page 2), 1 per pair (about 20). Bring: one device with an AI tool per pair.</w:t>
+            </w:r>
+          </w:p>
+        </w:tc>
+        <w:tc>
+          <w:tcPr/>
+          <w:p>
+            <w:pPr>
+              <w:pStyle w:val="Compact"/>
+              <w:jc w:val="left"/>
+            </w:pPr>
+            <w:r>
+              <w:t xml:space="preserve">Built: print</w:t>
             </w:r>
           </w:p>
         </w:tc>
@@ -3189,7 +3192,7 @@
         <w:pStyle w:val="FirstParagraph"/>
       </w:pPr>
       <w:r>
-        <w:t xml:space="preserve">Revised 6 Oct: the AI Snapshot is now a wall board (claim strips and dots). Revised 25 Sep: GreenWaste only (the Abu Dhabi DOH case was dropped). Print materials are in Oct13_session1_materials.docx, generated by make_session_materials.R from the same data as the deck; each item opens with a print line (copies, cut or not) and the last page is the facilitator key. Participant copies, without the key, are on the course website.</w:t>
+        <w:t xml:space="preserve">Revised 25 Sep: GreenWaste only (the Abu Dhabi DOH case was dropped). Print materials are in Oct13_session1_materials.docx, generated by make_session_materials.R from the same data as the deck; each item opens with a print line (copies, cut or not) and the last page is the facilitator key. Participant copies, without the key, are on the course website.</w:t>
       </w:r>
     </w:p>
     <w:tbl>
@@ -3770,67 +3773,139 @@
               <w:jc w:val="left"/>
             </w:pPr>
             <w:r>
-              <w:t xml:space="preserve">Group mark-up at the table, then a wall board (dots), then AI</w:t>
-            </w:r>
-          </w:p>
-        </w:tc>
-        <w:tc>
-          <w:tcPr/>
-          <w:p>
-            <w:pPr>
-              <w:pStyle w:val="Compact"/>
-              <w:jc w:val="left"/>
-            </w:pPr>
-            <w:r>
-              <w:t xml:space="preserve">AI handout (pack page 3), 1 per group; claim strips on the wall; green, yellow and red markers per group; a working AI tool per table</w:t>
-            </w:r>
-          </w:p>
-        </w:tc>
-        <w:tc>
-          <w:tcPr/>
-          <w:p>
-            <w:pPr>
-              <w:pStyle w:val="Compact"/>
-              <w:jc w:val="left"/>
-            </w:pPr>
-            <w:r>
-              <w:t xml:space="preserve">Revised 6 Oct: a wall board, run like Oct 12 S3. The AI answer is split into seven numbered claims, printed on the handout and as large strips taped down the wall. Groups mark each claim green, yellow or red at the table (the marker rules are on the handout), then one person per group puts one dot on each strip. Expected wall: strips 1, 2 and 4 green; 3, 5, 6 and 7 red. Start the debrief with strip 6 (</w:t>
+              <w:t xml:space="preserve">Group work (pairs / tables)</w:t>
+            </w:r>
+          </w:p>
+        </w:tc>
+        <w:tc>
+          <w:tcPr/>
+          <w:p>
+            <w:pPr>
+              <w:pStyle w:val="Compact"/>
+              <w:jc w:val="left"/>
+            </w:pPr>
+            <w:r>
+              <w:t xml:space="preserve">AI handout (pack page 3), 1 per pair; a working AI tool per table</w:t>
+            </w:r>
+          </w:p>
+        </w:tc>
+        <w:tc>
+          <w:tcPr/>
+          <w:p>
+            <w:pPr>
+              <w:pStyle w:val="Compact"/>
+              <w:jc w:val="left"/>
+            </w:pPr>
+            <w:r>
+              <w:t xml:space="preserve">(1) Mark up the flawed AI answer to</w:t>
+            </w:r>
+            <w:r>
+              <w:t xml:space="preserve"> </w:t>
             </w:r>
             <w:r>
               <w:t xml:space="preserve">“</w:t>
             </w:r>
             <w:r>
+              <w:t xml:space="preserve">Explain this regression table…</w:t>
+            </w:r>
+            <w:r>
+              <w:t xml:space="preserve">”</w:t>
+            </w:r>
+            <w:r>
+              <w:t xml:space="preserve">. Planted claims:</w:t>
+            </w:r>
+            <w:r>
+              <w:t xml:space="preserve"> </w:t>
+            </w:r>
+            <w:r>
+              <w:t xml:space="preserve">“</w:t>
+            </w:r>
+            <w:r>
+              <w:t xml:space="preserve">so the programme was a success</w:t>
+            </w:r>
+            <w:r>
+              <w:t xml:space="preserve">”</w:t>
+            </w:r>
+            <w:r>
+              <w:t xml:space="preserve"> </w:t>
+            </w:r>
+            <w:r>
+              <w:t xml:space="preserve">(significant is not the same as meeting the rule),</w:t>
+            </w:r>
+            <w:r>
+              <w:t xml:space="preserve"> </w:t>
+            </w:r>
+            <w:r>
+              <w:t xml:space="preserve">“</w:t>
+            </w:r>
+            <w:r>
+              <w:t xml:space="preserve">the interval does not include zero, which confirms the finding is robust</w:t>
+            </w:r>
+            <w:r>
+              <w:t xml:space="preserve">”</w:t>
+            </w:r>
+            <w:r>
+              <w:t xml:space="preserve">,</w:t>
+            </w:r>
+            <w:r>
+              <w:t xml:space="preserve"> </w:t>
+            </w:r>
+            <w:r>
+              <w:t xml:space="preserve">“</w:t>
+            </w:r>
+            <w:r>
               <w:t xml:space="preserve">the parallel trends assumption has been satisfied</w:t>
             </w:r>
             <w:r>
               <w:t xml:space="preserve">”</w:t>
             </w:r>
             <w:r>
-              <w:t xml:space="preserve">, a test that cannot be run on two waves). The claims are no longer flagged on the exercise slide. Then groups run the better prompt from the handout and paste the second answer into a fresh chat to check it for claims about tests that were never run.</w:t>
-            </w:r>
-          </w:p>
-        </w:tc>
-        <w:tc>
-          <w:tcPr/>
-          <w:p>
-            <w:pPr>
-              <w:pStyle w:val="Compact"/>
-              <w:jc w:val="left"/>
-            </w:pPr>
-            <w:r>
-              <w:t xml:space="preserve">Print: AI handout (pack page 3), 1 per group (8). Print and cut: the seven claim strips (last pages of the pack), 1 set for the wall. Make: tape the strips down one wall in order, with room beside each for 8 dots. Bring: one green, one yellow and one red marker per group (8 of each; the same set as Oct 12 S3) or dot stickers; masking tape. Bring: one device with an AI tool per group.</w:t>
-            </w:r>
-          </w:p>
-        </w:tc>
-        <w:tc>
-          <w:tcPr/>
-          <w:p>
-            <w:pPr>
-              <w:pStyle w:val="Compact"/>
-              <w:jc w:val="left"/>
-            </w:pPr>
-            <w:r>
-              <w:t xml:space="preserve">Built: print, cut and set up the wall</w:t>
+              <w:t xml:space="preserve"> </w:t>
+            </w:r>
+            <w:r>
+              <w:t xml:space="preserve">(a test that cannot be run on two waves), and</w:t>
+            </w:r>
+            <w:r>
+              <w:t xml:space="preserve"> </w:t>
+            </w:r>
+            <w:r>
+              <w:t xml:space="preserve">“</w:t>
+            </w:r>
+            <w:r>
+              <w:t xml:space="preserve">clears the 1,000 AED threshold</w:t>
+            </w:r>
+            <w:r>
+              <w:t xml:space="preserve">”</w:t>
+            </w:r>
+            <w:r>
+              <w:t xml:space="preserve"> </w:t>
+            </w:r>
+            <w:r>
+              <w:t xml:space="preserve">(false). (2) Run the better prompt from the handout, compare, then paste the second answer into a fresh chat to review it. Print only.</w:t>
+            </w:r>
+          </w:p>
+        </w:tc>
+        <w:tc>
+          <w:tcPr/>
+          <w:p>
+            <w:pPr>
+              <w:pStyle w:val="Compact"/>
+              <w:jc w:val="left"/>
+            </w:pPr>
+            <w:r>
+              <w:t xml:space="preserve">Print: AI handout (pack page 3), 1 per pair (about 20). Bring: a working AI tool per table.</w:t>
+            </w:r>
+          </w:p>
+        </w:tc>
+        <w:tc>
+          <w:tcPr/>
+          <w:p>
+            <w:pPr>
+              <w:pStyle w:val="Compact"/>
+              <w:jc w:val="left"/>
+            </w:pPr>
+            <w:r>
+              <w:t xml:space="preserve">Built: print</w:t>
             </w:r>
           </w:p>
         </w:tc>
@@ -4068,7 +4143,7 @@
         <w:pStyle w:val="FirstParagraph"/>
       </w:pPr>
       <w:r>
-        <w:t xml:space="preserve">Revised 6 Oct: the jump-at-the-line exercise runs in groups with eight cards and a wall number line; the scorecard and AI handout moved to pack pages 9 and 10. Revised 25 Sep for the live deck (Oct13_session2_live.qmd): the trainer runs R in the browser and the room predicts each result before the Run button is pressed. Print materials are in Oct13_session2_materials.docx, generated by make_session_materials.R from the same data as the deck; each item opens with a print line (copies, cut or not) and the last page is the facilitator key. Polls are Menti placeholders for now; an in-slide poll is planned. One example all session: GreenWaste, offered neighbourhoods only (as Module 1). The Abu Dhabi DCD slot is dropped. Corrected numbers: -791 within 2 points of the cut-off; Module 1’s -1,119 (-905 with covariates). The earlier -249 came from pooling all neighbourhoods.</w:t>
+        <w:t xml:space="preserve">Revised 6 Oct: the jump-at-the-line exercise runs in groups with eight cards and an A1 number-line poster; the scorecard and AI handout moved to pack pages 9 and 10. Revised 25 Sep for the live deck (Oct13_session2_live.qmd): the trainer runs R in the browser and the room predicts each result before the Run button is pressed. Print materials are in Oct13_session2_materials.docx, generated by make_session_materials.R from the same data as the deck; each item opens with a print line (copies, cut or not) and the last page is the facilitator key. Polls are Menti placeholders for now; an in-slide poll is planned. One example all session: GreenWaste, offered neighbourhoods only (as Module 1). The Abu Dhabi DCD slot is dropped. Corrected numbers: -791 within 2 points of the cut-off; Module 1’s -1,119 (-905 with covariates). The earlier -249 came from pooling all neighbourhoods.</w:t>
       </w:r>
     </w:p>
     <w:tbl>
@@ -4405,31 +4480,31 @@
               <w:jc w:val="left"/>
             </w:pPr>
             <w:r>
-              <w:t xml:space="preserve">Revised 6 Oct: groups instead of pairs, and eight cards instead of four, so every group has a different card (no duplicates). Each card has six real businesses a side within one point of 58 (costs rounded to 10 AED). Each group computes its jump, writes it and its card letter on a sticky note and puts it on the wall number line (-2,000 to +500 AED, the 1,000 AED rule in red). The jumps run from about -1,740 to +15 (card H goes the wrong way). The room explains the spread; the trainer presses Run (the regression on 773 businesses), then adds the estimate (-791) as a star and its interval (-1,084 to -498) as a strip of coloured tape. How many notes fall inside the interval? Setup is in the facilitator key.</w:t>
-            </w:r>
-          </w:p>
-        </w:tc>
-        <w:tc>
-          <w:tcPr/>
-          <w:p>
-            <w:pPr>
-              <w:pStyle w:val="Compact"/>
-              <w:jc w:val="left"/>
-            </w:pPr>
-            <w:r>
-              <w:t xml:space="preserve">Print: pack pages 1-8, one card per group (each of the eight cards once). Print and cut: number-line signs (last page of the pack). Make: a number line on the wall, a paper strip about 2 m long from -2,000 to +500 AED, with the rule at -1,000 marked in red. Bring: 8 sticky notes and 8 markers, masking tape, a red marker, coloured tape or ribbon (for the interval) and a star sticker.</w:t>
-            </w:r>
-          </w:p>
-        </w:tc>
-        <w:tc>
-          <w:tcPr/>
-          <w:p>
-            <w:pPr>
-              <w:pStyle w:val="Compact"/>
-              <w:jc w:val="left"/>
-            </w:pPr>
-            <w:r>
-              <w:t xml:space="preserve">Built: print, cut and set up the wall</w:t>
+              <w:t xml:space="preserve">Revised 6 Oct: groups instead of pairs, and eight cards instead of four, so every group has a different card (no duplicates). Each card has six real businesses a side within one point of 58 (costs rounded to 10 AED). Each group computes its jump, writes it and its card letter on a sticky note and puts it on the wall number line, an A1 poster (Oct13_session2_board_A1.pdf: -2,000 to +500 AED, the 1,000 AED rule in red). The jumps run from about -1,740 to +15 (card H goes the wrong way). The room explains the spread; the trainer presses Run (the regression on 773 businesses), then draws the estimate (-791) as a star and its interval (-1,084 to -498) as a line below the poster’s number line. How many notes fall inside the interval? Setup is in the facilitator key.</w:t>
+            </w:r>
+          </w:p>
+        </w:tc>
+        <w:tc>
+          <w:tcPr/>
+          <w:p>
+            <w:pPr>
+              <w:pStyle w:val="Compact"/>
+              <w:jc w:val="left"/>
+            </w:pPr>
+            <w:r>
+              <w:t xml:space="preserve">Print: pack pages 1-8, one card per group (each of the eight cards once). Print at A1: Oct13_session2_board_A1.pdf, the number line (1 copy; preview at the end of the pack). Bring: 8 sticky notes and 8 markers, masking tape, and a marker to draw the regression.</w:t>
+            </w:r>
+          </w:p>
+        </w:tc>
+        <w:tc>
+          <w:tcPr/>
+          <w:p>
+            <w:pPr>
+              <w:pStyle w:val="Compact"/>
+              <w:jc w:val="left"/>
+            </w:pPr>
+            <w:r>
+              <w:t xml:space="preserve">Built: print and cut, including the A1 board</w:t>
             </w:r>
           </w:p>
         </w:tc>
@@ -5727,7 +5802,7 @@
         <w:pStyle w:val="FirstParagraph"/>
       </w:pPr>
       <w:r>
-        <w:t xml:space="preserve">Revised 6 Oct: the stress test now uses a ratio wall (prediction, then the real ratio). Revised 25 Sep for the live deck (Oct14_session1_live.qmd): the trainer runs R in the browser and the room predicts each result before the Run button is pressed. Print materials are in Oct14_session1_materials.docx, generated by make_session_materials.R from the same data as the deck; each item opens with a print line (copies, cut or not) and the last page is the facilitator key. Polls are Menti placeholders for now; an in-slide poll is planned. One example all session: the GreenWaste cost-benefit model. The Abu Dhabi case slot is dropped and replaced by the stress-test exercise.</w:t>
+        <w:t xml:space="preserve">Revised 6 Oct: the stress test now uses an A1 ratio-wall poster (prediction, then the real ratio). Revised 25 Sep for the live deck (Oct14_session1_live.qmd): the trainer runs R in the browser and the room predicts each result before the Run button is pressed. Print materials are in Oct14_session1_materials.docx, generated by make_session_materials.R from the same data as the deck; each item opens with a print line (copies, cut or not) and the last page is the facilitator key. Polls are Menti placeholders for now; an in-slide poll is planned. One example all session: the GreenWaste cost-benefit model. The Abu Dhabi case slot is dropped and replaced by the stress-test exercise.</w:t>
       </w:r>
     </w:p>
     <w:tbl>
@@ -6272,31 +6347,31 @@
               <w:jc w:val="left"/>
             </w:pPr>
             <w:r>
-              <w:t xml:space="preserve">Revised 6 Oct: a ratio wall. Each group takes a card (old habits, hidden costs, the finance ministry’s 8%, a shorter life, both 1 and 2; with 8 groups, cards 1 to 3 appear twice), predicts the ratio and posts the prediction on a sticky note on the wall (a line from 0 to 2.0, break-even at 1.0 in red, the headline at 1.87). The group calls its settings, the trainer runs them on the four-slider calculator, and the group puts its card at the real ratio. Debrief from the wall: how far off were the predictions, and why does only card 5 land below break-even? The recording sheet now has a row for the prediction. Ratios and setup are in the facilitator key.</w:t>
-            </w:r>
-          </w:p>
-        </w:tc>
-        <w:tc>
-          <w:tcPr/>
-          <w:p>
-            <w:pPr>
-              <w:pStyle w:val="Compact"/>
-              <w:jc w:val="left"/>
-            </w:pPr>
-            <w:r>
-              <w:t xml:space="preserve">Print and cut: scenario cards (pack page 2), 2 sets; hand out cards 1 to 5, then 1 to 3 again, so each of the 8 groups holds one. Print: recording sheet (pack page 3), 1 per group (8). Print and cut: ratio-wall signs (last page of the pack). Make: a ratio wall, a line about 2 m long from 0 to 2.0, with a thick red line at 1.0 (break-even) and the headline 1.87 marked. Bring: 8 sticky notes and 8 markers, masking tape, a red marker.</w:t>
-            </w:r>
-          </w:p>
-        </w:tc>
-        <w:tc>
-          <w:tcPr/>
-          <w:p>
-            <w:pPr>
-              <w:pStyle w:val="Compact"/>
-              <w:jc w:val="left"/>
-            </w:pPr>
-            <w:r>
-              <w:t xml:space="preserve">Built: print, cut and set up the wall</w:t>
+              <w:t xml:space="preserve">Revised 6 Oct: a ratio wall. Each group takes a card (old habits, hidden costs, the finance ministry’s 8%, a shorter life, both 1 and 2; with 8 groups, cards 1 to 3 appear twice), predicts the ratio and posts the prediction on a sticky note on the ratio wall, an A1 poster (Oct14_session1_board_A1.pdf: a line from 0 to 2.0, break-even at 1.0 in red, the headline at 1.87). The group calls its settings, the trainer runs them on the four-slider calculator, and the group puts its card at the real ratio. Debrief from the wall: how far off were the predictions, and why does only card 5 land below break-even? The recording sheet now has a row for the prediction. Ratios and setup are in the facilitator key.</w:t>
+            </w:r>
+          </w:p>
+        </w:tc>
+        <w:tc>
+          <w:tcPr/>
+          <w:p>
+            <w:pPr>
+              <w:pStyle w:val="Compact"/>
+              <w:jc w:val="left"/>
+            </w:pPr>
+            <w:r>
+              <w:t xml:space="preserve">Print and cut: scenario cards (pack page 2), 2 sets; hand out cards 1 to 5, then 1 to 3 again, so each of the 8 groups holds one. Print: recording sheet (pack page 3), 1 per group (8). Print at A1: Oct14_session1_board_A1.pdf, the ratio wall (1 copy; preview at the end of the pack). Bring: 8 sticky notes and 8 markers, masking tape.</w:t>
+            </w:r>
+          </w:p>
+        </w:tc>
+        <w:tc>
+          <w:tcPr/>
+          <w:p>
+            <w:pPr>
+              <w:pStyle w:val="Compact"/>
+              <w:jc w:val="left"/>
+            </w:pPr>
+            <w:r>
+              <w:t xml:space="preserve">Built: print and cut, including the A1 board</w:t>
             </w:r>
           </w:p>
         </w:tc>
@@ -7821,7 +7896,7 @@
         <w:pStyle w:val="FirstParagraph"/>
       </w:pPr>
       <w:r>
-        <w:t xml:space="preserve">Revised 6 Oct: ratings go on a wall grid, and the debrief reads the grid instead of asking for a show of colours. The fictitious report is Oct15_session1_report.docx, rendered from Oct15_session1_report.qmd. Print materials are in Oct15_session1_materials.docx, generated by make_session_materials.R from the same data as the deck; each item opens with a print line (copies, cut or not) and the last page is the facilitator key. Participant copies, without the key, are on the course website. The rating sheet and the reveal slides both read qa_rating.R.</w:t>
+        <w:t xml:space="preserve">Revised 6 Oct: ratings go on a two-sheet A1 wall grid, and the debrief reads the grid instead of asking for a show of colours. The fictitious report is Oct15_session1_report.docx, rendered from Oct15_session1_report.qmd. Print materials are in Oct15_session1_materials.docx, generated by make_session_materials.R from the same data as the deck; each item opens with a print line (copies, cut or not) and the last page is the facilitator key. Participant copies, without the key, are on the course website. The rating sheet and the reveal slides both read qa_rating.R.</w:t>
       </w:r>
     </w:p>
     <w:tbl>
@@ -8111,19 +8186,19 @@
               <w:jc w:val="left"/>
             </w:pPr>
             <w:r>
-              <w:t xml:space="preserve">Print: the report (Oct15_session1_report.docx), 1 per participant (40); rating sheet (pack pages 1 and 2, back to back), 1 per participant (40). Bring: sticky notes, about 4 per participant (160), and pens.</w:t>
-            </w:r>
-          </w:p>
-        </w:tc>
-        <w:tc>
-          <w:tcPr/>
-          <w:p>
-            <w:pPr>
-              <w:pStyle w:val="Compact"/>
-              <w:jc w:val="left"/>
-            </w:pPr>
-            <w:r>
-              <w:t xml:space="preserve">Built: print and set up the wall</w:t>
+              <w:t xml:space="preserve">Print: the report (Oct15_session1_report.docx), 1 per participant (40); rating sheet (pack pages 1 and 2, back to back), 1 per participant (40). Bring: small sticky notes (about 38 x 51 mm), about 4 per participant (160), and pens.</w:t>
+            </w:r>
+          </w:p>
+        </w:tc>
+        <w:tc>
+          <w:tcPr/>
+          <w:p>
+            <w:pPr>
+              <w:pStyle w:val="Compact"/>
+              <w:jc w:val="left"/>
+            </w:pPr>
+            <w:r>
+              <w:t xml:space="preserve">Built: print, including the A1 board</w:t>
             </w:r>
           </w:p>
         </w:tc>
@@ -8185,7 +8260,7 @@
               <w:jc w:val="left"/>
             </w:pPr>
             <w:r>
-              <w:t xml:space="preserve">Rate the remaining five sections (design, data, results, limitations, conclusions) on the rating sheet, one colour plus the reason that decided it. Revised 6 Oct: pairs post one sticky note per section on the wall grid (six columns for the rated sections, three rows: Green, Amber, Red). In the debrief the trainer reads each section’s column from the wall before the reveal, in place of a show of colours, and puts the executive-summary and Results columns side by side at</w:t>
+              <w:t xml:space="preserve">Rate the remaining five sections (design, data, results, limitations, conclusions) on the rating sheet, one colour plus the reason that decided it. Revised 6 Oct: pairs post one small sticky note per section on the wall grid, two A1 sheets (Oct15_session1_board_A1.pdf: the executive summary on its own, then Sections 3 to 7; rows Green, Amber, Red). In the debrief the trainer reads each section’s column from the wall before the reveal, in place of a show of colours, and puts the executive-summary and Results columns side by side at</w:t>
             </w:r>
             <w:r>
               <w:t xml:space="preserve"> </w:t>
@@ -8212,19 +8287,19 @@
               <w:jc w:val="left"/>
             </w:pPr>
             <w:r>
-              <w:t xml:space="preserve">Make: the wall grid, about 3 m wide (flipchart sheets or brown paper), with six columns for report sections 1, 3, 4, 5, 6 and 7 and three rows: Green, Amber, Red. Print and cut: grid signs (last page of the pack). Bring: masking tape; a green, an amber and a red marker (or dots) to colour the row signs.</w:t>
-            </w:r>
-          </w:p>
-        </w:tc>
-        <w:tc>
-          <w:tcPr/>
-          <w:p>
-            <w:pPr>
-              <w:pStyle w:val="Compact"/>
-              <w:jc w:val="left"/>
-            </w:pPr>
-            <w:r>
-              <w:t xml:space="preserve">Built: print and set up the wall</w:t>
+              <w:t xml:space="preserve">Print at A1: Oct15_session1_board_A1.pdf, two sheets (the executive summary on its own; Sections 3 to 7), taped side by side; preview at the end of the pack. Bring: masking tape.</w:t>
+            </w:r>
+          </w:p>
+        </w:tc>
+        <w:tc>
+          <w:tcPr/>
+          <w:p>
+            <w:pPr>
+              <w:pStyle w:val="Compact"/>
+              <w:jc w:val="left"/>
+            </w:pPr>
+            <w:r>
+              <w:t xml:space="preserve">Built: print, including the A1 board</w:t>
             </w:r>
           </w:p>
         </w:tc>

</xml_diff>

<commit_message>
Rebuild Day 1 around shorter report reading practice
Use the approved 60/60/75-minute route with concise decks, two-sided participant worksheets and source-based AI checks. Preserve the claim triage and add a local room poll with prediction, hidden voting totals and before/after phases. Exclude the former Day 4 final workshop from the active print build.

Render and inspect all Day 1 print pages; walk the decks and run both trainer cells; check evidence reveals, keyboard choices and two-browser room voting. Keep the case CSV unchanged and prepare the next Day 2 tables for review.

Co-Authored-By: Codex <noreply@openai.com>
</commit_message>
<xml_diff>
--- a/Module_2_Oct_2026_v2/Module2_exercise_plan_v3.docx
+++ b/Module_2_Oct_2026_v2/Module2_exercise_plan_v3.docx
@@ -40,7 +40,7 @@
         <w:pStyle w:val="BodyText"/>
       </w:pPr>
       <w:r>
-        <w:t xml:space="preserve">All twelve sessions now have print materials: one Word pack per session, generated by make_session_materials.R. Lucas’s six sessions (Oct 12 S1 and S3, Oct 13 S2, Oct 14 S1 and S3, Oct 15 S2) were revised on 25 Sep for the live decks. Fiona’s six (Oct 12 S2, Oct 13 S1 and S3, Oct 14 S2, Oct 15 S1 and S3) were given their packs on 25 Sep. Every session uses one example only, so the Abu Dhabi DOH and DCD case slots are dropped.</w:t>
+        <w:t>The programme now has eleven course-owned sessions. Day 1 has been rebuilt with two-sided participant sheets and separate trainer keys. Later-day descriptions and files remain historical until their daily rebuild. The final Day 4 slot belongs to an evaluation simulation prepared by someone else.</w:t>
       </w:r>
     </w:p>
     <w:p>
@@ -48,7 +48,7 @@
         <w:pStyle w:val="BodyText"/>
       </w:pPr>
       <w:r>
-        <w:t xml:space="preserve">Revised 6 Oct: a new column, Print, make or bring, says for every exercise what has to be printed (and how many copies), what has to be cut, what has to be made (a Menti poll) and what to bring into the room (markers, sticky notes, tape, AI devices). Counts assume 8 groups (tables of 2 to 5 people) and up to 40 participants; adjust them to the final list.</w:t>
+        <w:t>Print, make or bring gives the practical requirement for each exercise. Quantities assume eight groups and up to forty participants; adjust them to final attendance. Menti is retired. Day 1 uses local deck interactions and optional course-owned room voting, with labelled cards as the fallback.</w:t>
       </w:r>
     </w:p>
     <w:p>
@@ -71,6 +71,11 @@
         <w:t xml:space="preserve">Room kit for the week</w:t>
       </w:r>
     </w:p>
+    <w:p>
+      <w:r>
+        <w:t>Approved shorter programme: Days 1–3 use 60, 60 and 75 minutes; Day 4 has two course-owned 60-minute sessions. This brief has been rebuilt for Day 1. Later-day descriptions remain historical until their daily review. Menti is retired; the course room poll and labelled-card fallback will replace its activities during each rebuild.</w:t>
+      </w:r>
+    </w:p>
     <w:tbl>
       <w:tblPr>
         <w:tblStyle w:val="Table"/>
@@ -275,7 +280,7 @@
         <w:pStyle w:val="Heading2"/>
       </w:pPr>
       <w:r>
-        <w:t xml:space="preserve">Oct 12, Session 1: Compared to What? (Know the Language First)</w:t>
+        <w:t>Oct 12, Session 1: Question a claim (60 minutes)</w:t>
       </w:r>
     </w:p>
     <w:p>
@@ -283,7 +288,7 @@
         <w:pStyle w:val="FirstParagraph"/>
       </w:pPr>
       <w:r>
-        <w:t xml:space="preserve">Revised 6 Oct: the triage uses four excerpts, with an optional A1 wall board. Revised 25 Sep for the live deck (Oct12_session1_live.qmd): the trainer runs R in the browser and the room predicts each result before the Run button is pressed. Print materials are in Oct12_session1_materials.docx, generated by make_session_materials.R from the same data as the deck; each item opens with a print line (copies, cut or not) and the last page is the facilitator key. Polls are Menti placeholders for now; an in-slide poll is planned. One example all session: the fictional traffic-camera programme (the same data Session 2 opens in full). This session works on a ten-road slice and on average speed, so it does not give away Session 2’s collision results.</w:t>
+        <w:t>Approved 6 October 2026. Session length 60 minutes. GreenWaste only, fictional figures. Print the first two pages of Oct12_session1_materials.docx double-sided for participants. Remaining pages are trainer material; page 3 contains one card set per group.</w:t>
       </w:r>
     </w:p>
     <w:tbl>
@@ -395,123 +400,56 @@
         <w:tc>
           <w:tcPr/>
           <w:p>
-            <w:pPr>
-              <w:pStyle w:val="Compact"/>
-              <w:jc w:val="left"/>
-            </w:pPr>
-            <w:r>
-              <w:t xml:space="preserve">Opening decision poll:</w:t>
-            </w:r>
-            <w:r>
-              <w:t xml:space="preserve"> </w:t>
-            </w:r>
-            <w:r>
-              <w:t xml:space="preserve">“</w:t>
-            </w:r>
-            <w:r>
-              <w:t xml:space="preserve">extend the cameras?</w:t>
-            </w:r>
-            <w:r>
-              <w:t xml:space="preserve">”</w:t>
-            </w:r>
-          </w:p>
-        </w:tc>
-        <w:tc>
-          <w:tcPr/>
-          <w:p>
-            <w:pPr>
-              <w:pStyle w:val="Compact"/>
-              <w:jc w:val="left"/>
-            </w:pPr>
-            <w:r>
-              <w:t xml:space="preserve">~0:08 · Section 1,</w:t>
-            </w:r>
-            <w:r>
-              <w:t xml:space="preserve"> </w:t>
-            </w:r>
-            <w:r>
-              <w:t xml:space="preserve">“</w:t>
-            </w:r>
-            <w:r>
-              <w:t xml:space="preserve">The headline</w:t>
-            </w:r>
-            <w:r>
-              <w:t xml:space="preserve">”</w:t>
-            </w:r>
-          </w:p>
-        </w:tc>
-        <w:tc>
-          <w:tcPr/>
-          <w:p>
-            <w:pPr>
-              <w:pStyle w:val="Compact"/>
-              <w:jc w:val="left"/>
-            </w:pPr>
-            <w:r>
-              <w:t xml:space="preserve">Live poll, QR on slide</w:t>
-            </w:r>
-          </w:p>
-        </w:tc>
-        <w:tc>
-          <w:tcPr/>
-          <w:p>
-            <w:pPr>
-              <w:pStyle w:val="Compact"/>
-              <w:jc w:val="left"/>
-            </w:pPr>
-            <w:r>
-              <w:t xml:space="preserve">Menti (placeholder) or the planned in-slide poll</w:t>
-            </w:r>
-          </w:p>
-        </w:tc>
-        <w:tc>
-          <w:tcPr/>
-          <w:p>
-            <w:pPr>
-              <w:pStyle w:val="Compact"/>
-              <w:jc w:val="left"/>
-            </w:pPr>
-            <w:r>
-              <w:t xml:space="preserve">Single MC after the headline</w:t>
-            </w:r>
-            <w:r>
-              <w:t xml:space="preserve"> </w:t>
-            </w:r>
-            <w:r>
-              <w:t xml:space="preserve">“</w:t>
-            </w:r>
-            <w:r>
-              <w:t xml:space="preserve">fatal collisions fell 32%</w:t>
-            </w:r>
-            <w:r>
-              <w:t xml:space="preserve">”</w:t>
-            </w:r>
-            <w:r>
-              <w:t xml:space="preserve">: On this number alone, would you extend the cameras to the other twelve sectors? Yes / No / Not on this alone. Revisit after the traffic slider.</w:t>
-            </w:r>
-          </w:p>
-        </w:tc>
-        <w:tc>
-          <w:tcPr/>
-          <w:p>
-            <w:pPr>
-              <w:pStyle w:val="Compact"/>
-              <w:jc w:val="left"/>
-            </w:pPr>
-            <w:r>
-              <w:t xml:space="preserve">Make: Menti poll (online), or the planned in-slide poll. Nothing to print.</w:t>
-            </w:r>
-          </w:p>
-        </w:tc>
-        <w:tc>
-          <w:tcPr/>
-          <w:p>
-            <w:pPr>
-              <w:pStyle w:val="Compact"/>
-              <w:jc w:val="left"/>
-            </w:pPr>
-            <w:r>
-              <w:t xml:space="preserve">Poll to build</w:t>
+            <w:r>
+              <w:t>Entry reading task</w:t>
+            </w:r>
+          </w:p>
+        </w:tc>
+        <w:tc>
+          <w:tcPr/>
+          <w:p>
+            <w:r>
+              <w:t>Start of session</w:t>
+            </w:r>
+          </w:p>
+        </w:tc>
+        <w:tc>
+          <w:tcPr/>
+          <w:p>
+            <w:r>
+              <w:t>Individual reading</w:t>
+            </w:r>
+          </w:p>
+        </w:tc>
+        <w:tc>
+          <w:tcPr/>
+          <w:p>
+            <w:r>
+              <w:t>Sheet 1</w:t>
+            </w:r>
+          </w:p>
+        </w:tc>
+        <w:tc>
+          <w:tcPr/>
+          <w:p>
+            <w:r>
+              <w:t>No AI or explanation first. Keep the opening decision and question for later review.</w:t>
+            </w:r>
+          </w:p>
+        </w:tc>
+        <w:tc>
+          <w:tcPr/>
+          <w:p>
+            <w:r>
+              <w:t>One two-sided participant sheet per person</w:t>
+            </w:r>
+          </w:p>
+        </w:tc>
+        <w:tc>
+          <w:tcPr/>
+          <w:p>
+            <w:r>
+              <w:t>Built</w:t>
             </w:r>
           </w:p>
         </w:tc>
@@ -520,84 +458,56 @@
         <w:tc>
           <w:tcPr/>
           <w:p>
-            <w:pPr>
-              <w:pStyle w:val="Compact"/>
-              <w:jc w:val="left"/>
-            </w:pPr>
-            <w:r>
-              <w:t xml:space="preserve">What if traffic had changed? (slider)</w:t>
-            </w:r>
-          </w:p>
-        </w:tc>
-        <w:tc>
-          <w:tcPr/>
-          <w:p>
-            <w:pPr>
-              <w:pStyle w:val="Compact"/>
-              <w:jc w:val="left"/>
-            </w:pPr>
-            <w:r>
-              <w:t xml:space="preserve">~0:12 · Section 1</w:t>
-            </w:r>
-          </w:p>
-        </w:tc>
-        <w:tc>
-          <w:tcPr/>
-          <w:p>
-            <w:pPr>
-              <w:pStyle w:val="Compact"/>
-              <w:jc w:val="left"/>
-            </w:pPr>
-            <w:r>
-              <w:t xml:space="preserve">Whole-room prediction, live slider</w:t>
-            </w:r>
-          </w:p>
-        </w:tc>
-        <w:tc>
-          <w:tcPr/>
-          <w:p>
-            <w:pPr>
-              <w:pStyle w:val="Compact"/>
-              <w:jc w:val="left"/>
-            </w:pPr>
-            <w:r>
-              <w:t xml:space="preserve">None</w:t>
-            </w:r>
-          </w:p>
-        </w:tc>
-        <w:tc>
-          <w:tcPr/>
-          <w:p>
-            <w:pPr>
-              <w:pStyle w:val="Compact"/>
-              <w:jc w:val="left"/>
-            </w:pPr>
-            <w:r>
-              <w:t xml:space="preserve">The room calls a change in driving; the trainer moves the slider. At -32% the risk per kilometre stops moving. No build.</w:t>
-            </w:r>
-          </w:p>
-        </w:tc>
-        <w:tc>
-          <w:tcPr/>
-          <w:p>
-            <w:pPr>
-              <w:pStyle w:val="Compact"/>
-              <w:jc w:val="left"/>
-            </w:pPr>
-            <w:r>
-              <w:t xml:space="preserve">Nothing to print or make.</w:t>
-            </w:r>
-          </w:p>
-        </w:tc>
-        <w:tc>
-          <w:tcPr/>
-          <w:p>
-            <w:pPr>
-              <w:pStyle w:val="Compact"/>
-              <w:jc w:val="left"/>
-            </w:pPr>
-            <w:r>
-              <w:t xml:space="preserve">In slides</w:t>
+            <w:r>
+              <w:t>Extension choice and evidence reveal</w:t>
+            </w:r>
+          </w:p>
+        </w:tc>
+        <w:tc>
+          <w:tcPr/>
+          <w:p>
+            <w:r>
+              <w:t>After case introduction</w:t>
+            </w:r>
+          </w:p>
+        </w:tc>
+        <w:tc>
+          <w:tcPr/>
+          <w:p>
+            <w:r>
+              <w:t>Choice then reveal</w:t>
+            </w:r>
+          </w:p>
+        </w:tc>
+        <w:tc>
+          <w:tcPr/>
+          <w:p>
+            <w:r>
+              <w:t>Local deck controls; optional room poll</w:t>
+            </w:r>
+          </w:p>
+        </w:tc>
+        <w:tc>
+          <w:tcPr/>
+          <w:p>
+            <w:r>
+              <w:t>Choose Extend / Do not extend / Ask first. Reveal the non-participant landfill change only after reasons.</w:t>
+            </w:r>
+          </w:p>
+        </w:tc>
+        <w:tc>
+          <w:tcPr/>
+          <w:p>
+            <w:r>
+              <w:t>Test room phones; otherwise labelled cards</w:t>
+            </w:r>
+          </w:p>
+        </w:tc>
+        <w:tc>
+          <w:tcPr/>
+          <w:p>
+            <w:r>
+              <w:t>Built; venue check pending</w:t>
             </w:r>
           </w:p>
         </w:tc>
@@ -606,84 +516,56 @@
         <w:tc>
           <w:tcPr/>
           <w:p>
-            <w:pPr>
-              <w:pStyle w:val="Compact"/>
-              <w:jc w:val="left"/>
-            </w:pPr>
-            <w:r>
-              <w:t xml:space="preserve">By hand: ten roads</w:t>
-            </w:r>
-          </w:p>
-        </w:tc>
-        <w:tc>
-          <w:tcPr/>
-          <w:p>
-            <w:pPr>
-              <w:pStyle w:val="Compact"/>
-              <w:jc w:val="left"/>
-            </w:pPr>
-            <w:r>
-              <w:t xml:space="preserve">~0:30 · Word 1</w:t>
-            </w:r>
-          </w:p>
-        </w:tc>
-        <w:tc>
-          <w:tcPr/>
-          <w:p>
-            <w:pPr>
-              <w:pStyle w:val="Compact"/>
-              <w:jc w:val="left"/>
-            </w:pPr>
-            <w:r>
-              <w:t xml:space="preserve">Individual arithmetic (printed)</w:t>
-            </w:r>
-          </w:p>
-        </w:tc>
-        <w:tc>
-          <w:tcPr/>
-          <w:p>
-            <w:pPr>
-              <w:pStyle w:val="Compact"/>
-              <w:jc w:val="left"/>
-            </w:pPr>
-            <w:r>
-              <w:t xml:space="preserve">Worksheet, page 1 of the pack, 1 per participant</w:t>
-            </w:r>
-          </w:p>
-        </w:tc>
-        <w:tc>
-          <w:tcPr/>
-          <w:p>
-            <w:pPr>
-              <w:pStyle w:val="Compact"/>
-              <w:jc w:val="left"/>
-            </w:pPr>
-            <w:r>
-              <w:t xml:space="preserve">Ten camera roads with their 2019 injury collisions. Participants work out the mean, how many roads sit below it and the median, then remove the busiest road and compare. The trainer then shows the same numbers live. Print only.</w:t>
-            </w:r>
-          </w:p>
-        </w:tc>
-        <w:tc>
-          <w:tcPr/>
-          <w:p>
-            <w:pPr>
-              <w:pStyle w:val="Compact"/>
-              <w:jc w:val="left"/>
-            </w:pPr>
-            <w:r>
-              <w:t xml:space="preserve">Print: pack page 1, 1 per participant (40), double-sided with page 2.</w:t>
-            </w:r>
-          </w:p>
-        </w:tc>
-        <w:tc>
-          <w:tcPr/>
-          <w:p>
-            <w:pPr>
-              <w:pStyle w:val="Compact"/>
-              <w:jc w:val="left"/>
-            </w:pPr>
-            <w:r>
-              <w:t xml:space="preserve">Built: print</w:t>
+            <w:r>
+              <w:t>Ten businesses</w:t>
+            </w:r>
+          </w:p>
+        </w:tc>
+        <w:tc>
+          <w:tcPr/>
+          <w:p>
+            <w:r>
+              <w:t>Before triage</w:t>
+            </w:r>
+          </w:p>
+        </w:tc>
+        <w:tc>
+          <w:tcPr/>
+          <w:p>
+            <w:r>
+              <w:t>Visual reading</w:t>
+            </w:r>
+          </w:p>
+        </w:tc>
+        <w:tc>
+          <w:tcPr/>
+          <w:p>
+            <w:r>
+              <w:t>Sheet 1 and ten-business display</w:t>
+            </w:r>
+          </w:p>
+        </w:tc>
+        <w:tc>
+          <w:tcPr/>
+          <w:p>
+            <w:r>
+              <w:t>Spot the large business and explain why the mean may describe few businesses. No long arithmetic.</w:t>
+            </w:r>
+          </w:p>
+        </w:tc>
+        <w:tc>
+          <w:tcPr/>
+          <w:p>
+            <w:r>
+              <w:t>Included on Sheet 1</w:t>
+            </w:r>
+          </w:p>
+        </w:tc>
+        <w:tc>
+          <w:tcPr/>
+          <w:p>
+            <w:r>
+              <w:t>Built</w:t>
             </w:r>
           </w:p>
         </w:tc>
@@ -692,84 +574,56 @@
         <w:tc>
           <w:tcPr/>
           <w:p>
-            <w:pPr>
-              <w:pStyle w:val="Compact"/>
-              <w:jc w:val="left"/>
-            </w:pPr>
-            <w:r>
-              <w:t xml:space="preserve">By hand: the speed table</w:t>
-            </w:r>
-          </w:p>
-        </w:tc>
-        <w:tc>
-          <w:tcPr/>
-          <w:p>
-            <w:pPr>
-              <w:pStyle w:val="Compact"/>
-              <w:jc w:val="left"/>
-            </w:pPr>
-            <w:r>
-              <w:t xml:space="preserve">~0:40 · Word 2</w:t>
-            </w:r>
-          </w:p>
-        </w:tc>
-        <w:tc>
-          <w:tcPr/>
-          <w:p>
-            <w:pPr>
-              <w:pStyle w:val="Compact"/>
-              <w:jc w:val="left"/>
-            </w:pPr>
-            <w:r>
-              <w:t xml:space="preserve">Individual/pair arithmetic (printed)</w:t>
-            </w:r>
-          </w:p>
-        </w:tc>
-        <w:tc>
-          <w:tcPr/>
-          <w:p>
-            <w:pPr>
-              <w:pStyle w:val="Compact"/>
-              <w:jc w:val="left"/>
-            </w:pPr>
-            <w:r>
-              <w:t xml:space="preserve">Back of the worksheet</w:t>
-            </w:r>
-          </w:p>
-        </w:tc>
-        <w:tc>
-          <w:tcPr/>
-          <w:p>
-            <w:pPr>
-              <w:pStyle w:val="Compact"/>
-              <w:jc w:val="left"/>
-            </w:pPr>
-            <w:r>
-              <w:t xml:space="preserve">A 2x2 of average speed (camera roads vs others, 2019 vs 2021) with the Change column and Difference row blank. Participants name the three numbers and pick the effect. Print only.</w:t>
-            </w:r>
-          </w:p>
-        </w:tc>
-        <w:tc>
-          <w:tcPr/>
-          <w:p>
-            <w:pPr>
-              <w:pStyle w:val="Compact"/>
-              <w:jc w:val="left"/>
-            </w:pPr>
-            <w:r>
-              <w:t xml:space="preserve">Print: on the back of pack page 1 (see the row above).</w:t>
-            </w:r>
-          </w:p>
-        </w:tc>
-        <w:tc>
-          <w:tcPr/>
-          <w:p>
-            <w:pPr>
-              <w:pStyle w:val="Compact"/>
-              <w:jc w:val="left"/>
-            </w:pPr>
-            <w:r>
-              <w:t xml:space="preserve">Built: print</w:t>
+            <w:r>
+              <w:t>Four-claim triage</w:t>
+            </w:r>
+          </w:p>
+        </w:tc>
+        <w:tc>
+          <w:tcPr/>
+          <w:p>
+            <w:r>
+              <w:t>Main practice</w:t>
+            </w:r>
+          </w:p>
+        </w:tc>
+        <w:tc>
+          <w:tcPr/>
+          <w:p>
+            <w:r>
+              <w:t>Group cards and reasons</w:t>
+            </w:r>
+          </w:p>
+        </w:tc>
+        <w:tc>
+          <w:tcPr/>
+          <w:p>
+            <w:r>
+              <w:t>Sheet 2; four claim slips</w:t>
+            </w:r>
+          </w:p>
+        </w:tc>
+        <w:tc>
+          <w:tcPr/>
+          <w:p>
+            <w:r>
+              <w:t>Preserve Fiona’s four claims. Name the missing question and explain the decision. Discuss two disagreements.</w:t>
+            </w:r>
+          </w:p>
+        </w:tc>
+        <w:tc>
+          <w:tcPr/>
+          <w:p>
+            <w:r>
+              <w:t>One card page per group, cut; optional existing A1 board</w:t>
+            </w:r>
+          </w:p>
+        </w:tc>
+        <w:tc>
+          <w:tcPr/>
+          <w:p>
+            <w:r>
+              <w:t>Built</w:t>
             </w:r>
           </w:p>
         </w:tc>
@@ -778,476 +632,56 @@
         <w:tc>
           <w:tcPr/>
           <w:p>
-            <w:pPr>
-              <w:pStyle w:val="Compact"/>
-              <w:jc w:val="left"/>
-            </w:pPr>
-            <w:r>
-              <w:t xml:space="preserve">Shuffle the labels; significant is not big; the warning cuts both ways</w:t>
-            </w:r>
-          </w:p>
-        </w:tc>
-        <w:tc>
-          <w:tcPr/>
-          <w:p>
-            <w:pPr>
-              <w:pStyle w:val="Compact"/>
-              <w:jc w:val="left"/>
-            </w:pPr>
-            <w:r>
-              <w:t xml:space="preserve">~0:50–1:05 · Word 4</w:t>
-            </w:r>
-          </w:p>
-        </w:tc>
-        <w:tc>
-          <w:tcPr/>
-          <w:p>
-            <w:pPr>
-              <w:pStyle w:val="Compact"/>
-              <w:jc w:val="left"/>
-            </w:pPr>
-            <w:r>
-              <w:t xml:space="preserve">Whole-room prediction, live sliders</w:t>
-            </w:r>
-          </w:p>
-        </w:tc>
-        <w:tc>
-          <w:tcPr/>
-          <w:p>
-            <w:pPr>
-              <w:pStyle w:val="Compact"/>
-              <w:jc w:val="left"/>
-            </w:pPr>
-            <w:r>
-              <w:t xml:space="preserve">None</w:t>
-            </w:r>
-          </w:p>
-        </w:tc>
-        <w:tc>
-          <w:tcPr/>
-          <w:p>
-            <w:pPr>
-              <w:pStyle w:val="Compact"/>
-              <w:jc w:val="left"/>
-            </w:pPr>
-            <w:r>
-              <w:t xml:space="preserve">The room predicts before each slider move (shuffles, the size of the effect, the number of roads). No build.</w:t>
-            </w:r>
-          </w:p>
-        </w:tc>
-        <w:tc>
-          <w:tcPr/>
-          <w:p>
-            <w:pPr>
-              <w:pStyle w:val="Compact"/>
-              <w:jc w:val="left"/>
-            </w:pPr>
-            <w:r>
-              <w:t xml:space="preserve">Nothing to print or make.</w:t>
-            </w:r>
-          </w:p>
-        </w:tc>
-        <w:tc>
-          <w:tcPr/>
-          <w:p>
-            <w:pPr>
-              <w:pStyle w:val="Compact"/>
-              <w:jc w:val="left"/>
-            </w:pPr>
-            <w:r>
-              <w:t xml:space="preserve">In slides</w:t>
-            </w:r>
-          </w:p>
-        </w:tc>
-      </w:tr>
-      <w:tr>
-        <w:tc>
-          <w:tcPr/>
-          <w:p>
-            <w:pPr>
-              <w:pStyle w:val="Compact"/>
-              <w:jc w:val="left"/>
-            </w:pPr>
-            <w:r>
-              <w:t xml:space="preserve">Which one would you act on?</w:t>
-            </w:r>
-          </w:p>
-        </w:tc>
-        <w:tc>
-          <w:tcPr/>
-          <w:p>
-            <w:pPr>
-              <w:pStyle w:val="Compact"/>
-              <w:jc w:val="left"/>
-            </w:pPr>
-            <w:r>
-              <w:t xml:space="preserve">~1:10 · Word 5</w:t>
-            </w:r>
-          </w:p>
-        </w:tc>
-        <w:tc>
-          <w:tcPr/>
-          <w:p>
-            <w:pPr>
-              <w:pStyle w:val="Compact"/>
-              <w:jc w:val="left"/>
-            </w:pPr>
-            <w:r>
-              <w:t xml:space="preserve">Individual tick-box</w:t>
-            </w:r>
-          </w:p>
-        </w:tc>
-        <w:tc>
-          <w:tcPr/>
-          <w:p>
-            <w:pPr>
-              <w:pStyle w:val="Compact"/>
-              <w:jc w:val="left"/>
-            </w:pPr>
-            <w:r>
-              <w:t xml:space="preserve">Part 3 of the worksheet</w:t>
-            </w:r>
-          </w:p>
-        </w:tc>
-        <w:tc>
-          <w:tcPr/>
-          <w:p>
-            <w:pPr>
-              <w:pStyle w:val="Compact"/>
-              <w:jc w:val="left"/>
-            </w:pPr>
-            <w:r>
-              <w:t xml:space="preserve">Three invented reports (1.8 fewer collisions against a bar of 2.0, three different intervals): act / do not act / cannot tell yet. Print only.</w:t>
-            </w:r>
-          </w:p>
-        </w:tc>
-        <w:tc>
-          <w:tcPr/>
-          <w:p>
-            <w:pPr>
-              <w:pStyle w:val="Compact"/>
-              <w:jc w:val="left"/>
-            </w:pPr>
-            <w:r>
-              <w:t xml:space="preserve">Print: part of the worksheet (see above).</w:t>
-            </w:r>
-          </w:p>
-        </w:tc>
-        <w:tc>
-          <w:tcPr/>
-          <w:p>
-            <w:pPr>
-              <w:pStyle w:val="Compact"/>
-              <w:jc w:val="left"/>
-            </w:pPr>
-            <w:r>
-              <w:t xml:space="preserve">Built: print</w:t>
-            </w:r>
-          </w:p>
-        </w:tc>
-      </w:tr>
-      <w:tr>
-        <w:tc>
-          <w:tcPr/>
-          <w:p>
-            <w:pPr>
-              <w:pStyle w:val="Compact"/>
-              <w:jc w:val="left"/>
-            </w:pPr>
-            <w:r>
-              <w:t xml:space="preserve">AI prompt cards</w:t>
-            </w:r>
-          </w:p>
-        </w:tc>
-        <w:tc>
-          <w:tcPr/>
-          <w:p>
-            <w:pPr>
-              <w:pStyle w:val="Compact"/>
-              <w:jc w:val="left"/>
-            </w:pPr>
-            <w:r>
-              <w:t xml:space="preserve">~1:15 · Section 4</w:t>
-            </w:r>
-          </w:p>
-        </w:tc>
-        <w:tc>
-          <w:tcPr/>
-          <w:p>
-            <w:pPr>
-              <w:pStyle w:val="Compact"/>
-              <w:jc w:val="left"/>
-            </w:pPr>
-            <w:r>
-              <w:t xml:space="preserve">Small-group hands-on + AI</w:t>
-            </w:r>
-          </w:p>
-        </w:tc>
-        <w:tc>
-          <w:tcPr/>
-          <w:p>
-            <w:pPr>
-              <w:pStyle w:val="Compact"/>
-              <w:jc w:val="left"/>
-            </w:pPr>
-            <w:r>
-              <w:t xml:space="preserve">4 cards per group (pack page 3); one AI device per group</w:t>
-            </w:r>
-          </w:p>
-        </w:tc>
-        <w:tc>
-          <w:tcPr/>
-          <w:p>
-            <w:pPr>
-              <w:pStyle w:val="Compact"/>
-              <w:jc w:val="left"/>
-            </w:pPr>
-            <w:r>
-              <w:t xml:space="preserve">Each group pastes one prompt (confidence interval; p-value;</w:t>
-            </w:r>
-            <w:r>
-              <w:t xml:space="preserve"> </w:t>
-            </w:r>
-            <w:r>
-              <w:t xml:space="preserve">“</w:t>
-            </w:r>
-            <w:r>
-              <w:t xml:space="preserve">fatal collisions fell 32%, is that good?</w:t>
-            </w:r>
-            <w:r>
-              <w:t xml:space="preserve">”</w:t>
-            </w:r>
-            <w:r>
-              <w:t xml:space="preserve">; the school_within_500m coefficient), notes what the AI gets wrong, then the debrief slide. Confirm an AI tool per table.</w:t>
-            </w:r>
-          </w:p>
-        </w:tc>
-        <w:tc>
-          <w:tcPr/>
-          <w:p>
-            <w:pPr>
-              <w:pStyle w:val="Compact"/>
-              <w:jc w:val="left"/>
-            </w:pPr>
-            <w:r>
-              <w:t xml:space="preserve">Print and cut: pack page 3, 1 set of 4 cards per group (8 sets). Bring: one device with an AI tool per group.</w:t>
-            </w:r>
-          </w:p>
-        </w:tc>
-        <w:tc>
-          <w:tcPr/>
-          <w:p>
-            <w:pPr>
-              <w:pStyle w:val="Compact"/>
-              <w:jc w:val="left"/>
-            </w:pPr>
-            <w:r>
-              <w:t xml:space="preserve">Built: print and cut</w:t>
-            </w:r>
-          </w:p>
-        </w:tc>
-      </w:tr>
-      <w:tr>
-        <w:tc>
-          <w:tcPr/>
-          <w:p>
-            <w:pPr>
-              <w:pStyle w:val="Compact"/>
-              <w:jc w:val="left"/>
-            </w:pPr>
-            <w:r>
-              <w:t xml:space="preserve">Triage the claims</w:t>
-            </w:r>
-          </w:p>
-        </w:tc>
-        <w:tc>
-          <w:tcPr/>
-          <w:p>
-            <w:pPr>
-              <w:pStyle w:val="Compact"/>
-              <w:jc w:val="left"/>
-            </w:pPr>
-            <w:r>
-              <w:t xml:space="preserve">~1:20 · Section 5</w:t>
-            </w:r>
-          </w:p>
-        </w:tc>
-        <w:tc>
-          <w:tcPr/>
-          <w:p>
-            <w:pPr>
-              <w:pStyle w:val="Compact"/>
-              <w:jc w:val="left"/>
-            </w:pPr>
-            <w:r>
-              <w:t xml:space="preserve">Group decision exercise at the table; optional A1 wall board</w:t>
-            </w:r>
-          </w:p>
-        </w:tc>
-        <w:tc>
-          <w:tcPr/>
-          <w:p>
-            <w:pPr>
-              <w:pStyle w:val="Compact"/>
-              <w:jc w:val="left"/>
-            </w:pPr>
-            <w:r>
-              <w:t xml:space="preserve">Triage sheet (pack page 4) and one set of four excerpt slips (page 5) per group; optional A1 wall board with a marker colour per group</w:t>
-            </w:r>
-          </w:p>
-        </w:tc>
-        <w:tc>
-          <w:tcPr/>
-          <w:p>
-            <w:pPr>
-              <w:pStyle w:val="Compact"/>
-              <w:jc w:val="left"/>
-            </w:pPr>
-            <w:r>
-              <w:t xml:space="preserve">Revised 6 Oct: four excerpts instead of eight (excerpts 1 to 4). Groups act as the commissioner: for each sentence they name the unanswered question (compared to what / how big / how sure) and decide act / do not act / ask first, then say which one they were most tempted to act on. Optional wall board, as a back-up or an addition to the sheet: an A1 poster (Oct12_session1_board_A1.pdf) with rows for the unanswered question and columns for act / ask first / do not act. Each group writes the four excerpt numbers in the matching cells in its own marker colour, so the trainer can see which groups placed the same excerpt differently and ask them why (usually excerpts 2 and 4). None of the four earns</w:t>
-            </w:r>
-            <w:r>
-              <w:t xml:space="preserve"> </w:t>
-            </w:r>
-            <w:r>
-              <w:t xml:space="preserve">“</w:t>
-            </w:r>
-            <w:r>
-              <w:t xml:space="preserve">act</w:t>
-            </w:r>
-            <w:r>
-              <w:t xml:space="preserve">”</w:t>
-            </w:r>
-            <w:r>
-              <w:t xml:space="preserve">; the debrief asks what an excerpt would need to get there. Setup and key in the pack.</w:t>
-            </w:r>
-          </w:p>
-        </w:tc>
-        <w:tc>
-          <w:tcPr/>
-          <w:p>
-            <w:pPr>
-              <w:pStyle w:val="Compact"/>
-              <w:jc w:val="left"/>
-            </w:pPr>
-            <w:r>
-              <w:t xml:space="preserve">Print: triage sheet (pack page 4), 1 per group (8). Print and cut: excerpt slips 1 to 4 (pack page 5), 1 set per group (8 sets). Optional wall board: print Oct12_session1_board_A1.pdf at A1 (1 copy; preview at the end of the pack). Bring: 8 markers in 8 different colours (one per group) and masking tape.</w:t>
-            </w:r>
-          </w:p>
-        </w:tc>
-        <w:tc>
-          <w:tcPr/>
-          <w:p>
-            <w:pPr>
-              <w:pStyle w:val="Compact"/>
-              <w:jc w:val="left"/>
-            </w:pPr>
-            <w:r>
-              <w:t xml:space="preserve">Built: print and cut; wall optional</w:t>
-            </w:r>
-          </w:p>
-        </w:tc>
-      </w:tr>
-      <w:tr>
-        <w:tc>
-          <w:tcPr/>
-          <w:p>
-            <w:pPr>
-              <w:pStyle w:val="Compact"/>
-              <w:jc w:val="left"/>
-            </w:pPr>
-            <w:r>
-              <w:t xml:space="preserve">Take-away card: three questions</w:t>
-            </w:r>
-          </w:p>
-        </w:tc>
-        <w:tc>
-          <w:tcPr/>
-          <w:p>
-            <w:pPr>
-              <w:pStyle w:val="Compact"/>
-              <w:jc w:val="left"/>
-            </w:pPr>
-            <w:r>
-              <w:t xml:space="preserve">~1:28 · Close</w:t>
-            </w:r>
-          </w:p>
-        </w:tc>
-        <w:tc>
-          <w:tcPr/>
-          <w:p>
-            <w:pPr>
-              <w:pStyle w:val="Compact"/>
-              <w:jc w:val="left"/>
-            </w:pPr>
-            <w:r>
-              <w:t xml:space="preserve">Handout + one-minute reflection</w:t>
-            </w:r>
-          </w:p>
-        </w:tc>
-        <w:tc>
-          <w:tcPr/>
-          <w:p>
-            <w:pPr>
-              <w:pStyle w:val="Compact"/>
-              <w:jc w:val="left"/>
-            </w:pPr>
-            <w:r>
-              <w:t xml:space="preserve">Pocket cards, 1 per participant</w:t>
-            </w:r>
-          </w:p>
-        </w:tc>
-        <w:tc>
-          <w:tcPr/>
-          <w:p>
-            <w:pPr>
-              <w:pStyle w:val="Compact"/>
-              <w:jc w:val="left"/>
-            </w:pPr>
-            <w:r>
-              <w:t xml:space="preserve">Compared to what? How big? How sure? Each card has an</w:t>
-            </w:r>
-            <w:r>
-              <w:t xml:space="preserve"> </w:t>
-            </w:r>
-            <w:r>
-              <w:t xml:space="preserve">“</w:t>
-            </w:r>
-            <w:r>
-              <w:t xml:space="preserve">On my desk</w:t>
-            </w:r>
-            <w:r>
-              <w:t xml:space="preserve">”</w:t>
-            </w:r>
-            <w:r>
-              <w:t xml:space="preserve"> </w:t>
-            </w:r>
-            <w:r>
-              <w:t xml:space="preserve">line: participants name one report they will ask these about.</w:t>
-            </w:r>
-          </w:p>
-        </w:tc>
-        <w:tc>
-          <w:tcPr/>
-          <w:p>
-            <w:pPr>
-              <w:pStyle w:val="Compact"/>
-              <w:jc w:val="left"/>
-            </w:pPr>
-            <w:r>
-              <w:t xml:space="preserve">Print and cut: take-away cards, 1 per participant (40).</w:t>
-            </w:r>
-          </w:p>
-        </w:tc>
-        <w:tc>
-          <w:tcPr/>
-          <w:p>
-            <w:pPr>
-              <w:pStyle w:val="Compact"/>
-              <w:jc w:val="left"/>
-            </w:pPr>
-            <w:r>
-              <w:t xml:space="preserve">Built: print and cut</w:t>
+            <w:r>
+              <w:t>AI claim check and individual close</w:t>
+            </w:r>
+          </w:p>
+        </w:tc>
+        <w:tc>
+          <w:tcPr/>
+          <w:p>
+            <w:r>
+              <w:t>End of session</w:t>
+            </w:r>
+          </w:p>
+        </w:tc>
+        <w:tc>
+          <w:tcPr/>
+          <w:p>
+            <w:r>
+              <w:t>Source checking then retrieval</w:t>
+            </w:r>
+          </w:p>
+        </w:tc>
+        <w:tc>
+          <w:tcPr/>
+          <w:p>
+            <w:r>
+              <w:t>Deck and worksheet</w:t>
+            </w:r>
+          </w:p>
+        </w:tc>
+        <w:tc>
+          <w:tcPr/>
+          <w:p>
+            <w:r>
+              <w:t>Check an authored AI causal claim; finish with one useful question and why it matters.</w:t>
+            </w:r>
+          </w:p>
+        </w:tc>
+        <w:tc>
+          <w:tcPr/>
+          <w:p>
+            <w:r>
+              <w:t>No AI account required</w:t>
+            </w:r>
+          </w:p>
+        </w:tc>
+        <w:tc>
+          <w:tcPr/>
+          <w:p>
+            <w:r>
+              <w:t>Built</w:t>
             </w:r>
           </w:p>
         </w:tc>
@@ -1260,7 +694,7 @@
         <w:pStyle w:val="Heading2"/>
       </w:pPr>
       <w:r>
-        <w:t xml:space="preserve">Oct 12, Session 2: What Do the Numbers Say? (Illustrative Traffic-Camera Case)</w:t>
+        <w:t>Oct 12, Session 2: Read a reported result (60 minutes)</w:t>
       </w:r>
     </w:p>
     <w:p>
@@ -1268,40 +702,7 @@
         <w:pStyle w:val="FirstParagraph"/>
       </w:pPr>
       <w:r>
-        <w:t xml:space="preserve">Revised 24 Sep. Runs on a fictional automated-speed-camera dataset (the case names no real body); every figure carries an illustrative-data disclaimer. The session is now descriptive and run live: the trainer runs R in the browser (webR, needs internet) to open the data, graph it and measure the before-and-after change in camera sectors, using the Session 1 vocabulary. It ends on</w:t>
-      </w:r>
-      <w:r>
-        <w:t xml:space="preserve"> </w:t>
-      </w:r>
-      <w:r>
-        <w:t xml:space="preserve">“</w:t>
-      </w:r>
-      <w:r>
-        <w:t xml:space="preserve">compared to what?</w:t>
-      </w:r>
-      <w:r>
-        <w:t xml:space="preserve">”</w:t>
-      </w:r>
-      <w:r>
-        <w:t xml:space="preserve"> </w:t>
-      </w:r>
-      <w:r>
-        <w:t xml:space="preserve">and hands over to Session 3. The case is not reused in later sessions. The old AI Snapshot (</w:t>
-      </w:r>
-      <w:r>
-        <w:t xml:space="preserve">“</w:t>
-      </w:r>
-      <w:r>
-        <w:t xml:space="preserve">three sentences for a decision-maker</w:t>
-      </w:r>
-      <w:r>
-        <w:t xml:space="preserve">”</w:t>
-      </w:r>
-      <w:r>
-        <w:t xml:space="preserve"> </w:t>
-      </w:r>
-      <w:r>
-        <w:t xml:space="preserve">on a DiD table) is replaced by the chart exercise below, and the annotate handout now uses the before-and-after regression output. Print materials are in Oct12_session2_materials.docx, generated by make_session_materials.R from the same data as the deck; each item opens with a print line (copies, cut or not) and the last page is the facilitator key. Participant copies, without the key, are on the course website.</w:t>
+        <w:t>Approved 6 October 2026. Session length 60 minutes. GreenWaste only, fictional figures. Print the first two pages of Oct12_session2_materials.docx double-sided for participants. Remaining pages are trainer material.</w:t>
       </w:r>
     </w:p>
     <w:tbl>
@@ -1413,141 +814,56 @@
         <w:tc>
           <w:tcPr/>
           <w:p>
-            <w:pPr>
-              <w:pStyle w:val="Compact"/>
-              <w:jc w:val="left"/>
-            </w:pPr>
-            <w:r>
-              <w:t xml:space="preserve">Commitment poll:</w:t>
-            </w:r>
-            <w:r>
-              <w:t xml:space="preserve"> </w:t>
-            </w:r>
-            <w:r>
-              <w:t xml:space="preserve">“</w:t>
-            </w:r>
-            <w:r>
-              <w:t xml:space="preserve">Would you fund the extension?</w:t>
-            </w:r>
-            <w:r>
-              <w:t xml:space="preserve">”</w:t>
-            </w:r>
-          </w:p>
-        </w:tc>
-        <w:tc>
-          <w:tcPr/>
-          <w:p>
-            <w:pPr>
-              <w:pStyle w:val="Compact"/>
-              <w:jc w:val="left"/>
-            </w:pPr>
-            <w:r>
-              <w:t xml:space="preserve">~0:32 · Section 3,</w:t>
-            </w:r>
-            <w:r>
-              <w:t xml:space="preserve"> </w:t>
-            </w:r>
-            <w:r>
-              <w:t xml:space="preserve">“</w:t>
-            </w:r>
-            <w:r>
-              <w:t xml:space="preserve">Would you fund the extension?</w:t>
-            </w:r>
-            <w:r>
-              <w:t xml:space="preserve">”</w:t>
-            </w:r>
-            <w:r>
-              <w:t xml:space="preserve">; results revisited ~1:18 in Section 6,</w:t>
-            </w:r>
-            <w:r>
-              <w:t xml:space="preserve"> </w:t>
-            </w:r>
-            <w:r>
-              <w:t xml:space="preserve">“</w:t>
-            </w:r>
-            <w:r>
-              <w:t xml:space="preserve">Look back at your vote</w:t>
-            </w:r>
-            <w:r>
-              <w:t xml:space="preserve">”</w:t>
-            </w:r>
-          </w:p>
-        </w:tc>
-        <w:tc>
-          <w:tcPr/>
-          <w:p>
-            <w:pPr>
-              <w:pStyle w:val="Compact"/>
-              <w:jc w:val="left"/>
-            </w:pPr>
-            <w:r>
-              <w:t xml:space="preserve">Live Menti poll (embedded), QR on slide</w:t>
-            </w:r>
-          </w:p>
-        </w:tc>
-        <w:tc>
-          <w:tcPr/>
-          <w:p>
-            <w:pPr>
-              <w:pStyle w:val="Compact"/>
-              <w:jc w:val="left"/>
-            </w:pPr>
-            <w:r>
-              <w:t xml:space="preserve">The Menti poll; QR and results embed are in the deck (set MENTI_CODE and MENTI_EMBED)</w:t>
-            </w:r>
-          </w:p>
-        </w:tc>
-        <w:tc>
-          <w:tcPr/>
-          <w:p>
-            <w:pPr>
-              <w:pStyle w:val="Compact"/>
-              <w:jc w:val="left"/>
-            </w:pPr>
-            <w:r>
-              <w:t xml:space="preserve">Single MC on the before-and-after chart for camera sectors only (11.5 to 9.0 injury collisions per segment):</w:t>
-            </w:r>
-            <w:r>
-              <w:t xml:space="preserve"> </w:t>
-            </w:r>
-            <w:r>
-              <w:t xml:space="preserve">“</w:t>
-            </w:r>
-            <w:r>
-              <w:t xml:space="preserve">Would you commit the money to extend them?</w:t>
-            </w:r>
-            <w:r>
-              <w:t xml:space="preserve">”</w:t>
-            </w:r>
-            <w:r>
-              <w:t xml:space="preserve"> </w:t>
-            </w:r>
-            <w:r>
-              <w:t xml:space="preserve">Options: Yes / No / Not on this alone. Results are shown again after the room sees that roads without cameras also improved.</w:t>
-            </w:r>
-          </w:p>
-        </w:tc>
-        <w:tc>
-          <w:tcPr/>
-          <w:p>
-            <w:pPr>
-              <w:pStyle w:val="Compact"/>
-              <w:jc w:val="left"/>
-            </w:pPr>
-            <w:r>
-              <w:t xml:space="preserve">Make: Menti poll (set MENTI_CODE and MENTI_EMBED in the deck). Nothing to print.</w:t>
-            </w:r>
-          </w:p>
-        </w:tc>
-        <w:tc>
-          <w:tcPr/>
-          <w:p>
-            <w:pPr>
-              <w:pStyle w:val="Compact"/>
-              <w:jc w:val="left"/>
-            </w:pPr>
-            <w:r>
-              <w:t xml:space="preserve">Menti poll to build</w:t>
+            <w:r>
+              <w:t>Report mark-up</w:t>
+            </w:r>
+          </w:p>
+        </w:tc>
+        <w:tc>
+          <w:tcPr/>
+          <w:p>
+            <w:r>
+              <w:t>Main task</w:t>
+            </w:r>
+          </w:p>
+        </w:tc>
+        <w:tc>
+          <w:tcPr/>
+          <w:p>
+            <w:r>
+              <w:t>Individual then pairs</w:t>
+            </w:r>
+          </w:p>
+        </w:tc>
+        <w:tc>
+          <w:tcPr/>
+          <w:p>
+            <w:r>
+              <w:t>Two-sided participant sheet</w:t>
+            </w:r>
+          </w:p>
+        </w:tc>
+        <w:tc>
+          <w:tcPr/>
+          <w:p>
+            <w:r>
+              <w:t>Circle coefficient, box interval, underline comparison. Find units, period and the rule before giving a decision.</w:t>
+            </w:r>
+          </w:p>
+        </w:tc>
+        <w:tc>
+          <w:tcPr/>
+          <w:p>
+            <w:r>
+              <w:t>One two-sided sheet per person</w:t>
+            </w:r>
+          </w:p>
+        </w:tc>
+        <w:tc>
+          <w:tcPr/>
+          <w:p>
+            <w:r>
+              <w:t>Built</w:t>
             </w:r>
           </w:p>
         </w:tc>
@@ -1556,111 +872,56 @@
         <w:tc>
           <w:tcPr/>
           <w:p>
-            <w:pPr>
-              <w:pStyle w:val="Compact"/>
-              <w:jc w:val="left"/>
-            </w:pPr>
-            <w:r>
-              <w:t xml:space="preserve">Call the number: live-code predictions</w:t>
-            </w:r>
-          </w:p>
-        </w:tc>
-        <w:tc>
-          <w:tcPr/>
-          <w:p>
-            <w:pPr>
-              <w:pStyle w:val="Compact"/>
-              <w:jc w:val="left"/>
-            </w:pPr>
-            <w:r>
-              <w:t xml:space="preserve">Throughout Sections 2–4 (e.g. </w:t>
-            </w:r>
-            <w:r>
-              <w:t xml:space="preserve">“</w:t>
-            </w:r>
-            <w:r>
-              <w:t xml:space="preserve">How many road segments?</w:t>
-            </w:r>
-            <w:r>
-              <w:t xml:space="preserve">”</w:t>
-            </w:r>
-            <w:r>
-              <w:t xml:space="preserve">,</w:t>
-            </w:r>
-            <w:r>
-              <w:t xml:space="preserve"> </w:t>
-            </w:r>
-            <w:r>
-              <w:t xml:space="preserve">“</w:t>
-            </w:r>
-            <w:r>
-              <w:t xml:space="preserve">Which number is the change?</w:t>
-            </w:r>
-            <w:r>
-              <w:t xml:space="preserve">”</w:t>
-            </w:r>
-            <w:r>
-              <w:t xml:space="preserve">)</w:t>
-            </w:r>
-          </w:p>
-        </w:tc>
-        <w:tc>
-          <w:tcPr/>
-          <w:p>
-            <w:pPr>
-              <w:pStyle w:val="Compact"/>
-              <w:jc w:val="left"/>
-            </w:pPr>
-            <w:r>
-              <w:t xml:space="preserve">Whole-room verbal prediction before the trainer presses Run</w:t>
-            </w:r>
-          </w:p>
-        </w:tc>
-        <w:tc>
-          <w:tcPr/>
-          <w:p>
-            <w:pPr>
-              <w:pStyle w:val="Compact"/>
-              <w:jc w:val="left"/>
-            </w:pPr>
-            <w:r>
-              <w:t xml:space="preserve">None</w:t>
-            </w:r>
-          </w:p>
-        </w:tc>
-        <w:tc>
-          <w:tcPr/>
-          <w:p>
-            <w:pPr>
-              <w:pStyle w:val="Compact"/>
-              <w:jc w:val="left"/>
-            </w:pPr>
-            <w:r>
-              <w:t xml:space="preserve">No build. Participants say a number or pick a row before each live result appears.</w:t>
-            </w:r>
-          </w:p>
-        </w:tc>
-        <w:tc>
-          <w:tcPr/>
-          <w:p>
-            <w:pPr>
-              <w:pStyle w:val="Compact"/>
-              <w:jc w:val="left"/>
-            </w:pPr>
-            <w:r>
-              <w:t xml:space="preserve">Nothing to print or make.</w:t>
-            </w:r>
-          </w:p>
-        </w:tc>
-        <w:tc>
-          <w:tcPr/>
-          <w:p>
-            <w:pPr>
-              <w:pStyle w:val="Compact"/>
-              <w:jc w:val="left"/>
-            </w:pPr>
-            <w:r>
-              <w:t xml:space="preserve">In slides</w:t>
+            <w:r>
+              <w:t>Short trainer calculation</w:t>
+            </w:r>
+          </w:p>
+        </w:tc>
+        <w:tc>
+          <w:tcPr/>
+          <w:p>
+            <w:r>
+              <w:t>Find its row</w:t>
+            </w:r>
+          </w:p>
+        </w:tc>
+        <w:tc>
+          <w:tcPr/>
+          <w:p>
+            <w:r>
+              <w:t>Prediction then trainer Run</w:t>
+            </w:r>
+          </w:p>
+        </w:tc>
+        <w:tc>
+          <w:tcPr/>
+          <w:p>
+            <w:r>
+              <w:t>webR cell; printed result fallback</w:t>
+            </w:r>
+          </w:p>
+        </w:tc>
+        <w:tc>
+          <w:tcPr/>
+          <w:p>
+            <w:r>
+              <w:t>Run one before/after subtraction. Participants read the output; they do not write or debug code.</w:t>
+            </w:r>
+          </w:p>
+        </w:tc>
+        <w:tc>
+          <w:tcPr/>
+          <w:p>
+            <w:r>
+              <w:t>Open deck early; no extra print</w:t>
+            </w:r>
+          </w:p>
+        </w:tc>
+        <w:tc>
+          <w:tcPr/>
+          <w:p>
+            <w:r>
+              <w:t>Built</w:t>
             </w:r>
           </w:p>
         </w:tc>
@@ -1669,156 +930,56 @@
         <w:tc>
           <w:tcPr/>
           <w:p>
-            <w:pPr>
-              <w:pStyle w:val="Compact"/>
-              <w:jc w:val="left"/>
-            </w:pPr>
-            <w:r>
-              <w:t xml:space="preserve">AI Snapshot: ask AI to read the chart</w:t>
-            </w:r>
-          </w:p>
-        </w:tc>
-        <w:tc>
-          <w:tcPr/>
-          <w:p>
-            <w:pPr>
-              <w:pStyle w:val="Compact"/>
-              <w:jc w:val="left"/>
-            </w:pPr>
-            <w:r>
-              <w:t xml:space="preserve">~0:55–1:10 · Section 5,</w:t>
-            </w:r>
-            <w:r>
-              <w:t xml:space="preserve"> </w:t>
-            </w:r>
-            <w:r>
-              <w:t xml:space="preserve">“</w:t>
-            </w:r>
-            <w:r>
-              <w:t xml:space="preserve">AI Snapshot</w:t>
-            </w:r>
-            <w:r>
-              <w:t xml:space="preserve">”</w:t>
-            </w:r>
-            <w:r>
-              <w:t xml:space="preserve">,</w:t>
-            </w:r>
-            <w:r>
-              <w:t xml:space="preserve"> </w:t>
-            </w:r>
-            <w:r>
-              <w:t xml:space="preserve">“</w:t>
-            </w:r>
-            <w:r>
-              <w:t xml:space="preserve">Debrief</w:t>
-            </w:r>
-            <w:r>
-              <w:t xml:space="preserve">”</w:t>
-            </w:r>
-            <w:r>
-              <w:t xml:space="preserve">,</w:t>
-            </w:r>
-            <w:r>
-              <w:t xml:space="preserve"> </w:t>
-            </w:r>
-            <w:r>
-              <w:t xml:space="preserve">“</w:t>
-            </w:r>
-            <w:r>
-              <w:t xml:space="preserve">A better prompt</w:t>
-            </w:r>
-            <w:r>
-              <w:t xml:space="preserve">”</w:t>
-            </w:r>
-          </w:p>
-        </w:tc>
-        <w:tc>
-          <w:tcPr/>
-          <w:p>
-            <w:pPr>
-              <w:pStyle w:val="Compact"/>
-              <w:jc w:val="left"/>
-            </w:pPr>
-            <w:r>
-              <w:t xml:space="preserve">Pair hands-on + AI (mark-up, then bad vs good prompt)</w:t>
-            </w:r>
-          </w:p>
-        </w:tc>
-        <w:tc>
-          <w:tcPr/>
-          <w:p>
-            <w:pPr>
-              <w:pStyle w:val="Compact"/>
-              <w:jc w:val="left"/>
-            </w:pPr>
-            <w:r>
-              <w:t xml:space="preserve">AI handout with the chart (pack page 2), 1 per pair; one device with AI access per pair</w:t>
-            </w:r>
-          </w:p>
-        </w:tc>
-        <w:tc>
-          <w:tcPr/>
-          <w:p>
-            <w:pPr>
-              <w:pStyle w:val="Compact"/>
-              <w:jc w:val="left"/>
-            </w:pPr>
-            <w:r>
-              <w:t xml:space="preserve">(1) Pairs mark up the illustrative AI answer to</w:t>
-            </w:r>
-            <w:r>
-              <w:t xml:space="preserve"> </w:t>
-            </w:r>
-            <w:r>
-              <w:t xml:space="preserve">“</w:t>
-            </w:r>
-            <w:r>
-              <w:t xml:space="preserve">What does this chart show? Did the cameras work?</w:t>
-            </w:r>
-            <w:r>
-              <w:t xml:space="preserve">”</w:t>
-            </w:r>
-            <w:r>
-              <w:t xml:space="preserve">. Planted errors: an invented p-value, a causal claim from a before-and-after chart, an invented</w:t>
-            </w:r>
-            <w:r>
-              <w:t xml:space="preserve"> </w:t>
-            </w:r>
-            <w:r>
-              <w:t xml:space="preserve">“</w:t>
-            </w:r>
-            <w:r>
-              <w:t xml:space="preserve">consistent across all road types</w:t>
-            </w:r>
-            <w:r>
-              <w:t xml:space="preserve">”</w:t>
-            </w:r>
-            <w:r>
-              <w:t xml:space="preserve">, and a recommendation with no rule or comparison. (2) Pairs run the better prompt from the handout on a photo of the chart, compare, then paste the second answer into a fresh chat to check it. Print only.</w:t>
-            </w:r>
-          </w:p>
-        </w:tc>
-        <w:tc>
-          <w:tcPr/>
-          <w:p>
-            <w:pPr>
-              <w:pStyle w:val="Compact"/>
-              <w:jc w:val="left"/>
-            </w:pPr>
-            <w:r>
-              <w:t xml:space="preserve">Print: pack page 2, 1 per pair (about 20), in colour if possible so the chart photographs well. Bring: one device with an AI tool per pair.</w:t>
-            </w:r>
-          </w:p>
-        </w:tc>
-        <w:tc>
-          <w:tcPr/>
-          <w:p>
-            <w:pPr>
-              <w:pStyle w:val="Compact"/>
-              <w:jc w:val="left"/>
-            </w:pPr>
-            <w:r>
-              <w:t xml:space="preserve">Built: print</w:t>
+            <w:r>
+              <w:t>AI summary repair</w:t>
+            </w:r>
+          </w:p>
+        </w:tc>
+        <w:tc>
+          <w:tcPr/>
+          <w:p>
+            <w:r>
+              <w:t>End of session</w:t>
+            </w:r>
+          </w:p>
+        </w:tc>
+        <w:tc>
+          <w:tcPr/>
+          <w:p>
+            <w:r>
+              <w:t>Source checking</w:t>
+            </w:r>
+          </w:p>
+        </w:tc>
+        <w:tc>
+          <w:tcPr/>
+          <w:p>
+            <w:r>
+              <w:t>Sheet 2 and deck</w:t>
+            </w:r>
+          </w:p>
+        </w:tc>
+        <w:tc>
+          <w:tcPr/>
+          <w:p>
+            <w:r>
+              <w:t>Keep the observed fall; remove an unsupported causal and scale-up conclusion. Verify against source evidence.</w:t>
+            </w:r>
+          </w:p>
+        </w:tc>
+        <w:tc>
+          <w:tcPr/>
+          <w:p>
+            <w:r>
+              <w:t>Included on Sheet 2</w:t>
+            </w:r>
+          </w:p>
+        </w:tc>
+        <w:tc>
+          <w:tcPr/>
+          <w:p>
+            <w:r>
+              <w:t>Built</w:t>
             </w:r>
           </w:p>
         </w:tc>
@@ -1827,304 +988,56 @@
         <w:tc>
           <w:tcPr/>
           <w:p>
-            <w:pPr>
-              <w:pStyle w:val="Compact"/>
-              <w:jc w:val="left"/>
-            </w:pPr>
-            <w:r>
-              <w:t xml:space="preserve">“</w:t>
-            </w:r>
-            <w:r>
-              <w:t xml:space="preserve">Compared to what?</w:t>
-            </w:r>
-            <w:r>
-              <w:t xml:space="preserve">”</w:t>
-            </w:r>
-            <w:r>
-              <w:t xml:space="preserve"> </w:t>
-            </w:r>
-            <w:r>
-              <w:t xml:space="preserve">table discussion</w:t>
-            </w:r>
-          </w:p>
-        </w:tc>
-        <w:tc>
-          <w:tcPr/>
-          <w:p>
-            <w:pPr>
-              <w:pStyle w:val="Compact"/>
-              <w:jc w:val="left"/>
-            </w:pPr>
-            <w:r>
-              <w:t xml:space="preserve">~1:10 · Section 6,</w:t>
-            </w:r>
-            <w:r>
-              <w:t xml:space="preserve"> </w:t>
-            </w:r>
-            <w:r>
-              <w:t xml:space="preserve">“</w:t>
-            </w:r>
-            <w:r>
-              <w:t xml:space="preserve">What else happened between 2019 and 2021?</w:t>
-            </w:r>
-            <w:r>
-              <w:t xml:space="preserve">”</w:t>
-            </w:r>
-          </w:p>
-        </w:tc>
-        <w:tc>
-          <w:tcPr/>
-          <w:p>
-            <w:pPr>
-              <w:pStyle w:val="Compact"/>
-              <w:jc w:val="left"/>
-            </w:pPr>
-            <w:r>
-              <w:t xml:space="preserve">Table discussion (no tech)</w:t>
-            </w:r>
-          </w:p>
-        </w:tc>
-        <w:tc>
-          <w:tcPr/>
-          <w:p>
-            <w:pPr>
-              <w:pStyle w:val="Compact"/>
-              <w:jc w:val="left"/>
-            </w:pPr>
-            <w:r>
-              <w:t xml:space="preserve">None (optional flipchart)</w:t>
-            </w:r>
-          </w:p>
-        </w:tc>
-        <w:tc>
-          <w:tcPr/>
-          <w:p>
-            <w:pPr>
-              <w:pStyle w:val="Compact"/>
-              <w:jc w:val="left"/>
-            </w:pPr>
-            <w:r>
-              <w:t xml:space="preserve">Tables list two or three things apart from cameras that could have cut collisions, and what they would compare the camera roads with. No build.</w:t>
-            </w:r>
-          </w:p>
-        </w:tc>
-        <w:tc>
-          <w:tcPr/>
-          <w:p>
-            <w:pPr>
-              <w:pStyle w:val="Compact"/>
-              <w:jc w:val="left"/>
-            </w:pPr>
-            <w:r>
-              <w:t xml:space="preserve">Nothing to print. Optional: flipchart and markers.</w:t>
-            </w:r>
-          </w:p>
-        </w:tc>
-        <w:tc>
-          <w:tcPr/>
-          <w:p>
-            <w:pPr>
-              <w:pStyle w:val="Compact"/>
-              <w:jc w:val="left"/>
-            </w:pPr>
-            <w:r>
-              <w:t xml:space="preserve">In slides</w:t>
-            </w:r>
-          </w:p>
-        </w:tc>
-      </w:tr>
-      <w:tr>
-        <w:tc>
-          <w:tcPr/>
-          <w:p>
-            <w:pPr>
-              <w:pStyle w:val="Compact"/>
-              <w:jc w:val="left"/>
-            </w:pPr>
-            <w:r>
-              <w:t xml:space="preserve">Annotate this output</w:t>
-            </w:r>
-          </w:p>
-        </w:tc>
-        <w:tc>
-          <w:tcPr/>
-          <w:p>
-            <w:pPr>
-              <w:pStyle w:val="Compact"/>
-              <w:jc w:val="left"/>
-            </w:pPr>
-            <w:r>
-              <w:t xml:space="preserve">~1:20 · Section 7,</w:t>
-            </w:r>
-            <w:r>
-              <w:t xml:space="preserve"> </w:t>
-            </w:r>
-            <w:r>
-              <w:t xml:space="preserve">“</w:t>
-            </w:r>
-            <w:r>
-              <w:t xml:space="preserve">Annotate this output</w:t>
-            </w:r>
-            <w:r>
-              <w:t xml:space="preserve">”</w:t>
-            </w:r>
-          </w:p>
-        </w:tc>
-        <w:tc>
-          <w:tcPr/>
-          <w:p>
-            <w:pPr>
-              <w:pStyle w:val="Compact"/>
-              <w:jc w:val="left"/>
-            </w:pPr>
-            <w:r>
-              <w:t xml:space="preserve">Individual hands-on (printed handout)</w:t>
-            </w:r>
-          </w:p>
-        </w:tc>
-        <w:tc>
-          <w:tcPr/>
-          <w:p>
-            <w:pPr>
-              <w:pStyle w:val="Compact"/>
-              <w:jc w:val="left"/>
-            </w:pPr>
-            <w:r>
-              <w:t xml:space="preserve">Annotate sheet (pack page 1), 1 per participant</w:t>
-            </w:r>
-          </w:p>
-        </w:tc>
-        <w:tc>
-          <w:tcPr/>
-          <w:p>
-            <w:pPr>
-              <w:pStyle w:val="Compact"/>
-              <w:jc w:val="left"/>
-            </w:pPr>
-            <w:r>
-              <w:t xml:space="preserve">The before-and-after regression table (camera sectors only) with the slide’s four tasks: circle the change, box its confidence interval, underline the 2019 average and say why it is not an effect, write the comparison you would ask the evaluator for. Print only.</w:t>
-            </w:r>
-          </w:p>
-        </w:tc>
-        <w:tc>
-          <w:tcPr/>
-          <w:p>
-            <w:pPr>
-              <w:pStyle w:val="Compact"/>
-              <w:jc w:val="left"/>
-            </w:pPr>
-            <w:r>
-              <w:t xml:space="preserve">Print: pack page 1, 1 per participant (40).</w:t>
-            </w:r>
-          </w:p>
-        </w:tc>
-        <w:tc>
-          <w:tcPr/>
-          <w:p>
-            <w:pPr>
-              <w:pStyle w:val="Compact"/>
-              <w:jc w:val="left"/>
-            </w:pPr>
-            <w:r>
-              <w:t xml:space="preserve">Built: print</w:t>
-            </w:r>
-          </w:p>
-        </w:tc>
-      </w:tr>
-      <w:tr>
-        <w:tc>
-          <w:tcPr/>
-          <w:p>
-            <w:pPr>
-              <w:pStyle w:val="Compact"/>
-              <w:jc w:val="left"/>
-            </w:pPr>
-            <w:r>
-              <w:t xml:space="preserve">Take-away card: three questions</w:t>
-            </w:r>
-          </w:p>
-        </w:tc>
-        <w:tc>
-          <w:tcPr/>
-          <w:p>
-            <w:pPr>
-              <w:pStyle w:val="Compact"/>
-              <w:jc w:val="left"/>
-            </w:pPr>
-            <w:r>
-              <w:t xml:space="preserve">~1:25 · Section 7,</w:t>
-            </w:r>
-            <w:r>
-              <w:t xml:space="preserve"> </w:t>
-            </w:r>
-            <w:r>
-              <w:t xml:space="preserve">“</w:t>
-            </w:r>
-            <w:r>
-              <w:t xml:space="preserve">Three questions to ask the evaluator</w:t>
-            </w:r>
-            <w:r>
-              <w:t xml:space="preserve">”</w:t>
-            </w:r>
-          </w:p>
-        </w:tc>
-        <w:tc>
-          <w:tcPr/>
-          <w:p>
-            <w:pPr>
-              <w:pStyle w:val="Compact"/>
-              <w:jc w:val="left"/>
-            </w:pPr>
-            <w:r>
-              <w:t xml:space="preserve">Handout (take-away)</w:t>
-            </w:r>
-          </w:p>
-        </w:tc>
-        <w:tc>
-          <w:tcPr/>
-          <w:p>
-            <w:pPr>
-              <w:pStyle w:val="Compact"/>
-              <w:jc w:val="left"/>
-            </w:pPr>
-            <w:r>
-              <w:t xml:space="preserve">Take-away card (pack page 3), 1 per participant, cut</w:t>
-            </w:r>
-          </w:p>
-        </w:tc>
-        <w:tc>
-          <w:tcPr/>
-          <w:p>
-            <w:pPr>
-              <w:pStyle w:val="Compact"/>
-              <w:jc w:val="left"/>
-            </w:pPr>
-            <w:r>
-              <w:t xml:space="preserve">The closing slide’s three questions (how big, how sure, compared to what), six cards per page. Print only.</w:t>
-            </w:r>
-          </w:p>
-        </w:tc>
-        <w:tc>
-          <w:tcPr/>
-          <w:p>
-            <w:pPr>
-              <w:pStyle w:val="Compact"/>
-              <w:jc w:val="left"/>
-            </w:pPr>
-            <w:r>
-              <w:t xml:space="preserve">Print and cut: take-away cards, 1 per participant (40).</w:t>
-            </w:r>
-          </w:p>
-        </w:tc>
-        <w:tc>
-          <w:tcPr/>
-          <w:p>
-            <w:pPr>
-              <w:pStyle w:val="Compact"/>
-              <w:jc w:val="left"/>
-            </w:pPr>
-            <w:r>
-              <w:t xml:space="preserve">Built: print</w:t>
+            <w:r>
+              <w:t>Independent decision sentence</w:t>
+            </w:r>
+          </w:p>
+        </w:tc>
+        <w:tc>
+          <w:tcPr/>
+          <w:p>
+            <w:r>
+              <w:t>Close</w:t>
+            </w:r>
+          </w:p>
+        </w:tc>
+        <w:tc>
+          <w:tcPr/>
+          <w:p>
+            <w:r>
+              <w:t>Individual reading</w:t>
+            </w:r>
+          </w:p>
+        </w:tc>
+        <w:tc>
+          <w:tcPr/>
+          <w:p>
+            <w:r>
+              <w:t>Worksheet</w:t>
+            </w:r>
+          </w:p>
+        </w:tc>
+        <w:tc>
+          <w:tcPr/>
+          <w:p>
+            <w:r>
+              <w:t>State result with units, a limit and next question. Significance does not establish cause or meet the rule.</w:t>
+            </w:r>
+          </w:p>
+        </w:tc>
+        <w:tc>
+          <w:tcPr/>
+          <w:p>
+            <w:r>
+              <w:t>Included on worksheet</w:t>
+            </w:r>
+          </w:p>
+        </w:tc>
+        <w:tc>
+          <w:tcPr/>
+          <w:p>
+            <w:r>
+              <w:t>Built</w:t>
             </w:r>
           </w:p>
         </w:tc>
@@ -2137,7 +1050,7 @@
         <w:pStyle w:val="Heading2"/>
       </w:pPr>
       <w:r>
-        <w:t xml:space="preserve">Oct 12, Session 3: Spot the Problem (Naive Comparisons and RCT Reading)</w:t>
+        <w:t>Oct 12, Session 3: Judge a fair comparison (75 minutes)</w:t>
       </w:r>
     </w:p>
     <w:p>
@@ -2145,7 +1058,7 @@
         <w:pStyle w:val="FirstParagraph"/>
       </w:pPr>
       <w:r>
-        <w:t xml:space="preserve">Revised 25 Sep for the live deck (Oct12_session3_live.qmd): the trainer runs R in the browser and the room predicts each result before the Run button is pressed. Print materials are in Oct12_session3_materials.docx, generated by make_session_materials.R from the same data as the deck; each item opens with a print line (copies, cut or not) and the last page is the facilitator key. Polls are Menti placeholders for now; an in-slide poll is planned. One example all session: GreenWaste. The Abu Dhabi RCT slot and the school-zone case are dropped (one example per session).</w:t>
+        <w:t>Approved 6 October 2026. Session length 75 minutes. GreenWaste only, fictional figures. Print the first two pages of Oct12_session3_materials.docx double-sided for participants. Remaining pages are trainer material.</w:t>
       </w:r>
     </w:p>
     <w:tbl>
@@ -2257,84 +1170,56 @@
         <w:tc>
           <w:tcPr/>
           <w:p>
-            <w:pPr>
-              <w:pStyle w:val="Compact"/>
-              <w:jc w:val="left"/>
-            </w:pPr>
-            <w:r>
-              <w:t xml:space="preserve">Recall: Module 1’s three numbers</w:t>
-            </w:r>
-          </w:p>
-        </w:tc>
-        <w:tc>
-          <w:tcPr/>
-          <w:p>
-            <w:pPr>
-              <w:pStyle w:val="Compact"/>
-              <w:jc w:val="left"/>
-            </w:pPr>
-            <w:r>
-              <w:t xml:space="preserve">~0:03 · Section 0</w:t>
-            </w:r>
-          </w:p>
-        </w:tc>
-        <w:tc>
-          <w:tcPr/>
-          <w:p>
-            <w:pPr>
-              <w:pStyle w:val="Compact"/>
-              <w:jc w:val="left"/>
-            </w:pPr>
-            <w:r>
-              <w:t xml:space="preserve">Whole-room recall</w:t>
-            </w:r>
-          </w:p>
-        </w:tc>
-        <w:tc>
-          <w:tcPr/>
-          <w:p>
-            <w:pPr>
-              <w:pStyle w:val="Compact"/>
-              <w:jc w:val="left"/>
-            </w:pPr>
-            <w:r>
-              <w:t xml:space="preserve">None</w:t>
-            </w:r>
-          </w:p>
-        </w:tc>
-        <w:tc>
-          <w:tcPr/>
-          <w:p>
-            <w:pPr>
-              <w:pStyle w:val="Compact"/>
-              <w:jc w:val="left"/>
-            </w:pPr>
-            <w:r>
-              <w:t xml:space="preserve">From memory: which number did Module 1 trust, and what was wrong with the other two? No build.</w:t>
-            </w:r>
-          </w:p>
-        </w:tc>
-        <w:tc>
-          <w:tcPr/>
-          <w:p>
-            <w:pPr>
-              <w:pStyle w:val="Compact"/>
-              <w:jc w:val="left"/>
-            </w:pPr>
-            <w:r>
-              <w:t xml:space="preserve">Nothing to print or make.</w:t>
-            </w:r>
-          </w:p>
-        </w:tc>
-        <w:tc>
-          <w:tcPr/>
-          <w:p>
-            <w:pPr>
-              <w:pStyle w:val="Compact"/>
-              <w:jc w:val="left"/>
-            </w:pPr>
-            <w:r>
-              <w:t xml:space="preserve">In slides</w:t>
+            <w:r>
+              <w:t>Comparison choice and baseline reveal</w:t>
+            </w:r>
+          </w:p>
+        </w:tc>
+        <w:tc>
+          <w:tcPr/>
+          <w:p>
+            <w:r>
+              <w:t>Opening</w:t>
+            </w:r>
+          </w:p>
+        </w:tc>
+        <w:tc>
+          <w:tcPr/>
+          <w:p>
+            <w:r>
+              <w:t>Choice before evidence</w:t>
+            </w:r>
+          </w:p>
+        </w:tc>
+        <w:tc>
+          <w:tcPr/>
+          <w:p>
+            <w:r>
+              <w:t>Deck; optional room poll</w:t>
+            </w:r>
+          </w:p>
+        </w:tc>
+        <w:tc>
+          <w:tcPr/>
+          <w:p>
+            <w:r>
+              <w:t>Compare two observational claims. Reveal starting costs after participants commit to a reason.</w:t>
+            </w:r>
+          </w:p>
+        </w:tc>
+        <w:tc>
+          <w:tcPr/>
+          <w:p>
+            <w:r>
+              <w:t>Paper cards as fallback</w:t>
+            </w:r>
+          </w:p>
+        </w:tc>
+        <w:tc>
+          <w:tcPr/>
+          <w:p>
+            <w:r>
+              <w:t>Built</w:t>
             </w:r>
           </w:p>
         </w:tc>
@@ -2343,84 +1228,56 @@
         <w:tc>
           <w:tcPr/>
           <w:p>
-            <w:pPr>
-              <w:pStyle w:val="Compact"/>
-              <w:jc w:val="left"/>
-            </w:pPr>
-            <w:r>
-              <w:t xml:space="preserve">Session tracker</w:t>
-            </w:r>
-          </w:p>
-        </w:tc>
-        <w:tc>
-          <w:tcPr/>
-          <w:p>
-            <w:pPr>
-              <w:pStyle w:val="Compact"/>
-              <w:jc w:val="left"/>
-            </w:pPr>
-            <w:r>
-              <w:t xml:space="preserve">Throughout</w:t>
-            </w:r>
-          </w:p>
-        </w:tc>
-        <w:tc>
-          <w:tcPr/>
-          <w:p>
-            <w:pPr>
-              <w:pStyle w:val="Compact"/>
-              <w:jc w:val="left"/>
-            </w:pPr>
-            <w:r>
-              <w:t xml:space="preserve">Individual record sheet</w:t>
-            </w:r>
-          </w:p>
-        </w:tc>
-        <w:tc>
-          <w:tcPr/>
-          <w:p>
-            <w:pPr>
-              <w:pStyle w:val="Compact"/>
-              <w:jc w:val="left"/>
-            </w:pPr>
-            <w:r>
-              <w:t xml:space="preserve">Tracker (pack page 1), 1 per participant</w:t>
-            </w:r>
-          </w:p>
-        </w:tc>
-        <w:tc>
-          <w:tcPr/>
-          <w:p>
-            <w:pPr>
-              <w:pStyle w:val="Compact"/>
-              <w:jc w:val="left"/>
-            </w:pPr>
-            <w:r>
-              <w:t xml:space="preserve">Participants fill in each number as it is rebuilt live (-665, -1,447, -1,014), mark it too big / too small / fair with a reason, record the lottery gaps and the randomised interval, and write one question for the evaluator. Print only.</w:t>
-            </w:r>
-          </w:p>
-        </w:tc>
-        <w:tc>
-          <w:tcPr/>
-          <w:p>
-            <w:pPr>
-              <w:pStyle w:val="Compact"/>
-              <w:jc w:val="left"/>
-            </w:pPr>
-            <w:r>
-              <w:t xml:space="preserve">Print: pack page 1, 1 per participant (40).</w:t>
-            </w:r>
-          </w:p>
-        </w:tc>
-        <w:tc>
-          <w:tcPr/>
-          <w:p>
-            <w:pPr>
-              <w:pStyle w:val="Compact"/>
-              <w:jc w:val="left"/>
-            </w:pPr>
-            <w:r>
-              <w:t xml:space="preserve">Built: print</w:t>
+            <w:r>
+              <w:t>Two lottery draws</w:t>
+            </w:r>
+          </w:p>
+        </w:tc>
+        <w:tc>
+          <w:tcPr/>
+          <w:p>
+            <w:r>
+              <w:t>Short trainer demo</w:t>
+            </w:r>
+          </w:p>
+        </w:tc>
+        <w:tc>
+          <w:tcPr/>
+          <w:p>
+            <w:r>
+              <w:t>Predict then trainer Run</w:t>
+            </w:r>
+          </w:p>
+        </w:tc>
+        <w:tc>
+          <w:tcPr/>
+          <w:p>
+            <w:r>
+              <w:t>One webR cell; age list in trainer key</w:t>
+            </w:r>
+          </w:p>
+        </w:tc>
+        <w:tc>
+          <w:tcPr/>
+          <w:p>
+            <w:r>
+              <w:t>Twenty businesses, ten places. Compare manager ages in two draws. This is a balance demonstration, not a new effect estimate.</w:t>
+            </w:r>
+          </w:p>
+        </w:tc>
+        <w:tc>
+          <w:tcPr/>
+          <w:p>
+            <w:r>
+              <w:t>Optional twenty numbered age slips</w:t>
+            </w:r>
+          </w:p>
+        </w:tc>
+        <w:tc>
+          <w:tcPr/>
+          <w:p>
+            <w:r>
+              <w:t>Built</w:t>
             </w:r>
           </w:p>
         </w:tc>
@@ -2429,84 +1286,56 @@
         <w:tc>
           <w:tcPr/>
           <w:p>
-            <w:pPr>
-              <w:pStyle w:val="Compact"/>
-              <w:jc w:val="left"/>
-            </w:pPr>
-            <w:r>
-              <w:t xml:space="preserve">Poll: which way is each one wrong?</w:t>
-            </w:r>
-          </w:p>
-        </w:tc>
-        <w:tc>
-          <w:tcPr/>
-          <w:p>
-            <w:pPr>
-              <w:pStyle w:val="Compact"/>
-              <w:jc w:val="left"/>
-            </w:pPr>
-            <w:r>
-              <w:t xml:space="preserve">~0:25 · Section 2</w:t>
-            </w:r>
-          </w:p>
-        </w:tc>
-        <w:tc>
-          <w:tcPr/>
-          <w:p>
-            <w:pPr>
-              <w:pStyle w:val="Compact"/>
-              <w:jc w:val="left"/>
-            </w:pPr>
-            <w:r>
-              <w:t xml:space="preserve">Live poll, QR on slide</w:t>
-            </w:r>
-          </w:p>
-        </w:tc>
-        <w:tc>
-          <w:tcPr/>
-          <w:p>
-            <w:pPr>
-              <w:pStyle w:val="Compact"/>
-              <w:jc w:val="left"/>
-            </w:pPr>
-            <w:r>
-              <w:t xml:space="preserve">Menti (placeholder)</w:t>
-            </w:r>
-          </w:p>
-        </w:tc>
-        <w:tc>
-          <w:tcPr/>
-          <w:p>
-            <w:pPr>
-              <w:pStyle w:val="Compact"/>
-              <w:jc w:val="left"/>
-            </w:pPr>
-            <w:r>
-              <w:t xml:space="preserve">Two items: is 665 too big or too small? Is 1,447 too big or too small? The next three slides answer it from the data.</w:t>
-            </w:r>
-          </w:p>
-        </w:tc>
-        <w:tc>
-          <w:tcPr/>
-          <w:p>
-            <w:pPr>
-              <w:pStyle w:val="Compact"/>
-              <w:jc w:val="left"/>
-            </w:pPr>
-            <w:r>
-              <w:t xml:space="preserve">Make: Menti poll (online). Nothing to print.</w:t>
-            </w:r>
-          </w:p>
-        </w:tc>
-        <w:tc>
-          <w:tcPr/>
-          <w:p>
-            <w:pPr>
-              <w:pStyle w:val="Compact"/>
-              <w:jc w:val="left"/>
-            </w:pPr>
-            <w:r>
-              <w:t xml:space="preserve">Poll to build</w:t>
+            <w:r>
+              <w:t>Trial reading and interval reveal</w:t>
+            </w:r>
+          </w:p>
+        </w:tc>
+        <w:tc>
+          <w:tcPr/>
+          <w:p>
+            <w:r>
+              <w:t>Before and after break</w:t>
+            </w:r>
+          </w:p>
+        </w:tc>
+        <w:tc>
+          <w:tcPr/>
+          <w:p>
+            <w:r>
+              <w:t>Individual reading</w:t>
+            </w:r>
+          </w:p>
+        </w:tc>
+        <w:tc>
+          <w:tcPr/>
+          <w:p>
+            <w:r>
+              <w:t>Sheet 1 and interval graphic</w:t>
+            </w:r>
+          </w:p>
+        </w:tc>
+        <w:tc>
+          <w:tcPr/>
+          <w:p>
+            <w:r>
+              <w:t>Identify randomly assigned pilot groups. Compare estimate and interval with the 1,000 AED rule.</w:t>
+            </w:r>
+          </w:p>
+        </w:tc>
+        <w:tc>
+          <w:tcPr/>
+          <w:p>
+            <w:r>
+              <w:t>One two-sided sheet per person</w:t>
+            </w:r>
+          </w:p>
+        </w:tc>
+        <w:tc>
+          <w:tcPr/>
+          <w:p>
+            <w:r>
+              <w:t>Built</w:t>
             </w:r>
           </w:p>
         </w:tc>
@@ -2515,117 +1344,56 @@
         <w:tc>
           <w:tcPr/>
           <w:p>
-            <w:pPr>
-              <w:pStyle w:val="Compact"/>
-              <w:jc w:val="left"/>
-            </w:pPr>
-            <w:r>
-              <w:t xml:space="preserve">Run the lottery yourself</w:t>
-            </w:r>
-          </w:p>
-        </w:tc>
-        <w:tc>
-          <w:tcPr/>
-          <w:p>
-            <w:pPr>
-              <w:pStyle w:val="Compact"/>
-              <w:jc w:val="left"/>
-            </w:pPr>
-            <w:r>
-              <w:t xml:space="preserve">~0:50 · Section 4</w:t>
-            </w:r>
-          </w:p>
-        </w:tc>
-        <w:tc>
-          <w:tcPr/>
-          <w:p>
-            <w:pPr>
-              <w:pStyle w:val="Compact"/>
-              <w:jc w:val="left"/>
-            </w:pPr>
-            <w:r>
-              <w:t xml:space="preserve">Whole room, live button and switch</w:t>
-            </w:r>
-          </w:p>
-        </w:tc>
-        <w:tc>
-          <w:tcPr/>
-          <w:p>
-            <w:pPr>
-              <w:pStyle w:val="Compact"/>
-              <w:jc w:val="left"/>
-            </w:pPr>
-            <w:r>
-              <w:t xml:space="preserve">None</w:t>
-            </w:r>
-          </w:p>
-        </w:tc>
-        <w:tc>
-          <w:tcPr/>
-          <w:p>
-            <w:pPr>
-              <w:pStyle w:val="Compact"/>
-              <w:jc w:val="left"/>
-            </w:pPr>
-            <w:r>
-              <w:t xml:space="preserve">The trainer presses</w:t>
-            </w:r>
-            <w:r>
-              <w:t xml:space="preserve"> </w:t>
-            </w:r>
-            <w:r>
-              <w:t xml:space="preserve">“</w:t>
-            </w:r>
-            <w:r>
-              <w:t xml:space="preserve">Draw again</w:t>
-            </w:r>
-            <w:r>
-              <w:t xml:space="preserve">”</w:t>
-            </w:r>
-            <w:r>
-              <w:t xml:space="preserve"> </w:t>
-            </w:r>
-            <w:r>
-              <w:t xml:space="preserve">at the room’s call, then lets</w:t>
-            </w:r>
-            <w:r>
-              <w:t xml:space="preserve"> </w:t>
-            </w:r>
-            <w:r>
-              <w:t xml:space="preserve">“</w:t>
-            </w:r>
-            <w:r>
-              <w:t xml:space="preserve">officials pick</w:t>
-            </w:r>
-            <w:r>
-              <w:t xml:space="preserve">”</w:t>
-            </w:r>
-            <w:r>
-              <w:t xml:space="preserve">; a slider shows balance tightening as the number of neighbourhoods grows. No build.</w:t>
-            </w:r>
-          </w:p>
-        </w:tc>
-        <w:tc>
-          <w:tcPr/>
-          <w:p>
-            <w:pPr>
-              <w:pStyle w:val="Compact"/>
-              <w:jc w:val="left"/>
-            </w:pPr>
-            <w:r>
-              <w:t xml:space="preserve">Nothing to print or make.</w:t>
-            </w:r>
-          </w:p>
-        </w:tc>
-        <w:tc>
-          <w:tcPr/>
-          <w:p>
-            <w:pPr>
-              <w:pStyle w:val="Compact"/>
-              <w:jc w:val="left"/>
-            </w:pPr>
-            <w:r>
-              <w:t xml:space="preserve">In slides</w:t>
+            <w:r>
+              <w:t>Decision note</w:t>
+            </w:r>
+          </w:p>
+        </w:tc>
+        <w:tc>
+          <w:tcPr/>
+          <w:p>
+            <w:r>
+              <w:t>Main practice</w:t>
+            </w:r>
+          </w:p>
+        </w:tc>
+        <w:tc>
+          <w:tcPr/>
+          <w:p>
+            <w:r>
+              <w:t>Paired writing and feedback</w:t>
+            </w:r>
+          </w:p>
+        </w:tc>
+        <w:tc>
+          <w:tcPr/>
+          <w:p>
+            <w:r>
+              <w:t>Sheet 2</w:t>
+            </w:r>
+          </w:p>
+        </w:tc>
+        <w:tc>
+          <w:tcPr/>
+          <w:p>
+            <w:r>
+              <w:t>Write three or four sentences with source evidence. Distinguish threshold uncertainty, pilot reach and value for money.</w:t>
+            </w:r>
+          </w:p>
+        </w:tc>
+        <w:tc>
+          <w:tcPr/>
+          <w:p>
+            <w:r>
+              <w:t>Included on Sheet 2</w:t>
+            </w:r>
+          </w:p>
+        </w:tc>
+        <w:tc>
+          <w:tcPr/>
+          <w:p>
+            <w:r>
+              <w:t>Built</w:t>
             </w:r>
           </w:p>
         </w:tc>
@@ -2634,544 +1402,56 @@
         <w:tc>
           <w:tcPr/>
           <w:p>
-            <w:pPr>
-              <w:pStyle w:val="Compact"/>
-              <w:jc w:val="left"/>
-            </w:pPr>
-            <w:r>
-              <w:t xml:space="preserve">Poll: would you trust this draw?</w:t>
-            </w:r>
-          </w:p>
-        </w:tc>
-        <w:tc>
-          <w:tcPr/>
-          <w:p>
-            <w:pPr>
-              <w:pStyle w:val="Compact"/>
-              <w:jc w:val="left"/>
-            </w:pPr>
-            <w:r>
-              <w:t xml:space="preserve">~0:58 · Section 4</w:t>
-            </w:r>
-          </w:p>
-        </w:tc>
-        <w:tc>
-          <w:tcPr/>
-          <w:p>
-            <w:pPr>
-              <w:pStyle w:val="Compact"/>
-              <w:jc w:val="left"/>
-            </w:pPr>
-            <w:r>
-              <w:t xml:space="preserve">Live poll (application)</w:t>
-            </w:r>
-          </w:p>
-        </w:tc>
-        <w:tc>
-          <w:tcPr/>
-          <w:p>
-            <w:pPr>
-              <w:pStyle w:val="Compact"/>
-              <w:jc w:val="left"/>
-            </w:pPr>
-            <w:r>
-              <w:t xml:space="preserve">Menti (placeholder)</w:t>
-            </w:r>
-          </w:p>
-        </w:tc>
-        <w:tc>
-          <w:tcPr/>
-          <w:p>
-            <w:pPr>
-              <w:pStyle w:val="Compact"/>
-              <w:jc w:val="left"/>
-            </w:pPr>
-            <w:r>
-              <w:t xml:space="preserve">A six-neighbourhood lottery where the offered side started 300 AED ahead and ends 900 AED ahead: A the effect is 900 / B about 600 / C too few units to trust either / D need more first. Replaces a true/false quiz with a judgement the room could face.</w:t>
-            </w:r>
-          </w:p>
-        </w:tc>
-        <w:tc>
-          <w:tcPr/>
-          <w:p>
-            <w:pPr>
-              <w:pStyle w:val="Compact"/>
-              <w:jc w:val="left"/>
-            </w:pPr>
-            <w:r>
-              <w:t xml:space="preserve">Make: Menti poll (online). Nothing to print.</w:t>
-            </w:r>
-          </w:p>
-        </w:tc>
-        <w:tc>
-          <w:tcPr/>
-          <w:p>
-            <w:pPr>
-              <w:pStyle w:val="Compact"/>
-              <w:jc w:val="left"/>
-            </w:pPr>
-            <w:r>
-              <w:t xml:space="preserve">Poll to build</w:t>
-            </w:r>
-          </w:p>
-        </w:tc>
-      </w:tr>
-      <w:tr>
-        <w:tc>
-          <w:tcPr/>
-          <w:p>
-            <w:pPr>
-              <w:pStyle w:val="Compact"/>
-              <w:jc w:val="left"/>
-            </w:pPr>
-            <w:r>
-              <w:t xml:space="preserve">Would you sign a roll-out?</w:t>
-            </w:r>
-          </w:p>
-        </w:tc>
-        <w:tc>
-          <w:tcPr/>
-          <w:p>
-            <w:pPr>
-              <w:pStyle w:val="Compact"/>
-              <w:jc w:val="left"/>
-            </w:pPr>
-            <w:r>
-              <w:t xml:space="preserve">~1:15 ·</w:t>
-            </w:r>
-            <w:r>
-              <w:t xml:space="preserve"> </w:t>
-            </w:r>
-            <w:r>
-              <w:t xml:space="preserve">“</w:t>
-            </w:r>
-            <w:r>
-              <w:t xml:space="preserve">Does it clear the rule?</w:t>
-            </w:r>
-            <w:r>
-              <w:t xml:space="preserve">”</w:t>
-            </w:r>
-          </w:p>
-        </w:tc>
-        <w:tc>
-          <w:tcPr/>
-          <w:p>
-            <w:pPr>
-              <w:pStyle w:val="Compact"/>
-              <w:jc w:val="left"/>
-            </w:pPr>
-            <w:r>
-              <w:t xml:space="preserve">Commitment vote</w:t>
-            </w:r>
-          </w:p>
-        </w:tc>
-        <w:tc>
-          <w:tcPr/>
-          <w:p>
-            <w:pPr>
-              <w:pStyle w:val="Compact"/>
-              <w:jc w:val="left"/>
-            </w:pPr>
-            <w:r>
-              <w:t xml:space="preserve">Hands, or Menti</w:t>
-            </w:r>
-          </w:p>
-        </w:tc>
-        <w:tc>
-          <w:tcPr/>
-          <w:p>
-            <w:pPr>
-              <w:pStyle w:val="Compact"/>
-              <w:jc w:val="left"/>
-            </w:pPr>
-            <w:r>
-              <w:t xml:space="preserve">The estimate clears 1,000 AED but the interval spans it; take</w:t>
-            </w:r>
-            <w:r>
-              <w:t xml:space="preserve"> </w:t>
-            </w:r>
-            <w:r>
-              <w:t xml:space="preserve">“</w:t>
-            </w:r>
-            <w:r>
-              <w:t xml:space="preserve">why</w:t>
-            </w:r>
-            <w:r>
-              <w:t xml:space="preserve">”</w:t>
-            </w:r>
-            <w:r>
-              <w:t xml:space="preserve"> </w:t>
-            </w:r>
-            <w:r>
-              <w:t xml:space="preserve">answers.</w:t>
-            </w:r>
-          </w:p>
-        </w:tc>
-        <w:tc>
-          <w:tcPr/>
-          <w:p>
-            <w:pPr>
-              <w:pStyle w:val="Compact"/>
-              <w:jc w:val="left"/>
-            </w:pPr>
-            <w:r>
-              <w:t xml:space="preserve">Nothing to print (hands), or a Menti poll.</w:t>
-            </w:r>
-          </w:p>
-        </w:tc>
-        <w:tc>
-          <w:tcPr/>
-          <w:p>
-            <w:pPr>
-              <w:pStyle w:val="Compact"/>
-              <w:jc w:val="left"/>
-            </w:pPr>
-            <w:r>
-              <w:t xml:space="preserve">In slides</w:t>
-            </w:r>
-          </w:p>
-        </w:tc>
-      </w:tr>
-      <w:tr>
-        <w:tc>
-          <w:tcPr/>
-          <w:p>
-            <w:pPr>
-              <w:pStyle w:val="Compact"/>
-              <w:jc w:val="left"/>
-            </w:pPr>
-            <w:r>
-              <w:t xml:space="preserve">What if the trial had been smaller? (slider)</w:t>
-            </w:r>
-          </w:p>
-        </w:tc>
-        <w:tc>
-          <w:tcPr/>
-          <w:p>
-            <w:pPr>
-              <w:pStyle w:val="Compact"/>
-              <w:jc w:val="left"/>
-            </w:pPr>
-            <w:r>
-              <w:t xml:space="preserve">~1:18 · Section 5</w:t>
-            </w:r>
-          </w:p>
-        </w:tc>
-        <w:tc>
-          <w:tcPr/>
-          <w:p>
-            <w:pPr>
-              <w:pStyle w:val="Compact"/>
-              <w:jc w:val="left"/>
-            </w:pPr>
-            <w:r>
-              <w:t xml:space="preserve">Whole-room prediction, live slider</w:t>
-            </w:r>
-          </w:p>
-        </w:tc>
-        <w:tc>
-          <w:tcPr/>
-          <w:p>
-            <w:pPr>
-              <w:pStyle w:val="Compact"/>
-              <w:jc w:val="left"/>
-            </w:pPr>
-            <w:r>
-              <w:t xml:space="preserve">None</w:t>
-            </w:r>
-          </w:p>
-        </w:tc>
-        <w:tc>
-          <w:tcPr/>
-          <w:p>
-            <w:pPr>
-              <w:pStyle w:val="Compact"/>
-              <w:jc w:val="left"/>
-            </w:pPr>
-            <w:r>
-              <w:t xml:space="preserve">196 down to 20 neighbourhoods: the estimate barely moves, the interval widens. No build.</w:t>
-            </w:r>
-          </w:p>
-        </w:tc>
-        <w:tc>
-          <w:tcPr/>
-          <w:p>
-            <w:pPr>
-              <w:pStyle w:val="Compact"/>
-              <w:jc w:val="left"/>
-            </w:pPr>
-            <w:r>
-              <w:t xml:space="preserve">Nothing to print or make.</w:t>
-            </w:r>
-          </w:p>
-        </w:tc>
-        <w:tc>
-          <w:tcPr/>
-          <w:p>
-            <w:pPr>
-              <w:pStyle w:val="Compact"/>
-              <w:jc w:val="left"/>
-            </w:pPr>
-            <w:r>
-              <w:t xml:space="preserve">In slides</w:t>
-            </w:r>
-          </w:p>
-        </w:tc>
-      </w:tr>
-      <w:tr>
-        <w:tc>
-          <w:tcPr/>
-          <w:p>
-            <w:pPr>
-              <w:pStyle w:val="Compact"/>
-              <w:jc w:val="left"/>
-            </w:pPr>
-            <w:r>
-              <w:t xml:space="preserve">AI Snapshot: a paragraph for the minister</w:t>
-            </w:r>
-          </w:p>
-        </w:tc>
-        <w:tc>
-          <w:tcPr/>
-          <w:p>
-            <w:pPr>
-              <w:pStyle w:val="Compact"/>
-              <w:jc w:val="left"/>
-            </w:pPr>
-            <w:r>
-              <w:t xml:space="preserve">~1:25 · Section 6</w:t>
-            </w:r>
-          </w:p>
-        </w:tc>
-        <w:tc>
-          <w:tcPr/>
-          <w:p>
-            <w:pPr>
-              <w:pStyle w:val="Compact"/>
-              <w:jc w:val="left"/>
-            </w:pPr>
-            <w:r>
-              <w:t xml:space="preserve">Pair hands-on + AI</w:t>
-            </w:r>
-          </w:p>
-        </w:tc>
-        <w:tc>
-          <w:tcPr/>
-          <w:p>
-            <w:pPr>
-              <w:pStyle w:val="Compact"/>
-              <w:jc w:val="left"/>
-            </w:pPr>
-            <w:r>
-              <w:t xml:space="preserve">Handout (pack page 2), 1 per pair; one AI device per pair</w:t>
-            </w:r>
-          </w:p>
-        </w:tc>
-        <w:tc>
-          <w:tcPr/>
-          <w:p>
-            <w:pPr>
-              <w:pStyle w:val="Compact"/>
-              <w:jc w:val="left"/>
-            </w:pPr>
-            <w:r>
-              <w:t xml:space="preserve">Pairs mark up the flawed paragraph, run the same short prompt, then the better prompt printed below it, and paste the better answer into a fresh chat to check. Facilitator key in the pack.</w:t>
-            </w:r>
-          </w:p>
-        </w:tc>
-        <w:tc>
-          <w:tcPr/>
-          <w:p>
-            <w:pPr>
-              <w:pStyle w:val="Compact"/>
-              <w:jc w:val="left"/>
-            </w:pPr>
-            <w:r>
-              <w:t xml:space="preserve">Print: AI handout (pack page 2), 1 per pair (about 20). Bring: one device with an AI tool per pair.</w:t>
-            </w:r>
-          </w:p>
-        </w:tc>
-        <w:tc>
-          <w:tcPr/>
-          <w:p>
-            <w:pPr>
-              <w:pStyle w:val="Compact"/>
-              <w:jc w:val="left"/>
-            </w:pPr>
-            <w:r>
-              <w:t xml:space="preserve">Built: print</w:t>
-            </w:r>
-          </w:p>
-        </w:tc>
-      </w:tr>
-      <w:tr>
-        <w:tc>
-          <w:tcPr/>
-          <w:p>
-            <w:pPr>
-              <w:pStyle w:val="Compact"/>
-              <w:jc w:val="left"/>
-            </w:pPr>
-            <w:r>
-              <w:t xml:space="preserve">Ask AI first: questions for the evaluator (optional)</w:t>
-            </w:r>
-          </w:p>
-        </w:tc>
-        <w:tc>
-          <w:tcPr/>
-          <w:p>
-            <w:pPr>
-              <w:pStyle w:val="Compact"/>
-              <w:jc w:val="left"/>
-            </w:pPr>
-            <w:r>
-              <w:t xml:space="preserve">~1:45 · Close</w:t>
-            </w:r>
-          </w:p>
-        </w:tc>
-        <w:tc>
-          <w:tcPr/>
-          <w:p>
-            <w:pPr>
-              <w:pStyle w:val="Compact"/>
-              <w:jc w:val="left"/>
-            </w:pPr>
-            <w:r>
-              <w:t xml:space="preserve">Pair + AI</w:t>
-            </w:r>
-          </w:p>
-        </w:tc>
-        <w:tc>
-          <w:tcPr/>
-          <w:p>
-            <w:pPr>
-              <w:pStyle w:val="Compact"/>
-              <w:jc w:val="left"/>
-            </w:pPr>
-            <w:r>
-              <w:t xml:space="preserve">AI device</w:t>
-            </w:r>
-          </w:p>
-        </w:tc>
-        <w:tc>
-          <w:tcPr/>
-          <w:p>
-            <w:pPr>
-              <w:pStyle w:val="Compact"/>
-              <w:jc w:val="left"/>
-            </w:pPr>
-            <w:r>
-              <w:t xml:space="preserve">Compare the AI’s list with the session’s three questions. No build.</w:t>
-            </w:r>
-          </w:p>
-        </w:tc>
-        <w:tc>
-          <w:tcPr/>
-          <w:p>
-            <w:pPr>
-              <w:pStyle w:val="Compact"/>
-              <w:jc w:val="left"/>
-            </w:pPr>
-            <w:r>
-              <w:t xml:space="preserve">Nothing to print. Bring: AI device.</w:t>
-            </w:r>
-          </w:p>
-        </w:tc>
-        <w:tc>
-          <w:tcPr/>
-          <w:p>
-            <w:pPr>
-              <w:pStyle w:val="Compact"/>
-              <w:jc w:val="left"/>
-            </w:pPr>
-            <w:r>
-              <w:t xml:space="preserve">In slides</w:t>
-            </w:r>
-          </w:p>
-        </w:tc>
-      </w:tr>
-      <w:tr>
-        <w:tc>
-          <w:tcPr/>
-          <w:p>
-            <w:pPr>
-              <w:pStyle w:val="Compact"/>
-              <w:jc w:val="left"/>
-            </w:pPr>
-            <w:r>
-              <w:t xml:space="preserve">Take-away card</w:t>
-            </w:r>
-          </w:p>
-        </w:tc>
-        <w:tc>
-          <w:tcPr/>
-          <w:p>
-            <w:pPr>
-              <w:pStyle w:val="Compact"/>
-              <w:jc w:val="left"/>
-            </w:pPr>
-            <w:r>
-              <w:t xml:space="preserve">~1:50 · Close</w:t>
-            </w:r>
-          </w:p>
-        </w:tc>
-        <w:tc>
-          <w:tcPr/>
-          <w:p>
-            <w:pPr>
-              <w:pStyle w:val="Compact"/>
-              <w:jc w:val="left"/>
-            </w:pPr>
-            <w:r>
-              <w:t xml:space="preserve">Handout</w:t>
-            </w:r>
-          </w:p>
-        </w:tc>
-        <w:tc>
-          <w:tcPr/>
-          <w:p>
-            <w:pPr>
-              <w:pStyle w:val="Compact"/>
-              <w:jc w:val="left"/>
-            </w:pPr>
-            <w:r>
-              <w:t xml:space="preserve">Pocket cards, 1 per participant</w:t>
-            </w:r>
-          </w:p>
-        </w:tc>
-        <w:tc>
-          <w:tcPr/>
-          <w:p>
-            <w:pPr>
-              <w:pStyle w:val="Compact"/>
-              <w:jc w:val="left"/>
-            </w:pPr>
-            <w:r>
-              <w:t xml:space="preserve">Three questions to ask about an RCT.</w:t>
-            </w:r>
-          </w:p>
-        </w:tc>
-        <w:tc>
-          <w:tcPr/>
-          <w:p>
-            <w:pPr>
-              <w:pStyle w:val="Compact"/>
-              <w:jc w:val="left"/>
-            </w:pPr>
-            <w:r>
-              <w:t xml:space="preserve">Print and cut: take-away cards, 1 per participant (40).</w:t>
-            </w:r>
-          </w:p>
-        </w:tc>
-        <w:tc>
-          <w:tcPr/>
-          <w:p>
-            <w:pPr>
-              <w:pStyle w:val="Compact"/>
-              <w:jc w:val="left"/>
-            </w:pPr>
-            <w:r>
-              <w:t xml:space="preserve">Built: print and cut</w:t>
+            <w:r>
+              <w:t>AI note check and evaluator question</w:t>
+            </w:r>
+          </w:p>
+        </w:tc>
+        <w:tc>
+          <w:tcPr/>
+          <w:p>
+            <w:r>
+              <w:t>Close</w:t>
+            </w:r>
+          </w:p>
+        </w:tc>
+        <w:tc>
+          <w:tcPr/>
+          <w:p>
+            <w:r>
+              <w:t>Source checking then individual retrieval</w:t>
+            </w:r>
+          </w:p>
+        </w:tc>
+        <w:tc>
+          <w:tcPr/>
+          <w:p>
+            <w:r>
+              <w:t>Sheet 2 and deck</w:t>
+            </w:r>
+          </w:p>
+        </w:tc>
+        <w:tc>
+          <w:tcPr/>
+          <w:p>
+            <w:r>
+              <w:t>Remove unsupported claims that the rule is proven and nationwide rollout is good value. Finish alone with a question and purpose.</w:t>
+            </w:r>
+          </w:p>
+        </w:tc>
+        <w:tc>
+          <w:tcPr/>
+          <w:p>
+            <w:r>
+              <w:t>No AI account required</w:t>
+            </w:r>
+          </w:p>
+        </w:tc>
+        <w:tc>
+          <w:tcPr/>
+          <w:p>
+            <w:r>
+              <w:t>Built</w:t>
             </w:r>
           </w:p>
         </w:tc>
@@ -9303,620 +7583,13 @@
     </w:tbl>
     <w:bookmarkEnd w:id="31"/>
     <w:bookmarkStart w:id="32" w:name="Xfd7c14996e7519404c2d464d7ea6843ca4ef300"/>
+    <w:bookmarkEnd w:id="32"/>
+    <w:bookmarkEnd w:id="33"/>
     <w:p>
-      <w:pPr>
-        <w:pStyle w:val="Heading2"/>
-      </w:pPr>
       <w:r>
-        <w:t xml:space="preserve">Oct 15, Session 3: Plan Your Own Evaluation (Building on Module 1)</w:t>
+        <w:t>Day 4 final slot: evaluation simulation prepared by another provider. Our former design workshop is excluded; its original files remain in the archive. No course-owned activities or print pack are required for that slot.</w:t>
       </w:r>
     </w:p>
-    <w:p>
-      <w:pPr>
-        <w:pStyle w:val="FirstParagraph"/>
-      </w:pPr>
-      <w:r>
-        <w:t xml:space="preserve">Team working time followed by a pitch. No AI Snapshot in this session. Print materials are in Oct15_session3_materials.docx, generated by make_session_materials.R from the same data as the deck; each item opens with a print line (copies, cut or not) and the last page is the facilitator key. Participant copies, without the key, are on the course website. The Design Update template recaps Module 1’s eight conditions (from qa_design_update.R), so teams can complete it without the Module 1 document to hand.</w:t>
-      </w:r>
-    </w:p>
-    <w:tbl>
-      <w:tblPr>
-        <w:tblStyle w:val="Table"/>
-        <w:tblW w:type="pct" w:w="5000"/>
-        <w:tblLook w:firstRow="1" w:lastRow="0" w:firstColumn="0" w:lastColumn="0" w:noHBand="0" w:noVBand="0" w:val="0020"/>
-        <w:jc w:val="start"/>
-      </w:tblPr>
-      <w:tblGrid>
-        <w:gridCol w:w="953"/>
-        <w:gridCol w:w="660"/>
-        <w:gridCol w:w="733"/>
-        <w:gridCol w:w="953"/>
-        <w:gridCol w:w="2200"/>
-        <w:gridCol w:w="1613"/>
-        <w:gridCol w:w="806"/>
-      </w:tblGrid>
-      <w:tr>
-        <w:trPr>
-          <w:tblHeader w:val="true"/>
-        </w:trPr>
-        <w:tc>
-          <w:tcPr/>
-          <w:p>
-            <w:pPr>
-              <w:pStyle w:val="Compact"/>
-              <w:jc w:val="left"/>
-            </w:pPr>
-            <w:r>
-              <w:t xml:space="preserve">Exercise</w:t>
-            </w:r>
-          </w:p>
-        </w:tc>
-        <w:tc>
-          <w:tcPr/>
-          <w:p>
-            <w:pPr>
-              <w:pStyle w:val="Compact"/>
-              <w:jc w:val="left"/>
-            </w:pPr>
-            <w:r>
-              <w:t xml:space="preserve">When (approx.)</w:t>
-            </w:r>
-          </w:p>
-        </w:tc>
-        <w:tc>
-          <w:tcPr/>
-          <w:p>
-            <w:pPr>
-              <w:pStyle w:val="Compact"/>
-              <w:jc w:val="left"/>
-            </w:pPr>
-            <w:r>
-              <w:t xml:space="preserve">Type</w:t>
-            </w:r>
-          </w:p>
-        </w:tc>
-        <w:tc>
-          <w:tcPr/>
-          <w:p>
-            <w:pPr>
-              <w:pStyle w:val="Compact"/>
-              <w:jc w:val="left"/>
-            </w:pPr>
-            <w:r>
-              <w:t xml:space="preserve">Materials needed</w:t>
-            </w:r>
-          </w:p>
-        </w:tc>
-        <w:tc>
-          <w:tcPr/>
-          <w:p>
-            <w:pPr>
-              <w:pStyle w:val="Compact"/>
-              <w:jc w:val="left"/>
-            </w:pPr>
-            <w:r>
-              <w:t xml:space="preserve">What PwC builds / needs to know</w:t>
-            </w:r>
-          </w:p>
-        </w:tc>
-        <w:tc>
-          <w:tcPr/>
-          <w:p>
-            <w:pPr>
-              <w:pStyle w:val="Compact"/>
-              <w:jc w:val="left"/>
-            </w:pPr>
-            <w:r>
-              <w:t xml:space="preserve">Print, make or bring</w:t>
-            </w:r>
-          </w:p>
-        </w:tc>
-        <w:tc>
-          <w:tcPr/>
-          <w:p>
-            <w:pPr>
-              <w:pStyle w:val="Compact"/>
-              <w:jc w:val="left"/>
-            </w:pPr>
-            <w:r>
-              <w:t xml:space="preserve">Status</w:t>
-            </w:r>
-          </w:p>
-        </w:tc>
-      </w:tr>
-      <w:tr>
-        <w:tc>
-          <w:tcPr/>
-          <w:p>
-            <w:pPr>
-              <w:pStyle w:val="Compact"/>
-              <w:jc w:val="left"/>
-            </w:pPr>
-            <w:r>
-              <w:t xml:space="preserve">Opening readiness check</w:t>
-            </w:r>
-          </w:p>
-        </w:tc>
-        <w:tc>
-          <w:tcPr/>
-          <w:p>
-            <w:pPr>
-              <w:pStyle w:val="Compact"/>
-              <w:jc w:val="left"/>
-            </w:pPr>
-            <w:r>
-              <w:t xml:space="preserve">~0:03 · Section 0,</w:t>
-            </w:r>
-            <w:r>
-              <w:t xml:space="preserve"> </w:t>
-            </w:r>
-            <w:r>
-              <w:t xml:space="preserve">“</w:t>
-            </w:r>
-            <w:r>
-              <w:t xml:space="preserve">How far along is your design?</w:t>
-            </w:r>
-            <w:r>
-              <w:t xml:space="preserve">”</w:t>
-            </w:r>
-          </w:p>
-        </w:tc>
-        <w:tc>
-          <w:tcPr/>
-          <w:p>
-            <w:pPr>
-              <w:pStyle w:val="Compact"/>
-              <w:jc w:val="left"/>
-            </w:pPr>
-            <w:r>
-              <w:t xml:space="preserve">Quick poll / show of hands</w:t>
-            </w:r>
-          </w:p>
-        </w:tc>
-        <w:tc>
-          <w:tcPr/>
-          <w:p>
-            <w:pPr>
-              <w:pStyle w:val="Compact"/>
-              <w:jc w:val="left"/>
-            </w:pPr>
-            <w:r>
-              <w:t xml:space="preserve">Optional Menti</w:t>
-            </w:r>
-          </w:p>
-        </w:tc>
-        <w:tc>
-          <w:tcPr/>
-          <w:p>
-            <w:pPr>
-              <w:pStyle w:val="Compact"/>
-              <w:jc w:val="left"/>
-            </w:pPr>
-            <w:r>
-              <w:t xml:space="preserve">“</w:t>
-            </w:r>
-            <w:r>
-              <w:t xml:space="preserve">How far along is your design?</w:t>
-            </w:r>
-            <w:r>
-              <w:t xml:space="preserve">”</w:t>
-            </w:r>
-            <w:r>
-              <w:t xml:space="preserve"> </w:t>
-            </w:r>
-            <w:r>
-              <w:t xml:space="preserve">Not started / rough outline / drafted / ready to pitch. PwC: optional Menti; a show of hands is fine.</w:t>
-            </w:r>
-          </w:p>
-        </w:tc>
-        <w:tc>
-          <w:tcPr/>
-          <w:p>
-            <w:pPr>
-              <w:pStyle w:val="Compact"/>
-              <w:jc w:val="left"/>
-            </w:pPr>
-            <w:r>
-              <w:t xml:space="preserve">Nothing to print. Optional: Menti poll.</w:t>
-            </w:r>
-          </w:p>
-        </w:tc>
-        <w:tc>
-          <w:tcPr/>
-          <w:p>
-            <w:pPr>
-              <w:pStyle w:val="Compact"/>
-              <w:jc w:val="left"/>
-            </w:pPr>
-            <w:r>
-              <w:t xml:space="preserve">In slides; Menti optional</w:t>
-            </w:r>
-          </w:p>
-        </w:tc>
-      </w:tr>
-      <w:tr>
-        <w:tc>
-          <w:tcPr/>
-          <w:p>
-            <w:pPr>
-              <w:pStyle w:val="Compact"/>
-              <w:jc w:val="left"/>
-            </w:pPr>
-            <w:r>
-              <w:t xml:space="preserve">Part 1: current design against the eight conditions</w:t>
-            </w:r>
-          </w:p>
-        </w:tc>
-        <w:tc>
-          <w:tcPr/>
-          <w:p>
-            <w:pPr>
-              <w:pStyle w:val="Compact"/>
-              <w:jc w:val="left"/>
-            </w:pPr>
-            <w:r>
-              <w:t xml:space="preserve">~0:10–0:30 · Section 1,</w:t>
-            </w:r>
-            <w:r>
-              <w:t xml:space="preserve"> </w:t>
-            </w:r>
-            <w:r>
-              <w:t xml:space="preserve">“</w:t>
-            </w:r>
-            <w:r>
-              <w:t xml:space="preserve">Working time</w:t>
-            </w:r>
-            <w:r>
-              <w:t xml:space="preserve">”</w:t>
-            </w:r>
-          </w:p>
-        </w:tc>
-        <w:tc>
-          <w:tcPr/>
-          <w:p>
-            <w:pPr>
-              <w:pStyle w:val="Compact"/>
-              <w:jc w:val="left"/>
-            </w:pPr>
-            <w:r>
-              <w:t xml:space="preserve">Team working time</w:t>
-            </w:r>
-          </w:p>
-        </w:tc>
-        <w:tc>
-          <w:tcPr/>
-          <w:p>
-            <w:pPr>
-              <w:pStyle w:val="Compact"/>
-              <w:jc w:val="left"/>
-            </w:pPr>
-            <w:r>
-              <w:t xml:space="preserve">Design Update template (pack pages 1–3), 1 per team</w:t>
-            </w:r>
-          </w:p>
-        </w:tc>
-        <w:tc>
-          <w:tcPr/>
-          <w:p>
-            <w:pPr>
-              <w:pStyle w:val="Compact"/>
-              <w:jc w:val="left"/>
-            </w:pPr>
-            <w:r>
-              <w:t xml:space="preserve">Twenty minutes: write the current design against Module 1’s eight conditions in Part 1 of the template, plus the team’s counterfactual in one sentence. Print only.</w:t>
-            </w:r>
-          </w:p>
-        </w:tc>
-        <w:tc>
-          <w:tcPr/>
-          <w:p>
-            <w:pPr>
-              <w:pStyle w:val="Compact"/>
-              <w:jc w:val="left"/>
-            </w:pPr>
-            <w:r>
-              <w:t xml:space="preserve">Print: Design Update template (pack pages 1-3), 1 per team.</w:t>
-            </w:r>
-          </w:p>
-        </w:tc>
-        <w:tc>
-          <w:tcPr/>
-          <w:p>
-            <w:pPr>
-              <w:pStyle w:val="Compact"/>
-              <w:jc w:val="left"/>
-            </w:pPr>
-            <w:r>
-              <w:t xml:space="preserve">Built: print</w:t>
-            </w:r>
-          </w:p>
-        </w:tc>
-      </w:tr>
-      <w:tr>
-        <w:tc>
-          <w:tcPr/>
-          <w:p>
-            <w:pPr>
-              <w:pStyle w:val="Compact"/>
-              <w:jc w:val="left"/>
-            </w:pPr>
-            <w:r>
-              <w:t xml:space="preserve">Part 2: the four additions</w:t>
-            </w:r>
-          </w:p>
-        </w:tc>
-        <w:tc>
-          <w:tcPr/>
-          <w:p>
-            <w:pPr>
-              <w:pStyle w:val="Compact"/>
-              <w:jc w:val="left"/>
-            </w:pPr>
-            <w:r>
-              <w:t xml:space="preserve">~0:35–1:05 · Section 2,</w:t>
-            </w:r>
-            <w:r>
-              <w:t xml:space="preserve"> </w:t>
-            </w:r>
-            <w:r>
-              <w:t xml:space="preserve">“</w:t>
-            </w:r>
-            <w:r>
-              <w:t xml:space="preserve">Working time</w:t>
-            </w:r>
-            <w:r>
-              <w:t xml:space="preserve">”</w:t>
-            </w:r>
-          </w:p>
-        </w:tc>
-        <w:tc>
-          <w:tcPr/>
-          <w:p>
-            <w:pPr>
-              <w:pStyle w:val="Compact"/>
-              <w:jc w:val="left"/>
-            </w:pPr>
-            <w:r>
-              <w:t xml:space="preserve">Team working time</w:t>
-            </w:r>
-          </w:p>
-        </w:tc>
-        <w:tc>
-          <w:tcPr/>
-          <w:p>
-            <w:pPr>
-              <w:pStyle w:val="Compact"/>
-              <w:jc w:val="left"/>
-            </w:pPr>
-            <w:r>
-              <w:t xml:space="preserve">Design Update template (pack pages 1–3)</w:t>
-            </w:r>
-          </w:p>
-        </w:tc>
-        <w:tc>
-          <w:tcPr/>
-          <w:p>
-            <w:pPr>
-              <w:pStyle w:val="Compact"/>
-              <w:jc w:val="left"/>
-            </w:pPr>
-            <w:r>
-              <w:t xml:space="preserve">Thirty minutes: complete the four additions (results-presentation plan, cost-benefit framework, visualisation sketch, evidence-translation plan) in Part 2. Print only.</w:t>
-            </w:r>
-          </w:p>
-        </w:tc>
-        <w:tc>
-          <w:tcPr/>
-          <w:p>
-            <w:pPr>
-              <w:pStyle w:val="Compact"/>
-              <w:jc w:val="left"/>
-            </w:pPr>
-            <w:r>
-              <w:t xml:space="preserve">Print: the same template (see above).</w:t>
-            </w:r>
-          </w:p>
-        </w:tc>
-        <w:tc>
-          <w:tcPr/>
-          <w:p>
-            <w:pPr>
-              <w:pStyle w:val="Compact"/>
-              <w:jc w:val="left"/>
-            </w:pPr>
-            <w:r>
-              <w:t xml:space="preserve">Built: print</w:t>
-            </w:r>
-          </w:p>
-        </w:tc>
-      </w:tr>
-      <w:tr>
-        <w:tc>
-          <w:tcPr/>
-          <w:p>
-            <w:pPr>
-              <w:pStyle w:val="Compact"/>
-              <w:jc w:val="left"/>
-            </w:pPr>
-            <w:r>
-              <w:t xml:space="preserve">Team pitch + room feedback</w:t>
-            </w:r>
-          </w:p>
-        </w:tc>
-        <w:tc>
-          <w:tcPr/>
-          <w:p>
-            <w:pPr>
-              <w:pStyle w:val="Compact"/>
-              <w:jc w:val="left"/>
-            </w:pPr>
-            <w:r>
-              <w:t xml:space="preserve">~1:10–1:55 · Section 3</w:t>
-            </w:r>
-          </w:p>
-        </w:tc>
-        <w:tc>
-          <w:tcPr/>
-          <w:p>
-            <w:pPr>
-              <w:pStyle w:val="Compact"/>
-              <w:jc w:val="left"/>
-            </w:pPr>
-            <w:r>
-              <w:t xml:space="preserve">Group presentation + structured feedback</w:t>
-            </w:r>
-          </w:p>
-        </w:tc>
-        <w:tc>
-          <w:tcPr/>
-          <w:p>
-            <w:pPr>
-              <w:pStyle w:val="Compact"/>
-              <w:jc w:val="left"/>
-            </w:pPr>
-            <w:r>
-              <w:t xml:space="preserve">Timer; pitch plan (template Part 3); feedback slips (pack page 4), 1 page per participant, cut into four</w:t>
-            </w:r>
-          </w:p>
-        </w:tc>
-        <w:tc>
-          <w:tcPr/>
-          <w:p>
-            <w:pPr>
-              <w:pStyle w:val="Compact"/>
-              <w:jc w:val="left"/>
-            </w:pPr>
-            <w:r>
-              <w:t xml:space="preserve">Five-minute pitch per team using the timed five-part structure (limit first), planned in Part 3 of the template. Then three minutes of room feedback in the fixed order, written on the feedback slips and handed to the team. Print only.</w:t>
-            </w:r>
-          </w:p>
-        </w:tc>
-        <w:tc>
-          <w:tcPr/>
-          <w:p>
-            <w:pPr>
-              <w:pStyle w:val="Compact"/>
-              <w:jc w:val="left"/>
-            </w:pPr>
-            <w:r>
-              <w:t xml:space="preserve">Print and cut: feedback slips (pack page 4), 1 page per participant (40). Bring: a timer.</w:t>
-            </w:r>
-          </w:p>
-        </w:tc>
-        <w:tc>
-          <w:tcPr/>
-          <w:p>
-            <w:pPr>
-              <w:pStyle w:val="Compact"/>
-              <w:jc w:val="left"/>
-            </w:pPr>
-            <w:r>
-              <w:t xml:space="preserve">Built: print</w:t>
-            </w:r>
-          </w:p>
-        </w:tc>
-      </w:tr>
-      <w:tr>
-        <w:tc>
-          <w:tcPr/>
-          <w:p>
-            <w:pPr>
-              <w:pStyle w:val="Compact"/>
-              <w:jc w:val="left"/>
-            </w:pPr>
-            <w:r>
-              <w:t xml:space="preserve">Take-away card: the one question</w:t>
-            </w:r>
-          </w:p>
-        </w:tc>
-        <w:tc>
-          <w:tcPr/>
-          <w:p>
-            <w:pPr>
-              <w:pStyle w:val="Compact"/>
-              <w:jc w:val="left"/>
-            </w:pPr>
-            <w:r>
-              <w:t xml:space="preserve">~1:58 · Section 4,</w:t>
-            </w:r>
-            <w:r>
-              <w:t xml:space="preserve"> </w:t>
-            </w:r>
-            <w:r>
-              <w:t xml:space="preserve">“</w:t>
-            </w:r>
-            <w:r>
-              <w:t xml:space="preserve">The one question</w:t>
-            </w:r>
-            <w:r>
-              <w:t xml:space="preserve">”</w:t>
-            </w:r>
-          </w:p>
-        </w:tc>
-        <w:tc>
-          <w:tcPr/>
-          <w:p>
-            <w:pPr>
-              <w:pStyle w:val="Compact"/>
-              <w:jc w:val="left"/>
-            </w:pPr>
-            <w:r>
-              <w:t xml:space="preserve">Handout (take-away)</w:t>
-            </w:r>
-          </w:p>
-        </w:tc>
-        <w:tc>
-          <w:tcPr/>
-          <w:p>
-            <w:pPr>
-              <w:pStyle w:val="Compact"/>
-              <w:jc w:val="left"/>
-            </w:pPr>
-            <w:r>
-              <w:t xml:space="preserve">Take-away card (pack page 5), 1 per participant, cut</w:t>
-            </w:r>
-          </w:p>
-        </w:tc>
-        <w:tc>
-          <w:tcPr/>
-          <w:p>
-            <w:pPr>
-              <w:pStyle w:val="Compact"/>
-              <w:jc w:val="left"/>
-            </w:pPr>
-            <w:r>
-              <w:t xml:space="preserve">The week’s one question, with space for the first evaluation decision each participant will make back at their desk. Print only.</w:t>
-            </w:r>
-          </w:p>
-        </w:tc>
-        <w:tc>
-          <w:tcPr/>
-          <w:p>
-            <w:pPr>
-              <w:pStyle w:val="Compact"/>
-              <w:jc w:val="left"/>
-            </w:pPr>
-            <w:r>
-              <w:t xml:space="preserve">Print and cut: take-away cards, 1 per participant (40).</w:t>
-            </w:r>
-          </w:p>
-        </w:tc>
-        <w:tc>
-          <w:tcPr/>
-          <w:p>
-            <w:pPr>
-              <w:pStyle w:val="Compact"/>
-              <w:jc w:val="left"/>
-            </w:pPr>
-            <w:r>
-              <w:t xml:space="preserve">Built: print</w:t>
-            </w:r>
-          </w:p>
-        </w:tc>
-      </w:tr>
-    </w:tbl>
-    <w:bookmarkEnd w:id="32"/>
-    <w:bookmarkEnd w:id="33"/>
     <w:sectPr>
       <w:pgSz w:h="12240" w:orient="landscape" w:w="15840"/>
       <w:pgMar w:bottom="720" w:footer="360" w:gutter="0" w:header="360" w:left="720" w:right="720" w:top="720"/>

</xml_diff>

<commit_message>
Rebuild Day 3 for shorter evidence reading sessions
Add shared cost assumptions, chart controls, analyst answers and two-sided worksheets. Preserve scenario cards and the ratio wall; prepare Day 4 tables for daily review.

Co-Authored-By: Codex <noreply@openai.com>
</commit_message>
<xml_diff>
--- a/Module_2_Oct_2026_v2/Module2_exercise_plan_v3.docx
+++ b/Module_2_Oct_2026_v2/Module2_exercise_plan_v3.docx
@@ -40,7 +40,7 @@
         <w:pStyle w:val="BodyText"/>
       </w:pPr>
       <w:r>
-        <w:t>The programme now has eleven course-owned sessions. Days 1 and 2 have been rebuilt with two-sided participant sheets and separate trainer keys. Day 3 and 4 descriptions and files remain historical until their daily rebuild. The final Day 4 slot belongs to an evaluation simulation prepared by someone else.</w:t>
+        <w:t>The programme now has eleven course-owned sessions. Days 1 to 3 have been rebuilt with two-sided participant sheets and separate trainer keys. Day 4 descriptions and files remain historical until their daily rebuild. The final Day 4 slot belongs to an evaluation simulation prepared by someone else.</w:t>
       </w:r>
     </w:p>
     <w:p>
@@ -48,7 +48,7 @@
         <w:pStyle w:val="BodyText"/>
       </w:pPr>
       <w:r>
-        <w:t>Print, make or bring gives the practical requirement for each exercise. Quantities assume eight groups and up to forty participants; adjust them to final attendance. Menti is retired. Days 1 and 2 use local deck interactions and optional course-owned room voting, with labelled cards as the fallback.</w:t>
+        <w:t>Print, make or bring gives the practical requirement for each exercise. Quantities assume eight groups and up to forty participants; adjust them to final attendance. Menti is retired. Days 1 to 3 use local deck interactions and optional course-owned room voting, with labelled cards as the fallback.</w:t>
       </w:r>
     </w:p>
     <w:p>
@@ -73,7 +73,7 @@
     </w:p>
     <w:p>
       <w:r>
-        <w:t>Approved shorter programme: Days 1 to 3 use 60, 60 and 75 minutes; Day 4 has two course-owned 60-minute sessions. Days 1 and 2 are rebuilt. Days 3 and 4 descriptions remain historical pending their daily review. Menti is retired; the course room poll and labelled-card fallback replace it.</w:t>
+        <w:t>Approved shorter programme: Days 1 to 3 use 60, 60 and 75 minutes; Day 4 has two course-owned 60-minute sessions. Days 1 to 3 are rebuilt. Day 4 descriptions remain historical pending their daily review. Menti is retired; the course room poll and labelled-card fallback replace it.</w:t>
       </w:r>
     </w:p>
     <w:tbl>
@@ -267,7 +267,7 @@
               <w:jc w:val="left"/>
             </w:pPr>
             <w:r>
-              <w:t>Days 1 and 2 need no AI account. Optional phones for course room voting; test classroom network. Days 3 and 4 device needs await their daily rebuild.</w:t>
+              <w:t>Days 1 to 3 need no AI account. Optional phones for course room voting; test classroom network. Day 4 device needs await its daily rebuild.</w:t>
             </w:r>
           </w:p>
         </w:tc>
@@ -3298,7 +3298,7 @@
         <w:pStyle w:val="Heading2"/>
       </w:pPr>
       <w:r>
-        <w:t xml:space="preserve">Oct 14, Session 1: Was It Worth It? (Cost Analysis)</w:t>
+        <w:t>Oct 14, Session 1: Judge a value for money claim (60 minutes)</w:t>
       </w:r>
     </w:p>
     <w:p>
@@ -3306,7 +3306,7 @@
         <w:pStyle w:val="FirstParagraph"/>
       </w:pPr>
       <w:r>
-        <w:t xml:space="preserve">Revised 6 Oct: the stress test now uses an A1 ratio-wall poster (prediction, then the real ratio). Revised 25 Sep for the live deck (Oct14_session1_live.qmd): the trainer runs R in the browser and the room predicts each result before the Run button is pressed. Print materials are in Oct14_session1_materials.docx, generated by make_session_materials.R from the same data as the deck; each item opens with a print line (copies, cut or not) and the last page is the facilitator key. Polls are Menti placeholders for now; an in-slide poll is planned. One example all session: the GreenWaste cost-benefit model. The Abu Dhabi case slot is dropped and replaced by the stress-test exercise.</w:t>
+        <w:t>Approved 6 October 2026. GreenWaste only, fictional figures. Participant pages 1 and 2 are printed double-sided, one per person. The remaining trainer pages contain activities and keys, with page ranges stated in each pack. One trainer demonstration per session; no participant coding. Native deck controls and optional course room voting replace Menti. Retain the five scenario cards and ratio wall; all assumptions are labelled.</w:t>
       </w:r>
     </w:p>
     <w:tbl>
@@ -3423,91 +3423,79 @@
               <w:jc w:val="left"/>
             </w:pPr>
             <w:r>
-              <w:t xml:space="preserve">Approval poll:</w:t>
-            </w:r>
-            <w:r>
-              <w:t xml:space="preserve"> </w:t>
-            </w:r>
-            <w:r>
-              <w:t xml:space="preserve">“</w:t>
-            </w:r>
-            <w:r>
-              <w:t xml:space="preserve">On a ratio of 1.87, what would you do?</w:t>
-            </w:r>
-            <w:r>
-              <w:t xml:space="preserve">”</w:t>
-            </w:r>
-          </w:p>
-        </w:tc>
-        <w:tc>
-          <w:tcPr/>
-          <w:p>
-            <w:pPr>
-              <w:pStyle w:val="Compact"/>
-              <w:jc w:val="left"/>
-            </w:pPr>
-            <w:r>
-              <w:t xml:space="preserve">~0:12 · Section 1</w:t>
-            </w:r>
-          </w:p>
-        </w:tc>
-        <w:tc>
-          <w:tcPr/>
-          <w:p>
-            <w:pPr>
-              <w:pStyle w:val="Compact"/>
-              <w:jc w:val="left"/>
-            </w:pPr>
-            <w:r>
-              <w:t xml:space="preserve">Live poll, QR on slide</w:t>
-            </w:r>
-          </w:p>
-        </w:tc>
-        <w:tc>
-          <w:tcPr/>
-          <w:p>
-            <w:pPr>
-              <w:pStyle w:val="Compact"/>
-              <w:jc w:val="left"/>
-            </w:pPr>
-            <w:r>
-              <w:t xml:space="preserve">Menti (placeholder)</w:t>
-            </w:r>
-          </w:p>
-        </w:tc>
-        <w:tc>
-          <w:tcPr/>
-          <w:p>
-            <w:pPr>
-              <w:pStyle w:val="Compact"/>
-              <w:jc w:val="left"/>
-            </w:pPr>
-            <w:r>
-              <w:t xml:space="preserve">Approve / Reject / I need to know something else first. Write up what people need and compare with the three questions later.</w:t>
-            </w:r>
-          </w:p>
-        </w:tc>
-        <w:tc>
-          <w:tcPr/>
-          <w:p>
-            <w:pPr>
-              <w:pStyle w:val="Compact"/>
-              <w:jc w:val="left"/>
-            </w:pPr>
-            <w:r>
-              <w:t xml:space="preserve">Make: Menti poll (online). Nothing to print.</w:t>
-            </w:r>
-          </w:p>
-        </w:tc>
-        <w:tc>
-          <w:tcPr/>
-          <w:p>
-            <w:pPr>
-              <w:pStyle w:val="Compact"/>
-              <w:jc w:val="left"/>
-            </w:pPr>
-            <w:r>
-              <w:t xml:space="preserve">Poll to build</w:t>
+              <w:t>Read inputs</w:t>
+            </w:r>
+          </w:p>
+        </w:tc>
+        <w:tc>
+          <w:tcPr/>
+          <w:p>
+            <w:pPr>
+              <w:pStyle w:val="Compact"/>
+              <w:jc w:val="left"/>
+            </w:pPr>
+            <w:r>
+              <w:t>0-13 min</w:t>
+            </w:r>
+          </w:p>
+        </w:tc>
+        <w:tc>
+          <w:tcPr/>
+          <w:p>
+            <w:pPr>
+              <w:pStyle w:val="Compact"/>
+              <w:jc w:val="left"/>
+            </w:pPr>
+            <w:r>
+              <w:t>Individual then pairs</w:t>
+            </w:r>
+          </w:p>
+        </w:tc>
+        <w:tc>
+          <w:tcPr/>
+          <w:p>
+            <w:pPr>
+              <w:pStyle w:val="Compact"/>
+              <w:jc w:val="left"/>
+            </w:pPr>
+            <w:r>
+              <w:t>Participant sheet 1</w:t>
+            </w:r>
+          </w:p>
+        </w:tc>
+        <w:tc>
+          <w:tcPr/>
+          <w:p>
+            <w:pPr>
+              <w:pStyle w:val="Compact"/>
+              <w:jc w:val="left"/>
+            </w:pPr>
+            <w:r>
+              <w:t>Saving source, cost, timing and duration; label assumptions</w:t>
+            </w:r>
+          </w:p>
+        </w:tc>
+        <w:tc>
+          <w:tcPr/>
+          <w:p>
+            <w:pPr>
+              <w:pStyle w:val="Compact"/>
+              <w:jc w:val="left"/>
+            </w:pPr>
+            <w:r>
+              <w:t>Two-sided participant sheet, one per person</w:t>
+            </w:r>
+          </w:p>
+        </w:tc>
+        <w:tc>
+          <w:tcPr/>
+          <w:p>
+            <w:pPr>
+              <w:pStyle w:val="Compact"/>
+              <w:jc w:val="left"/>
+            </w:pPr>
+            <w:r>
+              <w:t>Built</w:t>
             </w:r>
           </w:p>
         </w:tc>
@@ -3521,91 +3509,79 @@
               <w:jc w:val="left"/>
             </w:pPr>
             <w:r>
-              <w:t xml:space="preserve">Guess the discounting</w:t>
-            </w:r>
-          </w:p>
-        </w:tc>
-        <w:tc>
-          <w:tcPr/>
-          <w:p>
-            <w:pPr>
-              <w:pStyle w:val="Compact"/>
-              <w:jc w:val="left"/>
-            </w:pPr>
-            <w:r>
-              <w:t xml:space="preserve">~0:22 ·</w:t>
-            </w:r>
-            <w:r>
-              <w:t xml:space="preserve"> </w:t>
-            </w:r>
-            <w:r>
-              <w:t xml:space="preserve">“</w:t>
-            </w:r>
-            <w:r>
-              <w:t xml:space="preserve">A saving next year is worth less</w:t>
-            </w:r>
-            <w:r>
-              <w:t xml:space="preserve">”</w:t>
-            </w:r>
-          </w:p>
-        </w:tc>
-        <w:tc>
-          <w:tcPr/>
-          <w:p>
-            <w:pPr>
-              <w:pStyle w:val="Compact"/>
-              <w:jc w:val="left"/>
-            </w:pPr>
-            <w:r>
-              <w:t xml:space="preserve">Whole-room prediction</w:t>
-            </w:r>
-          </w:p>
-        </w:tc>
-        <w:tc>
-          <w:tcPr/>
-          <w:p>
-            <w:pPr>
-              <w:pStyle w:val="Compact"/>
-              <w:jc w:val="left"/>
-            </w:pPr>
-            <w:r>
-              <w:t xml:space="preserve">None</w:t>
-            </w:r>
-          </w:p>
-        </w:tc>
-        <w:tc>
-          <w:tcPr/>
-          <w:p>
-            <w:pPr>
-              <w:pStyle w:val="Compact"/>
-              <w:jc w:val="left"/>
-            </w:pPr>
-            <w:r>
-              <w:t xml:space="preserve">What are 816 AED in year 4 worth today at 5%? (about 670). No build.</w:t>
-            </w:r>
-          </w:p>
-        </w:tc>
-        <w:tc>
-          <w:tcPr/>
-          <w:p>
-            <w:pPr>
-              <w:pStyle w:val="Compact"/>
-              <w:jc w:val="left"/>
-            </w:pPr>
-            <w:r>
-              <w:t xml:space="preserve">Nothing to print or make.</w:t>
-            </w:r>
-          </w:p>
-        </w:tc>
-        <w:tc>
-          <w:tcPr/>
-          <w:p>
-            <w:pPr>
-              <w:pStyle w:val="Compact"/>
-              <w:jc w:val="left"/>
-            </w:pPr>
-            <w:r>
-              <w:t xml:space="preserve">In slides</w:t>
+              <w:t>Predict and run</w:t>
+            </w:r>
+          </w:p>
+        </w:tc>
+        <w:tc>
+          <w:tcPr/>
+          <w:p>
+            <w:pPr>
+              <w:pStyle w:val="Compact"/>
+              <w:jc w:val="left"/>
+            </w:pPr>
+            <w:r>
+              <w:t>13-18 min</w:t>
+            </w:r>
+          </w:p>
+        </w:tc>
+        <w:tc>
+          <w:tcPr/>
+          <w:p>
+            <w:pPr>
+              <w:pStyle w:val="Compact"/>
+              <w:jc w:val="left"/>
+            </w:pPr>
+            <w:r>
+              <w:t>Trainer demo</w:t>
+            </w:r>
+          </w:p>
+        </w:tc>
+        <w:tc>
+          <w:tcPr/>
+          <w:p>
+            <w:pPr>
+              <w:pStyle w:val="Compact"/>
+              <w:jc w:val="left"/>
+            </w:pPr>
+            <w:r>
+              <w:t>Deck and result row</w:t>
+            </w:r>
+          </w:p>
+        </w:tc>
+        <w:tc>
+          <w:tcPr/>
+          <w:p>
+            <w:pPr>
+              <w:pStyle w:val="Compact"/>
+              <w:jc w:val="left"/>
+            </w:pPr>
+            <w:r>
+              <w:t>One benefit-cost calculation only; paper fallback</w:t>
+            </w:r>
+          </w:p>
+        </w:tc>
+        <w:tc>
+          <w:tcPr/>
+          <w:p>
+            <w:pPr>
+              <w:pStyle w:val="Compact"/>
+              <w:jc w:val="left"/>
+            </w:pPr>
+            <w:r>
+              <w:t>Open webR early</w:t>
+            </w:r>
+          </w:p>
+        </w:tc>
+        <w:tc>
+          <w:tcPr/>
+          <w:p>
+            <w:pPr>
+              <w:pStyle w:val="Compact"/>
+              <w:jc w:val="left"/>
+            </w:pPr>
+            <w:r>
+              <w:t>Built</w:t>
             </w:r>
           </w:p>
         </w:tc>
@@ -3619,79 +3595,79 @@
               <w:jc w:val="left"/>
             </w:pPr>
             <w:r>
-              <w:t xml:space="preserve">The calculator; rate alone; horizon alone</w:t>
-            </w:r>
-          </w:p>
-        </w:tc>
-        <w:tc>
-          <w:tcPr/>
-          <w:p>
-            <w:pPr>
-              <w:pStyle w:val="Compact"/>
-              <w:jc w:val="left"/>
-            </w:pPr>
-            <w:r>
-              <w:t xml:space="preserve">~0:25–0:45 · Section 2</w:t>
-            </w:r>
-          </w:p>
-        </w:tc>
-        <w:tc>
-          <w:tcPr/>
-          <w:p>
-            <w:pPr>
-              <w:pStyle w:val="Compact"/>
-              <w:jc w:val="left"/>
-            </w:pPr>
-            <w:r>
-              <w:t xml:space="preserve">Whole-room prediction, live sliders</w:t>
-            </w:r>
-          </w:p>
-        </w:tc>
-        <w:tc>
-          <w:tcPr/>
-          <w:p>
-            <w:pPr>
-              <w:pStyle w:val="Compact"/>
-              <w:jc w:val="left"/>
-            </w:pPr>
-            <w:r>
-              <w:t xml:space="preserve">None</w:t>
-            </w:r>
-          </w:p>
-        </w:tc>
-        <w:tc>
-          <w:tcPr/>
-          <w:p>
-            <w:pPr>
-              <w:pStyle w:val="Compact"/>
-              <w:jc w:val="left"/>
-            </w:pPr>
-            <w:r>
-              <w:t xml:space="preserve">The room guesses where the ratio falls below 1: the rate alone needs about 24%; the saving lasting 2 years gives 0.80. No build.</w:t>
-            </w:r>
-          </w:p>
-        </w:tc>
-        <w:tc>
-          <w:tcPr/>
-          <w:p>
-            <w:pPr>
-              <w:pStyle w:val="Compact"/>
-              <w:jc w:val="left"/>
-            </w:pPr>
-            <w:r>
-              <w:t xml:space="preserve">Nothing to print or make.</w:t>
-            </w:r>
-          </w:p>
-        </w:tc>
-        <w:tc>
-          <w:tcPr/>
-          <w:p>
-            <w:pPr>
-              <w:pStyle w:val="Compact"/>
-              <w:jc w:val="left"/>
-            </w:pPr>
-            <w:r>
-              <w:t xml:space="preserve">In slides</w:t>
+              <w:t>Timing and missing costs</w:t>
+            </w:r>
+          </w:p>
+        </w:tc>
+        <w:tc>
+          <w:tcPr/>
+          <w:p>
+            <w:pPr>
+              <w:pStyle w:val="Compact"/>
+              <w:jc w:val="left"/>
+            </w:pPr>
+            <w:r>
+              <w:t>18-29 min</w:t>
+            </w:r>
+          </w:p>
+        </w:tc>
+        <w:tc>
+          <w:tcPr/>
+          <w:p>
+            <w:pPr>
+              <w:pStyle w:val="Compact"/>
+              <w:jc w:val="left"/>
+            </w:pPr>
+            <w:r>
+              <w:t>Pairs</w:t>
+            </w:r>
+          </w:p>
+        </w:tc>
+        <w:tc>
+          <w:tcPr/>
+          <w:p>
+            <w:pPr>
+              <w:pStyle w:val="Compact"/>
+              <w:jc w:val="left"/>
+            </w:pPr>
+            <w:r>
+              <w:t>Native reveal and worksheet</w:t>
+            </w:r>
+          </w:p>
+        </w:tc>
+        <w:tc>
+          <w:tcPr/>
+          <w:p>
+            <w:pPr>
+              <w:pStyle w:val="Compact"/>
+              <w:jc w:val="left"/>
+            </w:pPr>
+            <w:r>
+              <w:t>Later savings and omitted costs; avoid double counting</w:t>
+            </w:r>
+          </w:p>
+        </w:tc>
+        <w:tc>
+          <w:tcPr/>
+          <w:p>
+            <w:pPr>
+              <w:pStyle w:val="Compact"/>
+              <w:jc w:val="left"/>
+            </w:pPr>
+            <w:r>
+              <w:t>No extra print</w:t>
+            </w:r>
+          </w:p>
+        </w:tc>
+        <w:tc>
+          <w:tcPr/>
+          <w:p>
+            <w:pPr>
+              <w:pStyle w:val="Compact"/>
+              <w:jc w:val="left"/>
+            </w:pPr>
+            <w:r>
+              <w:t>Built</w:t>
             </w:r>
           </w:p>
         </w:tc>
@@ -3705,79 +3681,79 @@
               <w:jc w:val="left"/>
             </w:pPr>
             <w:r>
-              <w:t xml:space="preserve">Costs left out (slider)</w:t>
-            </w:r>
-          </w:p>
-        </w:tc>
-        <w:tc>
-          <w:tcPr/>
-          <w:p>
-            <w:pPr>
-              <w:pStyle w:val="Compact"/>
-              <w:jc w:val="left"/>
-            </w:pPr>
-            <w:r>
-              <w:t xml:space="preserve">~0:55 · Question 2</w:t>
-            </w:r>
-          </w:p>
-        </w:tc>
-        <w:tc>
-          <w:tcPr/>
-          <w:p>
-            <w:pPr>
-              <w:pStyle w:val="Compact"/>
-              <w:jc w:val="left"/>
-            </w:pPr>
-            <w:r>
-              <w:t xml:space="preserve">Whole-room prediction</w:t>
-            </w:r>
-          </w:p>
-        </w:tc>
-        <w:tc>
-          <w:tcPr/>
-          <w:p>
-            <w:pPr>
-              <w:pStyle w:val="Compact"/>
-              <w:jc w:val="left"/>
-            </w:pPr>
-            <w:r>
-              <w:t xml:space="preserve">None</w:t>
-            </w:r>
-          </w:p>
-        </w:tc>
-        <w:tc>
-          <w:tcPr/>
-          <w:p>
-            <w:pPr>
-              <w:pStyle w:val="Compact"/>
-              <w:jc w:val="left"/>
-            </w:pPr>
-            <w:r>
-              <w:t xml:space="preserve">How much extra cost per business before the ratio falls below 1? (about 1,600 AED). No build.</w:t>
-            </w:r>
-          </w:p>
-        </w:tc>
-        <w:tc>
-          <w:tcPr/>
-          <w:p>
-            <w:pPr>
-              <w:pStyle w:val="Compact"/>
-              <w:jc w:val="left"/>
-            </w:pPr>
-            <w:r>
-              <w:t xml:space="preserve">Nothing to print or make.</w:t>
-            </w:r>
-          </w:p>
-        </w:tc>
-        <w:tc>
-          <w:tcPr/>
-          <w:p>
-            <w:pPr>
-              <w:pStyle w:val="Compact"/>
-              <w:jc w:val="left"/>
-            </w:pPr>
-            <w:r>
-              <w:t xml:space="preserve">In slides</w:t>
+              <w:t>Scenario and ratio wall</w:t>
+            </w:r>
+          </w:p>
+        </w:tc>
+        <w:tc>
+          <w:tcPr/>
+          <w:p>
+            <w:pPr>
+              <w:pStyle w:val="Compact"/>
+              <w:jc w:val="left"/>
+            </w:pPr>
+            <w:r>
+              <w:t>29-44 min</w:t>
+            </w:r>
+          </w:p>
+        </w:tc>
+        <w:tc>
+          <w:tcPr/>
+          <w:p>
+            <w:pPr>
+              <w:pStyle w:val="Compact"/>
+              <w:jc w:val="left"/>
+            </w:pPr>
+            <w:r>
+              <w:t>Eight groups</w:t>
+            </w:r>
+          </w:p>
+        </w:tc>
+        <w:tc>
+          <w:tcPr/>
+          <w:p>
+            <w:pPr>
+              <w:pStyle w:val="Compact"/>
+              <w:jc w:val="left"/>
+            </w:pPr>
+            <w:r>
+              <w:t>Five scenario cards; A1 board</w:t>
+            </w:r>
+          </w:p>
+        </w:tc>
+        <w:tc>
+          <w:tcPr/>
+          <w:p>
+            <w:pPr>
+              <w:pStyle w:val="Compact"/>
+              <w:jc w:val="left"/>
+            </w:pPr>
+            <w:r>
+              <w:t>Separate prediction and result lanes</w:t>
+            </w:r>
+          </w:p>
+        </w:tc>
+        <w:tc>
+          <w:tcPr/>
+          <w:p>
+            <w:pPr>
+              <w:pStyle w:val="Compact"/>
+              <w:jc w:val="left"/>
+            </w:pPr>
+            <w:r>
+              <w:t>Trainer pages 3-7 plus 3-5 again; one landscape A1; eight sticky notes</w:t>
+            </w:r>
+          </w:p>
+        </w:tc>
+        <w:tc>
+          <w:tcPr/>
+          <w:p>
+            <w:pPr>
+              <w:pStyle w:val="Compact"/>
+              <w:jc w:val="left"/>
+            </w:pPr>
+            <w:r>
+              <w:t>Built</w:t>
             </w:r>
           </w:p>
         </w:tc>
@@ -3791,263 +3767,79 @@
               <w:jc w:val="left"/>
             </w:pPr>
             <w:r>
-              <w:t xml:space="preserve">Stress-test the ratio</w:t>
-            </w:r>
-          </w:p>
-        </w:tc>
-        <w:tc>
-          <w:tcPr/>
-          <w:p>
-            <w:pPr>
-              <w:pStyle w:val="Compact"/>
-              <w:jc w:val="left"/>
-            </w:pPr>
-            <w:r>
-              <w:t xml:space="preserve">~1:00 ·</w:t>
-            </w:r>
-            <w:r>
-              <w:t xml:space="preserve"> </w:t>
-            </w:r>
-            <w:r>
-              <w:t xml:space="preserve">“</w:t>
-            </w:r>
-            <w:r>
-              <w:t xml:space="preserve">Your turn</w:t>
-            </w:r>
-            <w:r>
-              <w:t xml:space="preserve">”</w:t>
-            </w:r>
-          </w:p>
-        </w:tc>
-        <w:tc>
-          <w:tcPr/>
-          <w:p>
-            <w:pPr>
-              <w:pStyle w:val="Compact"/>
-              <w:jc w:val="left"/>
-            </w:pPr>
-            <w:r>
-              <w:t xml:space="preserve">Group work + ratio wall + report-back</w:t>
-            </w:r>
-          </w:p>
-        </w:tc>
-        <w:tc>
-          <w:tcPr/>
-          <w:p>
-            <w:pPr>
-              <w:pStyle w:val="Compact"/>
-              <w:jc w:val="left"/>
-            </w:pPr>
-            <w:r>
-              <w:t xml:space="preserve">Scenario cards (pack page 2, two sets) and a recording sheet per group (page 3); the ratio wall</w:t>
-            </w:r>
-          </w:p>
-        </w:tc>
-        <w:tc>
-          <w:tcPr/>
-          <w:p>
-            <w:pPr>
-              <w:pStyle w:val="Compact"/>
-              <w:jc w:val="left"/>
-            </w:pPr>
-            <w:r>
-              <w:t xml:space="preserve">Revised 6 Oct: a ratio wall. Each group takes a card (old habits, hidden costs, the finance ministry’s 8%, a shorter life, both 1 and 2; with 8 groups, cards 1 to 3 appear twice), predicts the ratio and posts the prediction on a sticky note on the ratio wall, an A1 poster (Oct14_session1_board_A1.pdf: a line from 0 to 2.0, break-even at 1.0 in red, the headline at 1.87). The group calls its settings, the trainer runs them on the four-slider calculator, and the group puts its card at the real ratio. Debrief from the wall: how far off were the predictions, and why does only card 5 land below break-even? The recording sheet now has a row for the prediction. Ratios and setup are in the facilitator key.</w:t>
-            </w:r>
-          </w:p>
-        </w:tc>
-        <w:tc>
-          <w:tcPr/>
-          <w:p>
-            <w:pPr>
-              <w:pStyle w:val="Compact"/>
-              <w:jc w:val="left"/>
-            </w:pPr>
-            <w:r>
-              <w:t xml:space="preserve">Print and cut: scenario cards (pack page 2), 2 sets; hand out cards 1 to 5, then 1 to 3 again, so each of the 8 groups holds one. Print: recording sheet (pack page 3), 1 per group (8). Print at A1: Oct14_session1_board_A1.pdf, the ratio wall (1 copy; preview at the end of the pack). Bring: 8 sticky notes and 8 markers, masking tape.</w:t>
-            </w:r>
-          </w:p>
-        </w:tc>
-        <w:tc>
-          <w:tcPr/>
-          <w:p>
-            <w:pPr>
-              <w:pStyle w:val="Compact"/>
-              <w:jc w:val="left"/>
-            </w:pPr>
-            <w:r>
-              <w:t xml:space="preserve">Built: print and cut, including the A1 board</w:t>
-            </w:r>
-          </w:p>
-        </w:tc>
-      </w:tr>
-      <w:tr>
-        <w:tc>
-          <w:tcPr/>
-          <w:p>
-            <w:pPr>
-              <w:pStyle w:val="Compact"/>
-              <w:jc w:val="left"/>
-            </w:pPr>
-            <w:r>
-              <w:t xml:space="preserve">AI Snapshot: find the scenario that breaks it</w:t>
-            </w:r>
-          </w:p>
-        </w:tc>
-        <w:tc>
-          <w:tcPr/>
-          <w:p>
-            <w:pPr>
-              <w:pStyle w:val="Compact"/>
-              <w:jc w:val="left"/>
-            </w:pPr>
-            <w:r>
-              <w:t xml:space="preserve">~1:10 · Section 4</w:t>
-            </w:r>
-          </w:p>
-        </w:tc>
-        <w:tc>
-          <w:tcPr/>
-          <w:p>
-            <w:pPr>
-              <w:pStyle w:val="Compact"/>
-              <w:jc w:val="left"/>
-            </w:pPr>
-            <w:r>
-              <w:t xml:space="preserve">Group hands-on + AI</w:t>
-            </w:r>
-          </w:p>
-        </w:tc>
-        <w:tc>
-          <w:tcPr/>
-          <w:p>
-            <w:pPr>
-              <w:pStyle w:val="Compact"/>
-              <w:jc w:val="left"/>
-            </w:pPr>
-            <w:r>
-              <w:t xml:space="preserve">Cost-benefit table with the two prompts (pack page 1); AI device</w:t>
-            </w:r>
-          </w:p>
-        </w:tc>
-        <w:tc>
-          <w:tcPr/>
-          <w:p>
-            <w:pPr>
-              <w:pStyle w:val="Compact"/>
-              <w:jc w:val="left"/>
-            </w:pPr>
-            <w:r>
-              <w:t xml:space="preserve">Groups paste the table with prompt 1, mark up the answer (easiest lever, no number, unsourced authority), then run prompt 2 and compare.</w:t>
-            </w:r>
-          </w:p>
-        </w:tc>
-        <w:tc>
-          <w:tcPr/>
-          <w:p>
-            <w:pPr>
-              <w:pStyle w:val="Compact"/>
-              <w:jc w:val="left"/>
-            </w:pPr>
-            <w:r>
-              <w:t xml:space="preserve">Print: pack page 1, 1 per group (8). Bring: one device with an AI tool per group.</w:t>
-            </w:r>
-          </w:p>
-        </w:tc>
-        <w:tc>
-          <w:tcPr/>
-          <w:p>
-            <w:pPr>
-              <w:pStyle w:val="Compact"/>
-              <w:jc w:val="left"/>
-            </w:pPr>
-            <w:r>
-              <w:t xml:space="preserve">Built: print</w:t>
-            </w:r>
-          </w:p>
-        </w:tc>
-      </w:tr>
-      <w:tr>
-        <w:tc>
-          <w:tcPr/>
-          <w:p>
-            <w:pPr>
-              <w:pStyle w:val="Compact"/>
-              <w:jc w:val="left"/>
-            </w:pPr>
-            <w:r>
-              <w:t xml:space="preserve">Take-away card</w:t>
-            </w:r>
-          </w:p>
-        </w:tc>
-        <w:tc>
-          <w:tcPr/>
-          <w:p>
-            <w:pPr>
-              <w:pStyle w:val="Compact"/>
-              <w:jc w:val="left"/>
-            </w:pPr>
-            <w:r>
-              <w:t xml:space="preserve">~1:28 · Close</w:t>
-            </w:r>
-          </w:p>
-        </w:tc>
-        <w:tc>
-          <w:tcPr/>
-          <w:p>
-            <w:pPr>
-              <w:pStyle w:val="Compact"/>
-              <w:jc w:val="left"/>
-            </w:pPr>
-            <w:r>
-              <w:t xml:space="preserve">Handout</w:t>
-            </w:r>
-          </w:p>
-        </w:tc>
-        <w:tc>
-          <w:tcPr/>
-          <w:p>
-            <w:pPr>
-              <w:pStyle w:val="Compact"/>
-              <w:jc w:val="left"/>
-            </w:pPr>
-            <w:r>
-              <w:t xml:space="preserve">Pocket cards, 1 per participant</w:t>
-            </w:r>
-          </w:p>
-        </w:tc>
-        <w:tc>
-          <w:tcPr/>
-          <w:p>
-            <w:pPr>
-              <w:pStyle w:val="Compact"/>
-              <w:jc w:val="left"/>
-            </w:pPr>
-            <w:r>
-              <w:t xml:space="preserve">The three questions for any ratio, and the sentence to take to a meeting.</w:t>
-            </w:r>
-          </w:p>
-        </w:tc>
-        <w:tc>
-          <w:tcPr/>
-          <w:p>
-            <w:pPr>
-              <w:pStyle w:val="Compact"/>
-              <w:jc w:val="left"/>
-            </w:pPr>
-            <w:r>
-              <w:t xml:space="preserve">Print and cut: take-away cards, 1 per participant (40).</w:t>
-            </w:r>
-          </w:p>
-        </w:tc>
-        <w:tc>
-          <w:tcPr/>
-          <w:p>
-            <w:pPr>
-              <w:pStyle w:val="Compact"/>
-              <w:jc w:val="left"/>
-            </w:pPr>
-            <w:r>
-              <w:t xml:space="preserve">Built: print and cut</w:t>
+              <w:t>Decision, AI repair and close</w:t>
+            </w:r>
+          </w:p>
+        </w:tc>
+        <w:tc>
+          <w:tcPr/>
+          <w:p>
+            <w:pPr>
+              <w:pStyle w:val="Compact"/>
+              <w:jc w:val="left"/>
+            </w:pPr>
+            <w:r>
+              <w:t>44-60 min</w:t>
+            </w:r>
+          </w:p>
+        </w:tc>
+        <w:tc>
+          <w:tcPr/>
+          <w:p>
+            <w:pPr>
+              <w:pStyle w:val="Compact"/>
+              <w:jc w:val="left"/>
+            </w:pPr>
+            <w:r>
+              <w:t>Individual then pairs</w:t>
+            </w:r>
+          </w:p>
+        </w:tc>
+        <w:tc>
+          <w:tcPr/>
+          <w:p>
+            <w:pPr>
+              <w:pStyle w:val="Compact"/>
+              <w:jc w:val="left"/>
+            </w:pPr>
+            <w:r>
+              <w:t>Participant sheet 2</w:t>
+            </w:r>
+          </w:p>
+        </w:tc>
+        <w:tc>
+          <w:tcPr/>
+          <w:p>
+            <w:pPr>
+              <w:pStyle w:val="Compact"/>
+              <w:jc w:val="left"/>
+            </w:pPr>
+            <w:r>
+              <w:t>Question the assumptions; independent evidence request</w:t>
+            </w:r>
+          </w:p>
+        </w:tc>
+        <w:tc>
+          <w:tcPr/>
+          <w:p>
+            <w:pPr>
+              <w:pStyle w:val="Compact"/>
+              <w:jc w:val="left"/>
+            </w:pPr>
+            <w:r>
+              <w:t>Trainer pages 8-9 contain results and delivery key</w:t>
+            </w:r>
+          </w:p>
+        </w:tc>
+        <w:tc>
+          <w:tcPr/>
+          <w:p>
+            <w:pPr>
+              <w:pStyle w:val="Compact"/>
+              <w:jc w:val="left"/>
+            </w:pPr>
+            <w:r>
+              <w:t>Built</w:t>
             </w:r>
           </w:p>
         </w:tc>
@@ -4060,7 +3852,7 @@
         <w:pStyle w:val="Heading2"/>
       </w:pPr>
       <w:r>
-        <w:t xml:space="preserve">Oct 14, Session 2: What Can You Read? What Might Be Wrong? (Data Visualisation)</w:t>
+        <w:t>Oct 14, Session 2: Read a chart before trusting its story (60 minutes)</w:t>
       </w:r>
     </w:p>
     <w:p>
@@ -4068,25 +3860,7 @@
         <w:pStyle w:val="FirstParagraph"/>
       </w:pPr>
       <w:r>
-        <w:t xml:space="preserve">Discussion-heavy; no live Menti poll in this session. Built on figures drawn from the three datasets the week has already used, and three</w:t>
-      </w:r>
-      <w:r>
-        <w:t xml:space="preserve"> </w:t>
-      </w:r>
-      <w:r>
-        <w:t xml:space="preserve">“</w:t>
-      </w:r>
-      <w:r>
-        <w:t xml:space="preserve">Try it</w:t>
-      </w:r>
-      <w:r>
-        <w:t xml:space="preserve">”</w:t>
-      </w:r>
-      <w:r>
-        <w:t xml:space="preserve"> </w:t>
-      </w:r>
-      <w:r>
-        <w:t xml:space="preserve">slides run R live. Print materials are in Oct14_session2_materials.docx, generated by make_session_materials.R from the same data as the deck; each item opens with a print line (copies, cut or not) and the last page is the facilitator key. Participant copies, without the key, are on the course website.</w:t>
+        <w:t>Approved 6 October 2026. GreenWaste only, fictional figures. Participant pages 1 and 2 are printed double-sided, one per person. The remaining trainer pages contain activities and keys, with page ranges stated in each pack. One trainer demonstration per session; no participant coding. Native deck controls and optional course room voting replace Menti. Use native axes and distribution reveals.</w:t>
       </w:r>
     </w:p>
     <w:tbl>
@@ -4203,115 +3977,79 @@
               <w:jc w:val="left"/>
             </w:pPr>
             <w:r>
-              <w:t xml:space="preserve">“</w:t>
-            </w:r>
-            <w:r>
-              <w:t xml:space="preserve">Which figure would you put in a briefing?</w:t>
-            </w:r>
-            <w:r>
-              <w:t xml:space="preserve">”</w:t>
-            </w:r>
-          </w:p>
-        </w:tc>
-        <w:tc>
-          <w:tcPr/>
-          <w:p>
-            <w:pPr>
-              <w:pStyle w:val="Compact"/>
-              <w:jc w:val="left"/>
-            </w:pPr>
-            <w:r>
-              <w:t xml:space="preserve">~0:12 · Section 1,</w:t>
-            </w:r>
-            <w:r>
-              <w:t xml:space="preserve"> </w:t>
-            </w:r>
-            <w:r>
-              <w:t xml:space="preserve">“</w:t>
-            </w:r>
-            <w:r>
-              <w:t xml:space="preserve">The same gap, drawn to fill the frame</w:t>
-            </w:r>
-            <w:r>
-              <w:t xml:space="preserve">”</w:t>
-            </w:r>
-          </w:p>
-        </w:tc>
-        <w:tc>
-          <w:tcPr/>
-          <w:p>
-            <w:pPr>
-              <w:pStyle w:val="Compact"/>
-              <w:jc w:val="left"/>
-            </w:pPr>
-            <w:r>
-              <w:t xml:space="preserve">Think-pair-share (no tech)</w:t>
-            </w:r>
-          </w:p>
-        </w:tc>
-        <w:tc>
-          <w:tcPr/>
-          <w:p>
-            <w:pPr>
-              <w:pStyle w:val="Compact"/>
-              <w:jc w:val="left"/>
-            </w:pPr>
-            <w:r>
-              <w:t xml:space="preserve">None (optional flipchart)</w:t>
-            </w:r>
-          </w:p>
-        </w:tc>
-        <w:tc>
-          <w:tcPr/>
-          <w:p>
-            <w:pPr>
-              <w:pStyle w:val="Compact"/>
-              <w:jc w:val="left"/>
-            </w:pPr>
-            <w:r>
-              <w:t xml:space="preserve">The same GreenWaste gap is shown twice, once on a zero axis and once truncated to fill the frame. In groups, two minutes: which figure would you put in a briefing, and why? Sets up the</w:t>
-            </w:r>
-            <w:r>
-              <w:t xml:space="preserve"> </w:t>
-            </w:r>
-            <w:r>
-              <w:t xml:space="preserve">“</w:t>
-            </w:r>
-            <w:r>
-              <w:t xml:space="preserve">read the axis first</w:t>
-            </w:r>
-            <w:r>
-              <w:t xml:space="preserve">”</w:t>
-            </w:r>
-            <w:r>
-              <w:t xml:space="preserve"> </w:t>
-            </w:r>
-            <w:r>
-              <w:t xml:space="preserve">rule. No build.</w:t>
-            </w:r>
-          </w:p>
-        </w:tc>
-        <w:tc>
-          <w:tcPr/>
-          <w:p>
-            <w:pPr>
-              <w:pStyle w:val="Compact"/>
-              <w:jc w:val="left"/>
-            </w:pPr>
-            <w:r>
-              <w:t xml:space="preserve">Nothing to print. Optional: flipchart and markers.</w:t>
-            </w:r>
-          </w:p>
-        </w:tc>
-        <w:tc>
-          <w:tcPr/>
-          <w:p>
-            <w:pPr>
-              <w:pStyle w:val="Compact"/>
-              <w:jc w:val="left"/>
-            </w:pPr>
-            <w:r>
-              <w:t xml:space="preserve">In slides</w:t>
+              <w:t>Read chart labels and axes</w:t>
+            </w:r>
+          </w:p>
+        </w:tc>
+        <w:tc>
+          <w:tcPr/>
+          <w:p>
+            <w:pPr>
+              <w:pStyle w:val="Compact"/>
+              <w:jc w:val="left"/>
+            </w:pPr>
+            <w:r>
+              <w:t>0-10 min</w:t>
+            </w:r>
+          </w:p>
+        </w:tc>
+        <w:tc>
+          <w:tcPr/>
+          <w:p>
+            <w:pPr>
+              <w:pStyle w:val="Compact"/>
+              <w:jc w:val="left"/>
+            </w:pPr>
+            <w:r>
+              <w:t>Individual then pairs</w:t>
+            </w:r>
+          </w:p>
+        </w:tc>
+        <w:tc>
+          <w:tcPr/>
+          <w:p>
+            <w:pPr>
+              <w:pStyle w:val="Compact"/>
+              <w:jc w:val="left"/>
+            </w:pPr>
+            <w:r>
+              <w:t>Native axis toggle</w:t>
+            </w:r>
+          </w:p>
+        </w:tc>
+        <w:tc>
+          <w:tcPr/>
+          <w:p>
+            <w:pPr>
+              <w:pStyle w:val="Compact"/>
+              <w:jc w:val="left"/>
+            </w:pPr>
+            <w:r>
+              <w:t>Same values, different bar baseline</w:t>
+            </w:r>
+          </w:p>
+        </w:tc>
+        <w:tc>
+          <w:tcPr/>
+          <w:p>
+            <w:pPr>
+              <w:pStyle w:val="Compact"/>
+              <w:jc w:val="left"/>
+            </w:pPr>
+            <w:r>
+              <w:t>Participant pages 1-2, double-sided per person</w:t>
+            </w:r>
+          </w:p>
+        </w:tc>
+        <w:tc>
+          <w:tcPr/>
+          <w:p>
+            <w:pPr>
+              <w:pStyle w:val="Compact"/>
+              <w:jc w:val="left"/>
+            </w:pPr>
+            <w:r>
+              <w:t>Built</w:t>
             </w:r>
           </w:p>
         </w:tc>
@@ -4325,79 +4063,79 @@
               <w:jc w:val="left"/>
             </w:pPr>
             <w:r>
-              <w:t xml:space="preserve">Six pairs tracker</w:t>
-            </w:r>
-          </w:p>
-        </w:tc>
-        <w:tc>
-          <w:tcPr/>
-          <w:p>
-            <w:pPr>
-              <w:pStyle w:val="Compact"/>
-              <w:jc w:val="left"/>
-            </w:pPr>
-            <w:r>
-              <w:t xml:space="preserve">Throughout</w:t>
-            </w:r>
-          </w:p>
-        </w:tc>
-        <w:tc>
-          <w:tcPr/>
-          <w:p>
-            <w:pPr>
-              <w:pStyle w:val="Compact"/>
-              <w:jc w:val="left"/>
-            </w:pPr>
-            <w:r>
-              <w:t xml:space="preserve">Individual record sheet</w:t>
-            </w:r>
-          </w:p>
-        </w:tc>
-        <w:tc>
-          <w:tcPr/>
-          <w:p>
-            <w:pPr>
-              <w:pStyle w:val="Compact"/>
-              <w:jc w:val="left"/>
-            </w:pPr>
-            <w:r>
-              <w:t xml:space="preserve">Tracker (pack page 1), 1 per participant</w:t>
-            </w:r>
-          </w:p>
-        </w:tc>
-        <w:tc>
-          <w:tcPr/>
-          <w:p>
-            <w:pPr>
-              <w:pStyle w:val="Compact"/>
-              <w:jc w:val="left"/>
-            </w:pPr>
-            <w:r>
-              <w:t xml:space="preserve">One row per pair of figures, with the slide’s two questions (what is it telling you, what might be wrong or misleading), and three predictions to write down before the reveals. Print only.</w:t>
-            </w:r>
-          </w:p>
-        </w:tc>
-        <w:tc>
-          <w:tcPr/>
-          <w:p>
-            <w:pPr>
-              <w:pStyle w:val="Compact"/>
-              <w:jc w:val="left"/>
-            </w:pPr>
-            <w:r>
-              <w:t xml:space="preserve">Print: pack page 1, 1 per participant (40).</w:t>
-            </w:r>
-          </w:p>
-        </w:tc>
-        <w:tc>
-          <w:tcPr/>
-          <w:p>
-            <w:pPr>
-              <w:pStyle w:val="Compact"/>
-              <w:jc w:val="left"/>
-            </w:pPr>
-            <w:r>
-              <w:t xml:space="preserve">Built: print</w:t>
+              <w:t>Mark and inspect average</w:t>
+            </w:r>
+          </w:p>
+        </w:tc>
+        <w:tc>
+          <w:tcPr/>
+          <w:p>
+            <w:pPr>
+              <w:pStyle w:val="Compact"/>
+              <w:jc w:val="left"/>
+            </w:pPr>
+            <w:r>
+              <w:t>10-23 min</w:t>
+            </w:r>
+          </w:p>
+        </w:tc>
+        <w:tc>
+          <w:tcPr/>
+          <w:p>
+            <w:pPr>
+              <w:pStyle w:val="Compact"/>
+              <w:jc w:val="left"/>
+            </w:pPr>
+            <w:r>
+              <w:t>Individual then pairs</w:t>
+            </w:r>
+          </w:p>
+        </w:tc>
+        <w:tc>
+          <w:tcPr/>
+          <w:p>
+            <w:pPr>
+              <w:pStyle w:val="Compact"/>
+              <w:jc w:val="left"/>
+            </w:pPr>
+            <w:r>
+              <w:t>Printed chart and distribution reveal</w:t>
+            </w:r>
+          </w:p>
+        </w:tc>
+        <w:tc>
+          <w:tcPr/>
+          <w:p>
+            <w:pPr>
+              <w:pStyle w:val="Compact"/>
+              <w:jc w:val="left"/>
+            </w:pPr>
+            <w:r>
+              <w:t>Units, source, comparison; average can hide spread</w:t>
+            </w:r>
+          </w:p>
+        </w:tc>
+        <w:tc>
+          <w:tcPr/>
+          <w:p>
+            <w:pPr>
+              <w:pStyle w:val="Compact"/>
+              <w:jc w:val="left"/>
+            </w:pPr>
+            <w:r>
+              <w:t>No extra print</w:t>
+            </w:r>
+          </w:p>
+        </w:tc>
+        <w:tc>
+          <w:tcPr/>
+          <w:p>
+            <w:pPr>
+              <w:pStyle w:val="Compact"/>
+              <w:jc w:val="left"/>
+            </w:pPr>
+            <w:r>
+              <w:t>Built</w:t>
             </w:r>
           </w:p>
         </w:tc>
@@ -4411,103 +4149,79 @@
               <w:jc w:val="left"/>
             </w:pPr>
             <w:r>
-              <w:t xml:space="preserve">Pie chart:</w:t>
-            </w:r>
-            <w:r>
-              <w:t xml:space="preserve"> </w:t>
-            </w:r>
-            <w:r>
-              <w:t xml:space="preserve">“</w:t>
-            </w:r>
-            <w:r>
-              <w:t xml:space="preserve">what is it not telling you?</w:t>
-            </w:r>
-            <w:r>
-              <w:t xml:space="preserve">”</w:t>
-            </w:r>
-          </w:p>
-        </w:tc>
-        <w:tc>
-          <w:tcPr/>
-          <w:p>
-            <w:pPr>
-              <w:pStyle w:val="Compact"/>
-              <w:jc w:val="left"/>
-            </w:pPr>
-            <w:r>
-              <w:t xml:space="preserve">~0:44 · Section 6,</w:t>
-            </w:r>
-            <w:r>
-              <w:t xml:space="preserve"> </w:t>
-            </w:r>
-            <w:r>
-              <w:t xml:space="preserve">“</w:t>
-            </w:r>
-            <w:r>
-              <w:t xml:space="preserve">What is this pie not telling you?</w:t>
-            </w:r>
-            <w:r>
-              <w:t xml:space="preserve">”</w:t>
-            </w:r>
-          </w:p>
-        </w:tc>
-        <w:tc>
-          <w:tcPr/>
-          <w:p>
-            <w:pPr>
-              <w:pStyle w:val="Compact"/>
-              <w:jc w:val="left"/>
-            </w:pPr>
-            <w:r>
-              <w:t xml:space="preserve">Think-pair-share (no tech)</w:t>
-            </w:r>
-          </w:p>
-        </w:tc>
-        <w:tc>
-          <w:tcPr/>
-          <w:p>
-            <w:pPr>
-              <w:pStyle w:val="Compact"/>
-              <w:jc w:val="left"/>
-            </w:pPr>
-            <w:r>
-              <w:t xml:space="preserve">The pie row on the six pairs tracker</w:t>
-            </w:r>
-          </w:p>
-        </w:tc>
-        <w:tc>
-          <w:tcPr/>
-          <w:p>
-            <w:pPr>
-              <w:pStyle w:val="Compact"/>
-              <w:jc w:val="left"/>
-            </w:pPr>
-            <w:r>
-              <w:t xml:space="preserve">A real severity-mix pie from the dataset. In groups, three minutes: two things the pie tells you and two it does not. Answers go in the pie row of the tracker.</w:t>
-            </w:r>
-          </w:p>
-        </w:tc>
-        <w:tc>
-          <w:tcPr/>
-          <w:p>
-            <w:pPr>
-              <w:pStyle w:val="Compact"/>
-              <w:jc w:val="left"/>
-            </w:pPr>
-            <w:r>
-              <w:t xml:space="preserve">Nothing to print (it uses the tracker).</w:t>
-            </w:r>
-          </w:p>
-        </w:tc>
-        <w:tc>
-          <w:tcPr/>
-          <w:p>
-            <w:pPr>
-              <w:pStyle w:val="Compact"/>
-              <w:jc w:val="left"/>
-            </w:pPr>
-            <w:r>
-              <w:t xml:space="preserve">In slides; on the tracker</w:t>
+              <w:t>Denominator and interval</w:t>
+            </w:r>
+          </w:p>
+        </w:tc>
+        <w:tc>
+          <w:tcPr/>
+          <w:p>
+            <w:pPr>
+              <w:pStyle w:val="Compact"/>
+              <w:jc w:val="left"/>
+            </w:pPr>
+            <w:r>
+              <w:t>23-36 min</w:t>
+            </w:r>
+          </w:p>
+        </w:tc>
+        <w:tc>
+          <w:tcPr/>
+          <w:p>
+            <w:pPr>
+              <w:pStyle w:val="Compact"/>
+              <w:jc w:val="left"/>
+            </w:pPr>
+            <w:r>
+              <w:t>Trainer and pairs</w:t>
+            </w:r>
+          </w:p>
+        </w:tc>
+        <w:tc>
+          <w:tcPr/>
+          <w:p>
+            <w:pPr>
+              <w:pStyle w:val="Compact"/>
+              <w:jc w:val="left"/>
+            </w:pPr>
+            <w:r>
+              <w:t>Deck; worksheet</w:t>
+            </w:r>
+          </w:p>
+        </w:tc>
+        <w:tc>
+          <w:tcPr/>
+          <w:p>
+            <w:pPr>
+              <w:pStyle w:val="Compact"/>
+              <w:jc w:val="left"/>
+            </w:pPr>
+            <w:r>
+              <w:t>One total-tonnes calculation; pilot interval reveal</w:t>
+            </w:r>
+          </w:p>
+        </w:tc>
+        <w:tc>
+          <w:tcPr/>
+          <w:p>
+            <w:pPr>
+              <w:pStyle w:val="Compact"/>
+              <w:jc w:val="left"/>
+            </w:pPr>
+            <w:r>
+              <w:t>Trainer page 3 contains key</w:t>
+            </w:r>
+          </w:p>
+        </w:tc>
+        <w:tc>
+          <w:tcPr/>
+          <w:p>
+            <w:pPr>
+              <w:pStyle w:val="Compact"/>
+              <w:jc w:val="left"/>
+            </w:pPr>
+            <w:r>
+              <w:t>Built</w:t>
             </w:r>
           </w:p>
         </w:tc>
@@ -4521,121 +4235,79 @@
               <w:jc w:val="left"/>
             </w:pPr>
             <w:r>
-              <w:t xml:space="preserve">AI Snapshot:</w:t>
-            </w:r>
-            <w:r>
-              <w:t xml:space="preserve"> </w:t>
-            </w:r>
-            <w:r>
-              <w:t xml:space="preserve">“</w:t>
-            </w:r>
-            <w:r>
-              <w:t xml:space="preserve">the chart that cannot be wrong</w:t>
-            </w:r>
-            <w:r>
-              <w:t xml:space="preserve">”</w:t>
-            </w:r>
-          </w:p>
-        </w:tc>
-        <w:tc>
-          <w:tcPr/>
-          <w:p>
-            <w:pPr>
-              <w:pStyle w:val="Compact"/>
-              <w:jc w:val="left"/>
-            </w:pPr>
-            <w:r>
-              <w:t xml:space="preserve">~1:05 · Section 7,</w:t>
-            </w:r>
-            <w:r>
-              <w:t xml:space="preserve"> </w:t>
-            </w:r>
-            <w:r>
-              <w:t xml:space="preserve">“</w:t>
-            </w:r>
-            <w:r>
-              <w:t xml:space="preserve">AI Snapshot</w:t>
-            </w:r>
-            <w:r>
-              <w:t xml:space="preserve">”</w:t>
-            </w:r>
-          </w:p>
-        </w:tc>
-        <w:tc>
-          <w:tcPr/>
-          <w:p>
-            <w:pPr>
-              <w:pStyle w:val="Compact"/>
-              <w:jc w:val="left"/>
-            </w:pPr>
-            <w:r>
-              <w:t xml:space="preserve">Group work + AI</w:t>
-            </w:r>
-          </w:p>
-        </w:tc>
-        <w:tc>
-          <w:tcPr/>
-          <w:p>
-            <w:pPr>
-              <w:pStyle w:val="Compact"/>
-              <w:jc w:val="left"/>
-            </w:pPr>
-            <w:r>
-              <w:t xml:space="preserve">AI handout with both baseline figures (pack page 2), 1 per group; a device with AI access per group</w:t>
-            </w:r>
-          </w:p>
-        </w:tc>
-        <w:tc>
-          <w:tcPr/>
-          <w:p>
-            <w:pPr>
-              <w:pStyle w:val="Compact"/>
-              <w:jc w:val="left"/>
-            </w:pPr>
-            <w:r>
-              <w:t xml:space="preserve">Groups give the model both baseline figures with the prompt</w:t>
-            </w:r>
-            <w:r>
-              <w:t xml:space="preserve"> </w:t>
-            </w:r>
-            <w:r>
-              <w:t xml:space="preserve">“</w:t>
-            </w:r>
-            <w:r>
-              <w:t xml:space="preserve">Which of these two charts better represents the difference between the two groups, and why?</w:t>
-            </w:r>
-            <w:r>
-              <w:t xml:space="preserve">”</w:t>
-            </w:r>
-            <w:r>
-              <w:t xml:space="preserve"> </w:t>
-            </w:r>
-            <w:r>
-              <w:t xml:space="preserve">and judge the answer. The planted failure: true statements about the charts, and no question about who reads the figure or what sentence sits beside it. Then the better prompt from the handout, and a fresh-chat check. Print only.</w:t>
-            </w:r>
-          </w:p>
-        </w:tc>
-        <w:tc>
-          <w:tcPr/>
-          <w:p>
-            <w:pPr>
-              <w:pStyle w:val="Compact"/>
-              <w:jc w:val="left"/>
-            </w:pPr>
-            <w:r>
-              <w:t xml:space="preserve">Print: AI handout (pack page 2), 1 per group (8), in colour if possible (it carries two charts). Bring: one device with an AI tool per group.</w:t>
-            </w:r>
-          </w:p>
-        </w:tc>
-        <w:tc>
-          <w:tcPr/>
-          <w:p>
-            <w:pPr>
-              <w:pStyle w:val="Compact"/>
-              <w:jc w:val="left"/>
-            </w:pPr>
-            <w:r>
-              <w:t xml:space="preserve">Built: print</w:t>
+              <w:t>Caption repair and defence</w:t>
+            </w:r>
+          </w:p>
+        </w:tc>
+        <w:tc>
+          <w:tcPr/>
+          <w:p>
+            <w:pPr>
+              <w:pStyle w:val="Compact"/>
+              <w:jc w:val="left"/>
+            </w:pPr>
+            <w:r>
+              <w:t>36-56 min</w:t>
+            </w:r>
+          </w:p>
+        </w:tc>
+        <w:tc>
+          <w:tcPr/>
+          <w:p>
+            <w:pPr>
+              <w:pStyle w:val="Compact"/>
+              <w:jc w:val="left"/>
+            </w:pPr>
+            <w:r>
+              <w:t>Pairs</w:t>
+            </w:r>
+          </w:p>
+        </w:tc>
+        <w:tc>
+          <w:tcPr/>
+          <w:p>
+            <w:pPr>
+              <w:pStyle w:val="Compact"/>
+              <w:jc w:val="left"/>
+            </w:pPr>
+            <w:r>
+              <w:t>Participant sheet 2</w:t>
+            </w:r>
+          </w:p>
+        </w:tc>
+        <w:tc>
+          <w:tcPr/>
+          <w:p>
+            <w:pPr>
+              <w:pStyle w:val="Compact"/>
+              <w:jc w:val="left"/>
+            </w:pPr>
+            <w:r>
+              <w:t>Supported description and causal limit; repair AI draft</w:t>
+            </w:r>
+          </w:p>
+        </w:tc>
+        <w:tc>
+          <w:tcPr/>
+          <w:p>
+            <w:pPr>
+              <w:pStyle w:val="Compact"/>
+              <w:jc w:val="left"/>
+            </w:pPr>
+            <w:r>
+              <w:t>No drawing software or AI account</w:t>
+            </w:r>
+          </w:p>
+        </w:tc>
+        <w:tc>
+          <w:tcPr/>
+          <w:p>
+            <w:pPr>
+              <w:pStyle w:val="Compact"/>
+              <w:jc w:val="left"/>
+            </w:pPr>
+            <w:r>
+              <w:t>Built</w:t>
             </w:r>
           </w:p>
         </w:tc>
@@ -4649,79 +4321,79 @@
               <w:jc w:val="left"/>
             </w:pPr>
             <w:r>
-              <w:t xml:space="preserve">Closing: start compiling QA-clinic questions</w:t>
-            </w:r>
-          </w:p>
-        </w:tc>
-        <w:tc>
-          <w:tcPr/>
-          <w:p>
-            <w:pPr>
-              <w:pStyle w:val="Compact"/>
-              <w:jc w:val="left"/>
-            </w:pPr>
-            <w:r>
-              <w:t xml:space="preserve">~1:25 · Section 8, closing slide</w:t>
-            </w:r>
-          </w:p>
-        </w:tc>
-        <w:tc>
-          <w:tcPr/>
-          <w:p>
-            <w:pPr>
-              <w:pStyle w:val="Compact"/>
-              <w:jc w:val="left"/>
-            </w:pPr>
-            <w:r>
-              <w:t xml:space="preserve">Individual prompt (no tech)</w:t>
-            </w:r>
-          </w:p>
-        </w:tc>
-        <w:tc>
-          <w:tcPr/>
-          <w:p>
-            <w:pPr>
-              <w:pStyle w:val="Compact"/>
-              <w:jc w:val="left"/>
-            </w:pPr>
-            <w:r>
-              <w:t xml:space="preserve">Take-away card (pack page 3), 1 per participant, cut</w:t>
-            </w:r>
-          </w:p>
-        </w:tc>
-        <w:tc>
-          <w:tcPr/>
-          <w:p>
-            <w:pPr>
-              <w:pStyle w:val="Compact"/>
-              <w:jc w:val="left"/>
-            </w:pPr>
-            <w:r>
-              <w:t xml:space="preserve">The five rules as a take-away card, with space for the questions participants will bring to tomorrow’s QA clinic (Oct 14 S3). Print only.</w:t>
-            </w:r>
-          </w:p>
-        </w:tc>
-        <w:tc>
-          <w:tcPr/>
-          <w:p>
-            <w:pPr>
-              <w:pStyle w:val="Compact"/>
-              <w:jc w:val="left"/>
-            </w:pPr>
-            <w:r>
-              <w:t xml:space="preserve">Print and cut: take-away cards, 1 per participant (40).</w:t>
-            </w:r>
-          </w:p>
-        </w:tc>
-        <w:tc>
-          <w:tcPr/>
-          <w:p>
-            <w:pPr>
-              <w:pStyle w:val="Compact"/>
-              <w:jc w:val="left"/>
-            </w:pPr>
-            <w:r>
-              <w:t xml:space="preserve">Built: print</w:t>
+              <w:t>Question from memory</w:t>
+            </w:r>
+          </w:p>
+        </w:tc>
+        <w:tc>
+          <w:tcPr/>
+          <w:p>
+            <w:pPr>
+              <w:pStyle w:val="Compact"/>
+              <w:jc w:val="left"/>
+            </w:pPr>
+            <w:r>
+              <w:t>56-60 min</w:t>
+            </w:r>
+          </w:p>
+        </w:tc>
+        <w:tc>
+          <w:tcPr/>
+          <w:p>
+            <w:pPr>
+              <w:pStyle w:val="Compact"/>
+              <w:jc w:val="left"/>
+            </w:pPr>
+            <w:r>
+              <w:t>Individual</w:t>
+            </w:r>
+          </w:p>
+        </w:tc>
+        <w:tc>
+          <w:tcPr/>
+          <w:p>
+            <w:pPr>
+              <w:pStyle w:val="Compact"/>
+              <w:jc w:val="left"/>
+            </w:pPr>
+            <w:r>
+              <w:t>Worksheet</w:t>
+            </w:r>
+          </w:p>
+        </w:tc>
+        <w:tc>
+          <w:tcPr/>
+          <w:p>
+            <w:pPr>
+              <w:pStyle w:val="Compact"/>
+              <w:jc w:val="left"/>
+            </w:pPr>
+            <w:r>
+              <w:t>Check and purpose, no AI</w:t>
+            </w:r>
+          </w:p>
+        </w:tc>
+        <w:tc>
+          <w:tcPr/>
+          <w:p>
+            <w:pPr>
+              <w:pStyle w:val="Compact"/>
+              <w:jc w:val="left"/>
+            </w:pPr>
+            <w:r>
+              <w:t>No extra print</w:t>
+            </w:r>
+          </w:p>
+        </w:tc>
+        <w:tc>
+          <w:tcPr/>
+          <w:p>
+            <w:pPr>
+              <w:pStyle w:val="Compact"/>
+              <w:jc w:val="left"/>
+            </w:pPr>
+            <w:r>
+              <w:t>Built</w:t>
             </w:r>
           </w:p>
         </w:tc>
@@ -4734,25 +4406,7 @@
         <w:pStyle w:val="Heading2"/>
       </w:pPr>
       <w:r>
-        <w:t xml:space="preserve">Oct 14, Session 3:</w:t>
-      </w:r>
-      <w:r>
-        <w:t xml:space="preserve"> </w:t>
-      </w:r>
-      <w:r>
-        <w:t xml:space="preserve">“</w:t>
-      </w:r>
-      <w:r>
-        <w:t xml:space="preserve">Interrogate the Analyst</w:t>
-      </w:r>
-      <w:r>
-        <w:t xml:space="preserve">”</w:t>
-      </w:r>
-      <w:r>
-        <w:t xml:space="preserve"> </w:t>
-      </w:r>
-      <w:r>
-        <w:t xml:space="preserve">(QA Clinic)</w:t>
+        <w:t>Oct 14, Session 3: Question the analyst (75 minutes)</w:t>
       </w:r>
     </w:p>
     <w:p>
@@ -4760,7 +4414,7 @@
         <w:pStyle w:val="FirstParagraph"/>
       </w:pPr>
       <w:r>
-        <w:t xml:space="preserve">Revised 25 Sep for the live deck (Oct14_session3_live.qmd): the trainer runs R in the browser and the room predicts each result before the Run button is pressed. Print materials are in Oct14_session3_materials.docx, generated by make_session_materials.R from the same data as the deck; each item opens with a print line (copies, cut or not) and the last page is the facilitator key. Polls are Menti placeholders for now; an in-slide poll is planned. The printed QA checklist is unchanged (Oct14_session3_qa_checklist.docx, from qa_checklist.R). New: section 4 of the deck, where the trainer, playing the analyst, answers the strongest questions by running the analysis live.</w:t>
+        <w:t>Approved 6 October 2026. GreenWaste only, fictional figures. Participant pages 1 and 2 are printed double-sided, one per person. The remaining trainer pages contain activities and keys, with page ranges stated in each pack. One trainer demonstration per session; no participant coding. Native deck controls and optional course room voting replace Menti. Use the fixed analyst answer bank; never invent missing fieldwork evidence.</w:t>
       </w:r>
     </w:p>
     <w:tbl>
@@ -4877,79 +4531,79 @@
               <w:jc w:val="left"/>
             </w:pPr>
             <w:r>
-              <w:t xml:space="preserve">Sign-off vote (opening and close)</w:t>
-            </w:r>
-          </w:p>
-        </w:tc>
-        <w:tc>
-          <w:tcPr/>
-          <w:p>
-            <w:pPr>
-              <w:pStyle w:val="Compact"/>
-              <w:jc w:val="left"/>
-            </w:pPr>
-            <w:r>
-              <w:t xml:space="preserve">~0:05 and ~1:50</w:t>
-            </w:r>
-          </w:p>
-        </w:tc>
-        <w:tc>
-          <w:tcPr/>
-          <w:p>
-            <w:pPr>
-              <w:pStyle w:val="Compact"/>
-              <w:jc w:val="left"/>
-            </w:pPr>
-            <w:r>
-              <w:t xml:space="preserve">Live poll, QR on slide</w:t>
-            </w:r>
-          </w:p>
-        </w:tc>
-        <w:tc>
-          <w:tcPr/>
-          <w:p>
-            <w:pPr>
-              <w:pStyle w:val="Compact"/>
-              <w:jc w:val="left"/>
-            </w:pPr>
-            <w:r>
-              <w:t xml:space="preserve">Menti (placeholder), one poll used twice</w:t>
-            </w:r>
-          </w:p>
-        </w:tc>
-        <w:tc>
-          <w:tcPr/>
-          <w:p>
-            <w:pPr>
-              <w:pStyle w:val="Compact"/>
-              <w:jc w:val="left"/>
-            </w:pPr>
-            <w:r>
-              <w:t xml:space="preserve">Would you sign off for national scale-up? Yes / No / Not without more answers.</w:t>
-            </w:r>
-          </w:p>
-        </w:tc>
-        <w:tc>
-          <w:tcPr/>
-          <w:p>
-            <w:pPr>
-              <w:pStyle w:val="Compact"/>
-              <w:jc w:val="left"/>
-            </w:pPr>
-            <w:r>
-              <w:t xml:space="preserve">Make: Menti poll (online). Nothing to print.</w:t>
-            </w:r>
-          </w:p>
-        </w:tc>
-        <w:tc>
-          <w:tcPr/>
-          <w:p>
-            <w:pPr>
-              <w:pStyle w:val="Compact"/>
-              <w:jc w:val="left"/>
-            </w:pPr>
-            <w:r>
-              <w:t xml:space="preserve">Poll to build</w:t>
+              <w:t>Note, evidence and questions</w:t>
+            </w:r>
+          </w:p>
+        </w:tc>
+        <w:tc>
+          <w:tcPr/>
+          <w:p>
+            <w:pPr>
+              <w:pStyle w:val="Compact"/>
+              <w:jc w:val="left"/>
+            </w:pPr>
+            <w:r>
+              <w:t>0-20 min</w:t>
+            </w:r>
+          </w:p>
+        </w:tc>
+        <w:tc>
+          <w:tcPr/>
+          <w:p>
+            <w:pPr>
+              <w:pStyle w:val="Compact"/>
+              <w:jc w:val="left"/>
+            </w:pPr>
+            <w:r>
+              <w:t>Individual then groups</w:t>
+            </w:r>
+          </w:p>
+        </w:tc>
+        <w:tc>
+          <w:tcPr/>
+          <w:p>
+            <w:pPr>
+              <w:pStyle w:val="Compact"/>
+              <w:jc w:val="left"/>
+            </w:pPr>
+            <w:r>
+              <w:t>Note; result table; five-question QA</w:t>
+            </w:r>
+          </w:p>
+        </w:tc>
+        <w:tc>
+          <w:tcPr/>
+          <w:p>
+            <w:pPr>
+              <w:pStyle w:val="Compact"/>
+              <w:jc w:val="left"/>
+            </w:pPr>
+            <w:r>
+              <w:t>Opening sign-off; request specific sources</w:t>
+            </w:r>
+          </w:p>
+        </w:tc>
+        <w:tc>
+          <w:tcPr/>
+          <w:p>
+            <w:pPr>
+              <w:pStyle w:val="Compact"/>
+              <w:jc w:val="left"/>
+            </w:pPr>
+            <w:r>
+              <w:t>Participant pages 1-2, double-sided; optional one-page QA reference</w:t>
+            </w:r>
+          </w:p>
+        </w:tc>
+        <w:tc>
+          <w:tcPr/>
+          <w:p>
+            <w:pPr>
+              <w:pStyle w:val="Compact"/>
+              <w:jc w:val="left"/>
+            </w:pPr>
+            <w:r>
+              <w:t>Built</w:t>
             </w:r>
           </w:p>
         </w:tc>
@@ -4963,79 +4617,79 @@
               <w:jc w:val="left"/>
             </w:pPr>
             <w:r>
-              <w:t xml:space="preserve">Sort strong from weak questions</w:t>
-            </w:r>
-          </w:p>
-        </w:tc>
-        <w:tc>
-          <w:tcPr/>
-          <w:p>
-            <w:pPr>
-              <w:pStyle w:val="Compact"/>
-              <w:jc w:val="left"/>
-            </w:pPr>
-            <w:r>
-              <w:t xml:space="preserve">~0:35 · Section 2</w:t>
-            </w:r>
-          </w:p>
-        </w:tc>
-        <w:tc>
-          <w:tcPr/>
-          <w:p>
-            <w:pPr>
-              <w:pStyle w:val="Compact"/>
-              <w:jc w:val="left"/>
-            </w:pPr>
-            <w:r>
-              <w:t xml:space="preserve">Group card sort</w:t>
-            </w:r>
-          </w:p>
-        </w:tc>
-        <w:tc>
-          <w:tcPr/>
-          <w:p>
-            <w:pPr>
-              <w:pStyle w:val="Compact"/>
-              <w:jc w:val="left"/>
-            </w:pPr>
-            <w:r>
-              <w:t xml:space="preserve">8 slips per group (pack page 1)</w:t>
-            </w:r>
-          </w:p>
-        </w:tc>
-        <w:tc>
-          <w:tcPr/>
-          <w:p>
-            <w:pPr>
-              <w:pStyle w:val="Compact"/>
-              <w:jc w:val="left"/>
-            </w:pPr>
-            <w:r>
-              <w:t xml:space="preserve">Mark each S or W and sort; the reveal is on the next slide and in the key.</w:t>
-            </w:r>
-          </w:p>
-        </w:tc>
-        <w:tc>
-          <w:tcPr/>
-          <w:p>
-            <w:pPr>
-              <w:pStyle w:val="Compact"/>
-              <w:jc w:val="left"/>
-            </w:pPr>
-            <w:r>
-              <w:t xml:space="preserve">Print and cut: pack page 1, 1 set of 8 slips per group (8 sets).</w:t>
-            </w:r>
-          </w:p>
-        </w:tc>
-        <w:tc>
-          <w:tcPr/>
-          <w:p>
-            <w:pPr>
-              <w:pStyle w:val="Compact"/>
-              <w:jc w:val="left"/>
-            </w:pPr>
-            <w:r>
-              <w:t xml:space="preserve">Built: print and cut</w:t>
+              <w:t>Prepare and break</w:t>
+            </w:r>
+          </w:p>
+        </w:tc>
+        <w:tc>
+          <w:tcPr/>
+          <w:p>
+            <w:pPr>
+              <w:pStyle w:val="Compact"/>
+              <w:jc w:val="left"/>
+            </w:pPr>
+            <w:r>
+              <w:t>20-32 min</w:t>
+            </w:r>
+          </w:p>
+        </w:tc>
+        <w:tc>
+          <w:tcPr/>
+          <w:p>
+            <w:pPr>
+              <w:pStyle w:val="Compact"/>
+              <w:jc w:val="left"/>
+            </w:pPr>
+            <w:r>
+              <w:t>Groups then break</w:t>
+            </w:r>
+          </w:p>
+        </w:tc>
+        <w:tc>
+          <w:tcPr/>
+          <w:p>
+            <w:pPr>
+              <w:pStyle w:val="Compact"/>
+              <w:jc w:val="left"/>
+            </w:pPr>
+            <w:r>
+              <w:t>Worksheet</w:t>
+            </w:r>
+          </w:p>
+        </w:tc>
+        <w:tc>
+          <w:tcPr/>
+          <w:p>
+            <w:pPr>
+              <w:pStyle w:val="Compact"/>
+              <w:jc w:val="left"/>
+            </w:pPr>
+            <w:r>
+              <w:t>Rank questions; spokesperson; five-minute break</w:t>
+            </w:r>
+          </w:p>
+        </w:tc>
+        <w:tc>
+          <w:tcPr/>
+          <w:p>
+            <w:pPr>
+              <w:pStyle w:val="Compact"/>
+              <w:jc w:val="left"/>
+            </w:pPr>
+            <w:r>
+              <w:t>No extra print</w:t>
+            </w:r>
+          </w:p>
+        </w:tc>
+        <w:tc>
+          <w:tcPr/>
+          <w:p>
+            <w:pPr>
+              <w:pStyle w:val="Compact"/>
+              <w:jc w:val="left"/>
+            </w:pPr>
+            <w:r>
+              <w:t>Built</w:t>
             </w:r>
           </w:p>
         </w:tc>
@@ -5049,79 +4703,79 @@
               <w:jc w:val="left"/>
             </w:pPr>
             <w:r>
-              <w:t xml:space="preserve">The clinic</w:t>
-            </w:r>
-          </w:p>
-        </w:tc>
-        <w:tc>
-          <w:tcPr/>
-          <w:p>
-            <w:pPr>
-              <w:pStyle w:val="Compact"/>
-              <w:jc w:val="left"/>
-            </w:pPr>
-            <w:r>
-              <w:t xml:space="preserve">~0:50–1:30 · Sections 3–4</w:t>
-            </w:r>
-          </w:p>
-        </w:tc>
-        <w:tc>
-          <w:tcPr/>
-          <w:p>
-            <w:pPr>
-              <w:pStyle w:val="Compact"/>
-              <w:jc w:val="left"/>
-            </w:pPr>
-            <w:r>
-              <w:t xml:space="preserve">Group role-play</w:t>
-            </w:r>
-          </w:p>
-        </w:tc>
-        <w:tc>
-          <w:tcPr/>
-          <w:p>
-            <w:pPr>
-              <w:pStyle w:val="Compact"/>
-              <w:jc w:val="left"/>
-            </w:pPr>
-            <w:r>
-              <w:t xml:space="preserve">QA checklist (existing), clinic record sheet (pack page 2), 1 per group</w:t>
-            </w:r>
-          </w:p>
-        </w:tc>
-        <w:tc>
-          <w:tcPr/>
-          <w:p>
-            <w:pPr>
-              <w:pStyle w:val="Compact"/>
-              <w:jc w:val="left"/>
-            </w:pPr>
-            <w:r>
-              <w:t xml:space="preserve">Four groups, one area each, three sharpest questions. The trainer answers; for the prepared questions (estimate and interval, a single fragile choice, who each estimate covers, who is missing, parallel trends) the answer is run live. Groups record each answer as answered / admitted / deflected / unanswerable.</w:t>
-            </w:r>
-          </w:p>
-        </w:tc>
-        <w:tc>
-          <w:tcPr/>
-          <w:p>
-            <w:pPr>
-              <w:pStyle w:val="Compact"/>
-              <w:jc w:val="left"/>
-            </w:pPr>
-            <w:r>
-              <w:t xml:space="preserve">Print: QA checklist (Oct14_session3_qa_checklist.docx), 1 per participant (40); clinic record sheet (pack page 2), 1 per group (8). With 8 groups, two groups share each of the four areas.</w:t>
-            </w:r>
-          </w:p>
-        </w:tc>
-        <w:tc>
-          <w:tcPr/>
-          <w:p>
-            <w:pPr>
-              <w:pStyle w:val="Compact"/>
-              <w:jc w:val="left"/>
-            </w:pPr>
-            <w:r>
-              <w:t xml:space="preserve">Built: print</w:t>
+              <w:t>Analyst clinic</w:t>
+            </w:r>
+          </w:p>
+        </w:tc>
+        <w:tc>
+          <w:tcPr/>
+          <w:p>
+            <w:pPr>
+              <w:pStyle w:val="Compact"/>
+              <w:jc w:val="left"/>
+            </w:pPr>
+            <w:r>
+              <w:t>32-46 min</w:t>
+            </w:r>
+          </w:p>
+        </w:tc>
+        <w:tc>
+          <w:tcPr/>
+          <w:p>
+            <w:pPr>
+              <w:pStyle w:val="Compact"/>
+              <w:jc w:val="left"/>
+            </w:pPr>
+            <w:r>
+              <w:t>Eight groups</w:t>
+            </w:r>
+          </w:p>
+        </w:tc>
+        <w:tc>
+          <w:tcPr/>
+          <w:p>
+            <w:pPr>
+              <w:pStyle w:val="Compact"/>
+              <w:jc w:val="left"/>
+            </w:pPr>
+            <w:r>
+              <w:t>Fixed answer bank</w:t>
+            </w:r>
+          </w:p>
+        </w:tc>
+        <w:tc>
+          <w:tcPr/>
+          <w:p>
+            <w:pPr>
+              <w:pStyle w:val="Compact"/>
+              <w:jc w:val="left"/>
+            </w:pPr>
+            <w:r>
+              <w:t>One question and follow-up per group; disclose absent evidence</w:t>
+            </w:r>
+          </w:p>
+        </w:tc>
+        <w:tc>
+          <w:tcPr/>
+          <w:p>
+            <w:pPr>
+              <w:pStyle w:val="Compact"/>
+              <w:jc w:val="left"/>
+            </w:pPr>
+            <w:r>
+              <w:t>Trainer pages 3-4 only; keep bank from participants</w:t>
+            </w:r>
+          </w:p>
+        </w:tc>
+        <w:tc>
+          <w:tcPr/>
+          <w:p>
+            <w:pPr>
+              <w:pStyle w:val="Compact"/>
+              <w:jc w:val="left"/>
+            </w:pPr>
+            <w:r>
+              <w:t>Built</w:t>
             </w:r>
           </w:p>
         </w:tc>
@@ -5135,79 +4789,79 @@
               <w:jc w:val="left"/>
             </w:pPr>
             <w:r>
-              <w:t xml:space="preserve">Debrief: which unanswered question changes the decision?</w:t>
-            </w:r>
-          </w:p>
-        </w:tc>
-        <w:tc>
-          <w:tcPr/>
-          <w:p>
-            <w:pPr>
-              <w:pStyle w:val="Compact"/>
-              <w:jc w:val="left"/>
-            </w:pPr>
-            <w:r>
-              <w:t xml:space="preserve">~1:35 · Section 5</w:t>
-            </w:r>
-          </w:p>
-        </w:tc>
-        <w:tc>
-          <w:tcPr/>
-          <w:p>
-            <w:pPr>
-              <w:pStyle w:val="Compact"/>
-              <w:jc w:val="left"/>
-            </w:pPr>
-            <w:r>
-              <w:t xml:space="preserve">Whole room</w:t>
-            </w:r>
-          </w:p>
-        </w:tc>
-        <w:tc>
-          <w:tcPr/>
-          <w:p>
-            <w:pPr>
-              <w:pStyle w:val="Compact"/>
-              <w:jc w:val="left"/>
-            </w:pPr>
-            <w:r>
-              <w:t xml:space="preserve">The record sheets</w:t>
-            </w:r>
-          </w:p>
-        </w:tc>
-        <w:tc>
-          <w:tcPr/>
-          <w:p>
-            <w:pPr>
-              <w:pStyle w:val="Compact"/>
-              <w:jc w:val="left"/>
-            </w:pPr>
-            <w:r>
-              <w:t xml:space="preserve">No build.</w:t>
-            </w:r>
-          </w:p>
-        </w:tc>
-        <w:tc>
-          <w:tcPr/>
-          <w:p>
-            <w:pPr>
-              <w:pStyle w:val="Compact"/>
-              <w:jc w:val="left"/>
-            </w:pPr>
-            <w:r>
-              <w:t xml:space="preserve">Nothing to print or make.</w:t>
-            </w:r>
-          </w:p>
-        </w:tc>
-        <w:tc>
-          <w:tcPr/>
-          <w:p>
-            <w:pPr>
-              <w:pStyle w:val="Compact"/>
-              <w:jc w:val="left"/>
-            </w:pPr>
-            <w:r>
-              <w:t xml:space="preserve">In slides</w:t>
+              <w:t>Requested result</w:t>
+            </w:r>
+          </w:p>
+        </w:tc>
+        <w:tc>
+          <w:tcPr/>
+          <w:p>
+            <w:pPr>
+              <w:pStyle w:val="Compact"/>
+              <w:jc w:val="left"/>
+            </w:pPr>
+            <w:r>
+              <w:t>46-52 min</w:t>
+            </w:r>
+          </w:p>
+        </w:tc>
+        <w:tc>
+          <w:tcPr/>
+          <w:p>
+            <w:pPr>
+              <w:pStyle w:val="Compact"/>
+              <w:jc w:val="left"/>
+            </w:pPr>
+            <w:r>
+              <w:t>Trainer demo</w:t>
+            </w:r>
+          </w:p>
+        </w:tc>
+        <w:tc>
+          <w:tcPr/>
+          <w:p>
+            <w:pPr>
+              <w:pStyle w:val="Compact"/>
+              <w:jc w:val="left"/>
+            </w:pPr>
+            <w:r>
+              <w:t>Pilot interval</w:t>
+            </w:r>
+          </w:p>
+        </w:tc>
+        <w:tc>
+          <w:tcPr/>
+          <w:p>
+            <w:pPr>
+              <w:pStyle w:val="Compact"/>
+              <w:jc w:val="left"/>
+            </w:pPr>
+            <w:r>
+              <w:t>One calculation answers the saving-rule question</w:t>
+            </w:r>
+          </w:p>
+        </w:tc>
+        <w:tc>
+          <w:tcPr/>
+          <w:p>
+            <w:pPr>
+              <w:pStyle w:val="Compact"/>
+              <w:jc w:val="left"/>
+            </w:pPr>
+            <w:r>
+              <w:t>Paper results for other questions</w:t>
+            </w:r>
+          </w:p>
+        </w:tc>
+        <w:tc>
+          <w:tcPr/>
+          <w:p>
+            <w:pPr>
+              <w:pStyle w:val="Compact"/>
+              <w:jc w:val="left"/>
+            </w:pPr>
+            <w:r>
+              <w:t>Built</w:t>
             </w:r>
           </w:p>
         </w:tc>
@@ -5221,79 +4875,79 @@
               <w:jc w:val="left"/>
             </w:pPr>
             <w:r>
-              <w:t xml:space="preserve">AI question list, then compare</w:t>
-            </w:r>
-          </w:p>
-        </w:tc>
-        <w:tc>
-          <w:tcPr/>
-          <w:p>
-            <w:pPr>
-              <w:pStyle w:val="Compact"/>
-              <w:jc w:val="left"/>
-            </w:pPr>
-            <w:r>
-              <w:t xml:space="preserve">~1:40 · Section 6</w:t>
-            </w:r>
-          </w:p>
-        </w:tc>
-        <w:tc>
-          <w:tcPr/>
-          <w:p>
-            <w:pPr>
-              <w:pStyle w:val="Compact"/>
-              <w:jc w:val="left"/>
-            </w:pPr>
-            <w:r>
-              <w:t xml:space="preserve">Group hands-on + AI</w:t>
-            </w:r>
-          </w:p>
-        </w:tc>
-        <w:tc>
-          <w:tcPr/>
-          <w:p>
-            <w:pPr>
-              <w:pStyle w:val="Compact"/>
-              <w:jc w:val="left"/>
-            </w:pPr>
-            <w:r>
-              <w:t xml:space="preserve">Prompt card (pack page 3); AI device</w:t>
-            </w:r>
-          </w:p>
-        </w:tc>
-        <w:tc>
-          <w:tcPr/>
-          <w:p>
-            <w:pPr>
-              <w:pStyle w:val="Compact"/>
-              <w:jc w:val="left"/>
-            </w:pPr>
-            <w:r>
-              <w:t xml:space="preserve">Run prompt A, count how many of its questions pass the S/W sort, then run prompt B.</w:t>
-            </w:r>
-          </w:p>
-        </w:tc>
-        <w:tc>
-          <w:tcPr/>
-          <w:p>
-            <w:pPr>
-              <w:pStyle w:val="Compact"/>
-              <w:jc w:val="left"/>
-            </w:pPr>
-            <w:r>
-              <w:t xml:space="preserve">Print: prompt card (pack page 3), 1 per group (8). Bring: one device with an AI tool per group.</w:t>
-            </w:r>
-          </w:p>
-        </w:tc>
-        <w:tc>
-          <w:tcPr/>
-          <w:p>
-            <w:pPr>
-              <w:pStyle w:val="Compact"/>
-              <w:jc w:val="left"/>
-            </w:pPr>
-            <w:r>
-              <w:t xml:space="preserve">Built: print</w:t>
+              <w:t>Rate and revisit sign-off</w:t>
+            </w:r>
+          </w:p>
+        </w:tc>
+        <w:tc>
+          <w:tcPr/>
+          <w:p>
+            <w:pPr>
+              <w:pStyle w:val="Compact"/>
+              <w:jc w:val="left"/>
+            </w:pPr>
+            <w:r>
+              <w:t>52-68 min</w:t>
+            </w:r>
+          </w:p>
+        </w:tc>
+        <w:tc>
+          <w:tcPr/>
+          <w:p>
+            <w:pPr>
+              <w:pStyle w:val="Compact"/>
+              <w:jc w:val="left"/>
+            </w:pPr>
+            <w:r>
+              <w:t>Individual then pairs</w:t>
+            </w:r>
+          </w:p>
+        </w:tc>
+        <w:tc>
+          <w:tcPr/>
+          <w:p>
+            <w:pPr>
+              <w:pStyle w:val="Compact"/>
+              <w:jc w:val="left"/>
+            </w:pPr>
+            <w:r>
+              <w:t>Worksheet</w:t>
+            </w:r>
+          </w:p>
+        </w:tc>
+        <w:tc>
+          <w:tcPr/>
+          <w:p>
+            <w:pPr>
+              <w:pStyle w:val="Compact"/>
+              <w:jc w:val="left"/>
+            </w:pPr>
+            <w:r>
+              <w:t>Source-backed, partial or unanswered; compare reasons</w:t>
+            </w:r>
+          </w:p>
+        </w:tc>
+        <w:tc>
+          <w:tcPr/>
+          <w:p>
+            <w:pPr>
+              <w:pStyle w:val="Compact"/>
+              <w:jc w:val="left"/>
+            </w:pPr>
+            <w:r>
+              <w:t>Optional room poll Before/After, cards fallback</w:t>
+            </w:r>
+          </w:p>
+        </w:tc>
+        <w:tc>
+          <w:tcPr/>
+          <w:p>
+            <w:pPr>
+              <w:pStyle w:val="Compact"/>
+              <w:jc w:val="left"/>
+            </w:pPr>
+            <w:r>
+              <w:t>Built</w:t>
             </w:r>
           </w:p>
         </w:tc>
@@ -5307,79 +4961,79 @@
               <w:jc w:val="left"/>
             </w:pPr>
             <w:r>
-              <w:t xml:space="preserve">Take-away card</w:t>
-            </w:r>
-          </w:p>
-        </w:tc>
-        <w:tc>
-          <w:tcPr/>
-          <w:p>
-            <w:pPr>
-              <w:pStyle w:val="Compact"/>
-              <w:jc w:val="left"/>
-            </w:pPr>
-            <w:r>
-              <w:t xml:space="preserve">~1:55 · Close</w:t>
-            </w:r>
-          </w:p>
-        </w:tc>
-        <w:tc>
-          <w:tcPr/>
-          <w:p>
-            <w:pPr>
-              <w:pStyle w:val="Compact"/>
-              <w:jc w:val="left"/>
-            </w:pPr>
-            <w:r>
-              <w:t xml:space="preserve">Handout</w:t>
-            </w:r>
-          </w:p>
-        </w:tc>
-        <w:tc>
-          <w:tcPr/>
-          <w:p>
-            <w:pPr>
-              <w:pStyle w:val="Compact"/>
-              <w:jc w:val="left"/>
-            </w:pPr>
-            <w:r>
-              <w:t xml:space="preserve">Pocket cards</w:t>
-            </w:r>
-          </w:p>
-        </w:tc>
-        <w:tc>
-          <w:tcPr/>
-          <w:p>
-            <w:pPr>
-              <w:pStyle w:val="Compact"/>
-              <w:jc w:val="left"/>
-            </w:pPr>
-            <w:r>
-              <w:t xml:space="preserve">The three questions for any analyst.</w:t>
-            </w:r>
-          </w:p>
-        </w:tc>
-        <w:tc>
-          <w:tcPr/>
-          <w:p>
-            <w:pPr>
-              <w:pStyle w:val="Compact"/>
-              <w:jc w:val="left"/>
-            </w:pPr>
-            <w:r>
-              <w:t xml:space="preserve">Print and cut: take-away cards, 1 per participant (40).</w:t>
-            </w:r>
-          </w:p>
-        </w:tc>
-        <w:tc>
-          <w:tcPr/>
-          <w:p>
-            <w:pPr>
-              <w:pStyle w:val="Compact"/>
-              <w:jc w:val="left"/>
-            </w:pPr>
-            <w:r>
-              <w:t xml:space="preserve">Built: print and cut</w:t>
+              <w:t>AI repair and independent close</w:t>
+            </w:r>
+          </w:p>
+        </w:tc>
+        <w:tc>
+          <w:tcPr/>
+          <w:p>
+            <w:pPr>
+              <w:pStyle w:val="Compact"/>
+              <w:jc w:val="left"/>
+            </w:pPr>
+            <w:r>
+              <w:t>68-75 min</w:t>
+            </w:r>
+          </w:p>
+        </w:tc>
+        <w:tc>
+          <w:tcPr/>
+          <w:p>
+            <w:pPr>
+              <w:pStyle w:val="Compact"/>
+              <w:jc w:val="left"/>
+            </w:pPr>
+            <w:r>
+              <w:t>Individual then pairs</w:t>
+            </w:r>
+          </w:p>
+        </w:tc>
+        <w:tc>
+          <w:tcPr/>
+          <w:p>
+            <w:pPr>
+              <w:pStyle w:val="Compact"/>
+              <w:jc w:val="left"/>
+            </w:pPr>
+            <w:r>
+              <w:t>Worksheet</w:t>
+            </w:r>
+          </w:p>
+        </w:tc>
+        <w:tc>
+          <w:tcPr/>
+          <w:p>
+            <w:pPr>
+              <w:pStyle w:val="Compact"/>
+              <w:jc w:val="left"/>
+            </w:pPr>
+            <w:r>
+              <w:t>Correct source claims; write specific request without AI</w:t>
+            </w:r>
+          </w:p>
+        </w:tc>
+        <w:tc>
+          <w:tcPr/>
+          <w:p>
+            <w:pPr>
+              <w:pStyle w:val="Compact"/>
+              <w:jc w:val="left"/>
+            </w:pPr>
+            <w:r>
+              <w:t>Trainer page 5 contains key</w:t>
+            </w:r>
+          </w:p>
+        </w:tc>
+        <w:tc>
+          <w:tcPr/>
+          <w:p>
+            <w:pPr>
+              <w:pStyle w:val="Compact"/>
+              <w:jc w:val="left"/>
+            </w:pPr>
+            <w:r>
+              <w:t>Built</w:t>
             </w:r>
           </w:p>
         </w:tc>
@@ -5392,7 +5046,7 @@
         <w:pStyle w:val="Heading2"/>
       </w:pPr>
       <w:r>
-        <w:t xml:space="preserve">Oct 15, Session 1: Is This Evidence Credible? (QA Deep Dive)</w:t>
+        <w:t>Historical, pending Day 4 review: Oct 15, Session 1: Is This Evidence Credible? (QA Deep Dive)</w:t>
       </w:r>
     </w:p>
     <w:p>
@@ -5400,7 +5054,7 @@
         <w:pStyle w:val="FirstParagraph"/>
       </w:pPr>
       <w:r>
-        <w:t xml:space="preserve">Revised 6 Oct: ratings go on a two-sheet A1 wall grid, and the debrief reads the grid instead of asking for a show of colours. The fictitious report is Oct15_session1_report.docx, rendered from Oct15_session1_report.qmd. Print materials are in Oct15_session1_materials.docx, generated by make_session_materials.R from the same data as the deck; each item opens with a print line (copies, cut or not) and the last page is the facilitator key. Participant copies, without the key, are on the course website. The rating sheet and the reveal slides both read qa_rating.R.</w:t>
+        <w:t>Historical description retained pending the Day 4 daily review. Existing materials and activity rows below are not the approved shorter route. Menti and the former third-session workshop are excluded from the new programme.</w:t>
       </w:r>
     </w:p>
     <w:tbl>
@@ -6000,7 +5654,7 @@
         <w:pStyle w:val="Heading2"/>
       </w:pPr>
       <w:r>
-        <w:t xml:space="preserve">Oct 15, Session 2: From Findings to Policy (Evidence Translation)</w:t>
+        <w:t>Historical, pending Day 4 review: Oct 15, Session 2: From Findings to Policy (Evidence Translation)</w:t>
       </w:r>
     </w:p>
     <w:p>
@@ -6008,7 +5662,7 @@
         <w:pStyle w:val="FirstParagraph"/>
       </w:pPr>
       <w:r>
-        <w:t xml:space="preserve">Revised 25 Sep for the live deck (Oct15_session2_live.qmd): the trainer runs R in the browser and the room predicts each result before the Run button is pressed. Print materials are in Oct15_session2_materials.docx, generated by make_session_materials.R from the same data as the deck; each item opens with a print line (copies, cut or not) and the last page is the facilitator key. Polls are Menti placeholders for now; an in-slide poll is planned. The findings pack and brief template are unchanged (Oct15_session2_findings.docx, Oct15_session2_brief_template.docx, from qa_translation.R). One example all session: Tariff Shield.</w:t>
+        <w:t>Historical description retained pending the Day 4 daily review. Existing materials and activity rows below are not the approved shorter route. Menti and the former third-session workshop are excluded from the new programme.</w:t>
       </w:r>
     </w:p>
     <w:tbl>

</xml_diff>

<commit_message>
Complete the shorter Day 4 report-reading sessions and whole-week pack
Co-Authored-By: Codex <noreply@openai.com>
</commit_message>
<xml_diff>
--- a/Module_2_Oct_2026_v2/Module2_exercise_plan_v3.docx
+++ b/Module_2_Oct_2026_v2/Module2_exercise_plan_v3.docx
@@ -40,7 +40,7 @@
         <w:pStyle w:val="BodyText"/>
       </w:pPr>
       <w:r>
-        <w:t>The programme now has eleven course-owned sessions. Days 1 to 3 have been rebuilt with two-sided participant sheets and separate trainer keys. Day 4 descriptions and files remain historical until their daily rebuild. The final Day 4 slot belongs to an evaluation simulation prepared by someone else.</w:t>
+        <w:t>The programme has eleven course-owned sessions, all rebuilt with shorter explanations, two-sided participant worksheets and separate trainer keys. The final Day 4 slot belongs to an evaluation simulation prepared by someone else. No materials are required from this course for that slot.</w:t>
       </w:r>
     </w:p>
     <w:p>
@@ -48,7 +48,7 @@
         <w:pStyle w:val="BodyText"/>
       </w:pPr>
       <w:r>
-        <w:t>Print, make or bring gives the practical requirement for each exercise. Quantities assume eight groups and up to forty participants; adjust them to final attendance. Menti is retired. Days 1 to 3 use local deck interactions and optional course-owned room voting, with labelled cards as the fallback.</w:t>
+        <w:t>Print, make or bring gives the practical requirement for each exercise. Assume eight groups and forty participants; adjust for final attendance. No external AI account is required for the authored source checks. Native deck controls and optional course room voting are ready; test venue phone access and keep labelled cards as the fallback.</w:t>
       </w:r>
     </w:p>
     <w:p>
@@ -73,7 +73,7 @@
     </w:p>
     <w:p>
       <w:r>
-        <w:t>Approved shorter programme: Days 1 to 3 use 60, 60 and 75 minutes; Day 4 has two course-owned 60-minute sessions. Days 1 to 3 are rebuilt. Day 4 descriptions remain historical pending their daily review. Menti is retired; the course room poll and labelled-card fallback replace it.</w:t>
+        <w:t>Approved shorter programme: Days 1 to 3 use 60, 60 and 75 minutes; Day 4 has two course-owned 60-minute sessions. All eleven sessions are rebuilt. The final Day 4 slot belongs to an evaluation simulation prepared by another provider. Use the course room poll with a labelled-card fallback; no Menti.</w:t>
       </w:r>
     </w:p>
     <w:tbl>
@@ -267,7 +267,7 @@
               <w:jc w:val="left"/>
             </w:pPr>
             <w:r>
-              <w:t>Days 1 to 3 need no AI account. Optional phones for course room voting; test classroom network. Day 4 device needs await its daily rebuild.</w:t>
+              <w:t>No AI account required. Optional phones for course room voting; rehearse classroom network access. Open browser calculation decks early. Printed results and labelled cards are the fallback.</w:t>
             </w:r>
           </w:p>
         </w:tc>
@@ -5046,7 +5046,7 @@
         <w:pStyle w:val="Heading2"/>
       </w:pPr>
       <w:r>
-        <w:t>Historical, pending Day 4 review: Oct 15, Session 1: Is This Evidence Credible? (QA Deep Dive)</w:t>
+        <w:t>Oct 15, Session 1: Judge a report section by section (60 minutes)</w:t>
       </w:r>
     </w:p>
     <w:p>
@@ -5054,7 +5054,7 @@
         <w:pStyle w:val="FirstParagraph"/>
       </w:pPr>
       <w:r>
-        <w:t>Historical description retained pending the Day 4 daily review. Existing materials and activity rows below are not the approved shorter route. Menti and the former third-session workshop are excluded from the new programme.</w:t>
+        <w:t>Approved 6 October 2026. GreenWaste only, fictional figures. Participant pages 1 and 2 are printed double-sided, one per person. Native evidence reveals and optional room voting replace Menti. No model lab or participant coding. Print the four-page report separately. Trainer pages contain the assessment rubric, section key, retries and two-sheet board preview.</w:t>
       </w:r>
     </w:p>
     <w:tbl>
@@ -5171,94 +5171,79 @@
               <w:jc w:val="left"/>
             </w:pPr>
             <w:r>
-              <w:t xml:space="preserve">Sign-off vote (before reading and at the close)</w:t>
-            </w:r>
-          </w:p>
-        </w:tc>
-        <w:tc>
-          <w:tcPr/>
-          <w:p>
-            <w:pPr>
-              <w:pStyle w:val="Compact"/>
-              <w:jc w:val="left"/>
-            </w:pPr>
-            <w:r>
-              <w:t xml:space="preserve">~0:05 opening · Section 0,</w:t>
-            </w:r>
-            <w:r>
-              <w:t xml:space="preserve"> </w:t>
-            </w:r>
-            <w:r>
-              <w:t xml:space="preserve">“</w:t>
-            </w:r>
-            <w:r>
-              <w:t xml:space="preserve">Before you open it</w:t>
-            </w:r>
-            <w:r>
-              <w:t xml:space="preserve">”</w:t>
-            </w:r>
-            <w:r>
-              <w:t xml:space="preserve">; repeated at the close</w:t>
-            </w:r>
-          </w:p>
-        </w:tc>
-        <w:tc>
-          <w:tcPr/>
-          <w:p>
-            <w:pPr>
-              <w:pStyle w:val="Compact"/>
-              <w:jc w:val="left"/>
-            </w:pPr>
-            <w:r>
-              <w:t xml:space="preserve">Live Menti poll (embedded), QR on slide</w:t>
-            </w:r>
-          </w:p>
-        </w:tc>
-        <w:tc>
-          <w:tcPr/>
-          <w:p>
-            <w:pPr>
-              <w:pStyle w:val="Compact"/>
-              <w:jc w:val="left"/>
-            </w:pPr>
-            <w:r>
-              <w:t xml:space="preserve">The Menti poll (one, reused for both votes)</w:t>
-            </w:r>
-          </w:p>
-        </w:tc>
-        <w:tc>
-          <w:tcPr/>
-          <w:p>
-            <w:pPr>
-              <w:pStyle w:val="Compact"/>
-              <w:jc w:val="left"/>
-            </w:pPr>
-            <w:r>
-              <w:t xml:space="preserve">The same sign-off question as the clinic, three options, run before reading the report and again at the end so the two votes can be compared. PwC: create the poll in Menti.</w:t>
-            </w:r>
-          </w:p>
-        </w:tc>
-        <w:tc>
-          <w:tcPr/>
-          <w:p>
-            <w:pPr>
-              <w:pStyle w:val="Compact"/>
-              <w:jc w:val="left"/>
-            </w:pPr>
-            <w:r>
-              <w:t xml:space="preserve">Make: Menti poll (online). Nothing to print.</w:t>
-            </w:r>
-          </w:p>
-        </w:tc>
-        <w:tc>
-          <w:tcPr/>
-          <w:p>
-            <w:pPr>
-              <w:pStyle w:val="Compact"/>
-              <w:jc w:val="left"/>
-            </w:pPr>
-            <w:r>
-              <w:t xml:space="preserve">Menti poll to build</w:t>
+              <w:t>Independent reading</w:t>
+            </w:r>
+          </w:p>
+        </w:tc>
+        <w:tc>
+          <w:tcPr/>
+          <w:p>
+            <w:pPr>
+              <w:pStyle w:val="Compact"/>
+              <w:jc w:val="left"/>
+            </w:pPr>
+            <w:r>
+              <w:t>0-8 min</w:t>
+            </w:r>
+          </w:p>
+        </w:tc>
+        <w:tc>
+          <w:tcPr/>
+          <w:p>
+            <w:pPr>
+              <w:pStyle w:val="Compact"/>
+              <w:jc w:val="left"/>
+            </w:pPr>
+            <w:r>
+              <w:t>Individual</w:t>
+            </w:r>
+          </w:p>
+        </w:tc>
+        <w:tc>
+          <w:tcPr/>
+          <w:p>
+            <w:pPr>
+              <w:pStyle w:val="Compact"/>
+              <w:jc w:val="left"/>
+            </w:pPr>
+            <w:r>
+              <w:t>Report pages 1 and 3; worksheet</w:t>
+            </w:r>
+          </w:p>
+        </w:tc>
+        <w:tc>
+          <w:tcPr/>
+          <w:p>
+            <w:pPr>
+              <w:pStyle w:val="Compact"/>
+              <w:jc w:val="left"/>
+            </w:pPr>
+            <w:r>
+              <w:t>Five abilities, before AI or discussion; collect for scoring</w:t>
+            </w:r>
+          </w:p>
+        </w:tc>
+        <w:tc>
+          <w:tcPr/>
+          <w:p>
+            <w:pPr>
+              <w:pStyle w:val="Compact"/>
+              <w:jc w:val="left"/>
+            </w:pPr>
+            <w:r>
+              <w:t>Four-page report, two sheets double-sided per person; participant sheet two-sided</w:t>
+            </w:r>
+          </w:p>
+        </w:tc>
+        <w:tc>
+          <w:tcPr/>
+          <w:p>
+            <w:pPr>
+              <w:pStyle w:val="Compact"/>
+              <w:jc w:val="left"/>
+            </w:pPr>
+            <w:r>
+              <w:t>Built</w:t>
             </w:r>
           </w:p>
         </w:tc>
@@ -5272,91 +5257,79 @@
               <w:jc w:val="left"/>
             </w:pPr>
             <w:r>
-              <w:t xml:space="preserve">Rate the executive summary alone</w:t>
-            </w:r>
-          </w:p>
-        </w:tc>
-        <w:tc>
-          <w:tcPr/>
-          <w:p>
-            <w:pPr>
-              <w:pStyle w:val="Compact"/>
-              <w:jc w:val="left"/>
-            </w:pPr>
-            <w:r>
-              <w:t xml:space="preserve">~0:20 · Section 1,</w:t>
-            </w:r>
-            <w:r>
-              <w:t xml:space="preserve"> </w:t>
-            </w:r>
-            <w:r>
-              <w:t xml:space="preserve">“</w:t>
-            </w:r>
-            <w:r>
-              <w:t xml:space="preserve">Read the summary and rate it</w:t>
-            </w:r>
-            <w:r>
-              <w:t xml:space="preserve">”</w:t>
-            </w:r>
-          </w:p>
-        </w:tc>
-        <w:tc>
-          <w:tcPr/>
-          <w:p>
-            <w:pPr>
-              <w:pStyle w:val="Compact"/>
-              <w:jc w:val="left"/>
-            </w:pPr>
-            <w:r>
-              <w:t xml:space="preserve">Individual rating (five minutes), posted on the wall grid</w:t>
-            </w:r>
-          </w:p>
-        </w:tc>
-        <w:tc>
-          <w:tcPr/>
-          <w:p>
-            <w:pPr>
-              <w:pStyle w:val="Compact"/>
-              <w:jc w:val="left"/>
-            </w:pPr>
-            <w:r>
-              <w:t xml:space="preserve">The report (Oct15_session1_report.docx) and the rating sheet (pack page 1), 1 each per participant</w:t>
-            </w:r>
-          </w:p>
-        </w:tc>
-        <w:tc>
-          <w:tcPr/>
-          <w:p>
-            <w:pPr>
-              <w:pStyle w:val="Compact"/>
-              <w:jc w:val="left"/>
-            </w:pPr>
-            <w:r>
-              <w:t xml:space="preserve">Five minutes, working individually before any group discussion: read the executive summary and rate it on the rating sheet. Revised 6 Oct: each participant then puts a sticky note with a few words of reason on the wall grid, in the executive-summary column and the row for their colour. No names. Print only, plus the wall grid.</w:t>
-            </w:r>
-          </w:p>
-        </w:tc>
-        <w:tc>
-          <w:tcPr/>
-          <w:p>
-            <w:pPr>
-              <w:pStyle w:val="Compact"/>
-              <w:jc w:val="left"/>
-            </w:pPr>
-            <w:r>
-              <w:t xml:space="preserve">Print: the report (Oct15_session1_report.docx), 1 per participant (40); rating sheet (pack pages 1 and 2, back to back), 1 per participant (40). Bring: small sticky notes (about 38 x 51 mm), about 4 per participant (160), and pens.</w:t>
-            </w:r>
-          </w:p>
-        </w:tc>
-        <w:tc>
-          <w:tcPr/>
-          <w:p>
-            <w:pPr>
-              <w:pStyle w:val="Compact"/>
-              <w:jc w:val="left"/>
-            </w:pPr>
-            <w:r>
-              <w:t xml:space="preserve">Built: print, including the A1 board</w:t>
+              <w:t>Initial judgement and scale</w:t>
+            </w:r>
+          </w:p>
+        </w:tc>
+        <w:tc>
+          <w:tcPr/>
+          <w:p>
+            <w:pPr>
+              <w:pStyle w:val="Compact"/>
+              <w:jc w:val="left"/>
+            </w:pPr>
+            <w:r>
+              <w:t>8-16 min</w:t>
+            </w:r>
+          </w:p>
+        </w:tc>
+        <w:tc>
+          <w:tcPr/>
+          <w:p>
+            <w:pPr>
+              <w:pStyle w:val="Compact"/>
+              <w:jc w:val="left"/>
+            </w:pPr>
+            <w:r>
+              <w:t>Individual then pairs</w:t>
+            </w:r>
+          </w:p>
+        </w:tc>
+        <w:tc>
+          <w:tcPr/>
+          <w:p>
+            <w:pPr>
+              <w:pStyle w:val="Compact"/>
+              <w:jc w:val="left"/>
+            </w:pPr>
+            <w:r>
+              <w:t>Native choices; rating legend</w:t>
+            </w:r>
+          </w:p>
+        </w:tc>
+        <w:tc>
+          <w:tcPr/>
+          <w:p>
+            <w:pPr>
+              <w:pStyle w:val="Compact"/>
+              <w:jc w:val="left"/>
+            </w:pPr>
+            <w:r>
+              <w:t>Reason and source; Supported / Concern / Unsupported</w:t>
+            </w:r>
+          </w:p>
+        </w:tc>
+        <w:tc>
+          <w:tcPr/>
+          <w:p>
+            <w:pPr>
+              <w:pStyle w:val="Compact"/>
+              <w:jc w:val="left"/>
+            </w:pPr>
+            <w:r>
+              <w:t>Optional room poll Before phase; labelled cards fallback</w:t>
+            </w:r>
+          </w:p>
+        </w:tc>
+        <w:tc>
+          <w:tcPr/>
+          <w:p>
+            <w:pPr>
+              <w:pStyle w:val="Compact"/>
+              <w:jc w:val="left"/>
+            </w:pPr>
+            <w:r>
+              <w:t>Built</w:t>
             </w:r>
           </w:p>
         </w:tc>
@@ -5370,94 +5343,79 @@
               <w:jc w:val="left"/>
             </w:pPr>
             <w:r>
-              <w:t xml:space="preserve">Rate the remaining five sections, then defend</w:t>
-            </w:r>
-          </w:p>
-        </w:tc>
-        <w:tc>
-          <w:tcPr/>
-          <w:p>
-            <w:pPr>
-              <w:pStyle w:val="Compact"/>
-              <w:jc w:val="left"/>
-            </w:pPr>
-            <w:r>
-              <w:t xml:space="preserve">~0:40–1:15 · Section 3, section by section</w:t>
-            </w:r>
-          </w:p>
-        </w:tc>
-        <w:tc>
-          <w:tcPr/>
-          <w:p>
-            <w:pPr>
-              <w:pStyle w:val="Compact"/>
-              <w:jc w:val="left"/>
-            </w:pPr>
-            <w:r>
-              <w:t xml:space="preserve">Pairs rate, post on the wall grid; debrief from the wall</w:t>
-            </w:r>
-          </w:p>
-        </w:tc>
-        <w:tc>
-          <w:tcPr/>
-          <w:p>
-            <w:pPr>
-              <w:pStyle w:val="Compact"/>
-              <w:jc w:val="left"/>
-            </w:pPr>
-            <w:r>
-              <w:t xml:space="preserve">The rating sheet (pack page 1) and the verdict page on its back (pack page 2)</w:t>
-            </w:r>
-          </w:p>
-        </w:tc>
-        <w:tc>
-          <w:tcPr/>
-          <w:p>
-            <w:pPr>
-              <w:pStyle w:val="Compact"/>
-              <w:jc w:val="left"/>
-            </w:pPr>
-            <w:r>
-              <w:t xml:space="preserve">Rate the remaining five sections (design, data, results, limitations, conclusions) on the rating sheet, one colour plus the reason that decided it. Revised 6 Oct: pairs post one small sticky note per section on the wall grid, two A1 sheets (Oct15_session1_board_A1.pdf: the executive summary on its own, then Sections 3 to 7; rows Green, Amber, Red). In the debrief the trainer reads each section’s column from the wall before the reveal, in place of a show of colours, and puts the executive-summary and Results columns side by side at</w:t>
-            </w:r>
-            <w:r>
-              <w:t xml:space="preserve"> </w:t>
-            </w:r>
-            <w:r>
-              <w:t xml:space="preserve">“</w:t>
-            </w:r>
-            <w:r>
-              <w:t xml:space="preserve">The same question</w:t>
-            </w:r>
-            <w:r>
-              <w:t xml:space="preserve">”</w:t>
-            </w:r>
-            <w:r>
-              <w:t xml:space="preserve">. The verdict page records both sign-off votes, the most important problem and the strongest point. Setup is in the facilitator key.</w:t>
-            </w:r>
-          </w:p>
-        </w:tc>
-        <w:tc>
-          <w:tcPr/>
-          <w:p>
-            <w:pPr>
-              <w:pStyle w:val="Compact"/>
-              <w:jc w:val="left"/>
-            </w:pPr>
-            <w:r>
-              <w:t xml:space="preserve">Print at A1: Oct15_session1_board_A1.pdf, two sheets (the executive summary on its own; Sections 3 to 7), taped side by side; preview at the end of the pack. Bring: masking tape.</w:t>
-            </w:r>
-          </w:p>
-        </w:tc>
-        <w:tc>
-          <w:tcPr/>
-          <w:p>
-            <w:pPr>
-              <w:pStyle w:val="Compact"/>
-              <w:jc w:val="left"/>
-            </w:pPr>
-            <w:r>
-              <w:t xml:space="preserve">Built: print, including the A1 board</w:t>
+              <w:t>Summary and section reading</w:t>
+            </w:r>
+          </w:p>
+        </w:tc>
+        <w:tc>
+          <w:tcPr/>
+          <w:p>
+            <w:pPr>
+              <w:pStyle w:val="Compact"/>
+              <w:jc w:val="left"/>
+            </w:pPr>
+            <w:r>
+              <w:t>16-32 min</w:t>
+            </w:r>
+          </w:p>
+        </w:tc>
+        <w:tc>
+          <w:tcPr/>
+          <w:p>
+            <w:pPr>
+              <w:pStyle w:val="Compact"/>
+              <w:jc w:val="left"/>
+            </w:pPr>
+            <w:r>
+              <w:t>Individual then groups</w:t>
+            </w:r>
+          </w:p>
+        </w:tc>
+        <w:tc>
+          <w:tcPr/>
+          <w:p>
+            <w:pPr>
+              <w:pStyle w:val="Compact"/>
+              <w:jc w:val="left"/>
+            </w:pPr>
+            <w:r>
+              <w:t>Report; worksheet</w:t>
+            </w:r>
+          </w:p>
+        </w:tc>
+        <w:tc>
+          <w:tcPr/>
+          <w:p>
+            <w:pPr>
+              <w:pStyle w:val="Compact"/>
+              <w:jc w:val="left"/>
+            </w:pPr>
+            <w:r>
+              <w:t>Each group finds a strength and a consequential concern</w:t>
+            </w:r>
+          </w:p>
+        </w:tc>
+        <w:tc>
+          <w:tcPr/>
+          <w:p>
+            <w:pPr>
+              <w:pStyle w:val="Compact"/>
+              <w:jc w:val="left"/>
+            </w:pPr>
+            <w:r>
+              <w:t>Eight groups: Sections 3/4/5/6/7/3/5/7</w:t>
+            </w:r>
+          </w:p>
+        </w:tc>
+        <w:tc>
+          <w:tcPr/>
+          <w:p>
+            <w:pPr>
+              <w:pStyle w:val="Compact"/>
+              <w:jc w:val="left"/>
+            </w:pPr>
+            <w:r>
+              <w:t>Built</w:t>
             </w:r>
           </w:p>
         </w:tc>
@@ -5471,79 +5429,79 @@
               <w:jc w:val="left"/>
             </w:pPr>
             <w:r>
-              <w:t xml:space="preserve">AI credibility verdict, then compare</w:t>
-            </w:r>
-          </w:p>
-        </w:tc>
-        <w:tc>
-          <w:tcPr/>
-          <w:p>
-            <w:pPr>
-              <w:pStyle w:val="Compact"/>
-              <w:jc w:val="left"/>
-            </w:pPr>
-            <w:r>
-              <w:t xml:space="preserve">~1:20 · Section 4</w:t>
-            </w:r>
-          </w:p>
-        </w:tc>
-        <w:tc>
-          <w:tcPr/>
-          <w:p>
-            <w:pPr>
-              <w:pStyle w:val="Compact"/>
-              <w:jc w:val="left"/>
-            </w:pPr>
-            <w:r>
-              <w:t xml:space="preserve">Group work + AI</w:t>
-            </w:r>
-          </w:p>
-        </w:tc>
-        <w:tc>
-          <w:tcPr/>
-          <w:p>
-            <w:pPr>
-              <w:pStyle w:val="Compact"/>
-              <w:jc w:val="left"/>
-            </w:pPr>
-            <w:r>
-              <w:t xml:space="preserve">AI handout (pack page 3), 1 per group; a device with AI access per group</w:t>
-            </w:r>
-          </w:p>
-        </w:tc>
-        <w:tc>
-          <w:tcPr/>
-          <w:p>
-            <w:pPr>
-              <w:pStyle w:val="Compact"/>
-              <w:jc w:val="left"/>
-            </w:pPr>
-            <w:r>
-              <w:t xml:space="preserve">Each group runs the prompt on the report, compares the AI’s verdict and the handout’s example with its own rating, finds the two unsupported claims and the larger problem, then runs the better prompt. Print only.</w:t>
-            </w:r>
-          </w:p>
-        </w:tc>
-        <w:tc>
-          <w:tcPr/>
-          <w:p>
-            <w:pPr>
-              <w:pStyle w:val="Compact"/>
-              <w:jc w:val="left"/>
-            </w:pPr>
-            <w:r>
-              <w:t xml:space="preserve">Print: AI handout (pack page 3), 1 per group (8). Bring: one device with an AI tool per group.</w:t>
-            </w:r>
-          </w:p>
-        </w:tc>
-        <w:tc>
-          <w:tcPr/>
-          <w:p>
-            <w:pPr>
-              <w:pStyle w:val="Compact"/>
-              <w:jc w:val="left"/>
-            </w:pPr>
-            <w:r>
-              <w:t xml:space="preserve">Built: print</w:t>
+              <w:t>Credibility wall</w:t>
+            </w:r>
+          </w:p>
+        </w:tc>
+        <w:tc>
+          <w:tcPr/>
+          <w:p>
+            <w:pPr>
+              <w:pStyle w:val="Compact"/>
+              <w:jc w:val="left"/>
+            </w:pPr>
+            <w:r>
+              <w:t>32-39 min</w:t>
+            </w:r>
+          </w:p>
+        </w:tc>
+        <w:tc>
+          <w:tcPr/>
+          <w:p>
+            <w:pPr>
+              <w:pStyle w:val="Compact"/>
+              <w:jc w:val="left"/>
+            </w:pPr>
+            <w:r>
+              <w:t>Groups</w:t>
+            </w:r>
+          </w:p>
+        </w:tc>
+        <w:tc>
+          <w:tcPr/>
+          <w:p>
+            <w:pPr>
+              <w:pStyle w:val="Compact"/>
+              <w:jc w:val="left"/>
+            </w:pPr>
+            <w:r>
+              <w:t>Two-sheet A1 grid; sticky notes</w:t>
+            </w:r>
+          </w:p>
+        </w:tc>
+        <w:tc>
+          <w:tcPr/>
+          <w:p>
+            <w:pPr>
+              <w:pStyle w:val="Compact"/>
+              <w:jc w:val="left"/>
+            </w:pPr>
+            <w:r>
+              <w:t>Dedicated summary panel; Sections 3-7 on second sheet</w:t>
+            </w:r>
+          </w:p>
+        </w:tc>
+        <w:tc>
+          <w:tcPr/>
+          <w:p>
+            <w:pPr>
+              <w:pStyle w:val="Compact"/>
+              <w:jc w:val="left"/>
+            </w:pPr>
+            <w:r>
+              <w:t>Two landscape A1 sheets; about four small notes per person plus spares</w:t>
+            </w:r>
+          </w:p>
+        </w:tc>
+        <w:tc>
+          <w:tcPr/>
+          <w:p>
+            <w:pPr>
+              <w:pStyle w:val="Compact"/>
+              <w:jc w:val="left"/>
+            </w:pPr>
+            <w:r>
+              <w:t>Built</w:t>
             </w:r>
           </w:p>
         </w:tc>
@@ -5557,91 +5515,165 @@
               <w:jc w:val="left"/>
             </w:pPr>
             <w:r>
-              <w:t xml:space="preserve">Take-away card: three habits for reading a report</w:t>
-            </w:r>
-          </w:p>
-        </w:tc>
-        <w:tc>
-          <w:tcPr/>
-          <w:p>
-            <w:pPr>
-              <w:pStyle w:val="Compact"/>
-              <w:jc w:val="left"/>
-            </w:pPr>
-            <w:r>
-              <w:t xml:space="preserve">~1:25 · Section 6,</w:t>
-            </w:r>
-            <w:r>
-              <w:t xml:space="preserve"> </w:t>
-            </w:r>
-            <w:r>
-              <w:t xml:space="preserve">“</w:t>
-            </w:r>
-            <w:r>
-              <w:t xml:space="preserve">Three habits for reading a report</w:t>
-            </w:r>
-            <w:r>
-              <w:t xml:space="preserve">”</w:t>
-            </w:r>
-          </w:p>
-        </w:tc>
-        <w:tc>
-          <w:tcPr/>
-          <w:p>
-            <w:pPr>
-              <w:pStyle w:val="Compact"/>
-              <w:jc w:val="left"/>
-            </w:pPr>
-            <w:r>
-              <w:t xml:space="preserve">Handout (take-away)</w:t>
-            </w:r>
-          </w:p>
-        </w:tc>
-        <w:tc>
-          <w:tcPr/>
-          <w:p>
-            <w:pPr>
-              <w:pStyle w:val="Compact"/>
-              <w:jc w:val="left"/>
-            </w:pPr>
-            <w:r>
-              <w:t xml:space="preserve">Take-away card (pack page 4), 1 per participant, cut</w:t>
-            </w:r>
-          </w:p>
-        </w:tc>
-        <w:tc>
-          <w:tcPr/>
-          <w:p>
-            <w:pPr>
-              <w:pStyle w:val="Compact"/>
-              <w:jc w:val="left"/>
-            </w:pPr>
-            <w:r>
-              <w:t xml:space="preserve">The closing slide’s three habits, six cards per page. Print only.</w:t>
-            </w:r>
-          </w:p>
-        </w:tc>
-        <w:tc>
-          <w:tcPr/>
-          <w:p>
-            <w:pPr>
-              <w:pStyle w:val="Compact"/>
-              <w:jc w:val="left"/>
-            </w:pPr>
-            <w:r>
-              <w:t xml:space="preserve">Print and cut: take-away cards, 1 per participant (40).</w:t>
-            </w:r>
-          </w:p>
-        </w:tc>
-        <w:tc>
-          <w:tcPr/>
-          <w:p>
-            <w:pPr>
-              <w:pStyle w:val="Compact"/>
-              <w:jc w:val="left"/>
-            </w:pPr>
-            <w:r>
-              <w:t xml:space="preserve">Built: print</w:t>
+              <w:t>Compare and trace headline</w:t>
+            </w:r>
+          </w:p>
+        </w:tc>
+        <w:tc>
+          <w:tcPr/>
+          <w:p>
+            <w:pPr>
+              <w:pStyle w:val="Compact"/>
+              <w:jc w:val="left"/>
+            </w:pPr>
+            <w:r>
+              <w:t>39-51 min</w:t>
+            </w:r>
+          </w:p>
+        </w:tc>
+        <w:tc>
+          <w:tcPr/>
+          <w:p>
+            <w:pPr>
+              <w:pStyle w:val="Compact"/>
+              <w:jc w:val="left"/>
+            </w:pPr>
+            <w:r>
+              <w:t>Pairs and room</w:t>
+            </w:r>
+          </w:p>
+        </w:tc>
+        <w:tc>
+          <w:tcPr/>
+          <w:p>
+            <w:pPr>
+              <w:pStyle w:val="Compact"/>
+              <w:jc w:val="left"/>
+            </w:pPr>
+            <w:r>
+              <w:t>Report and native evidence reveals</w:t>
+            </w:r>
+          </w:p>
+        </w:tc>
+        <w:tc>
+          <w:tcPr/>
+          <w:p>
+            <w:pPr>
+              <w:pStyle w:val="Compact"/>
+              <w:jc w:val="left"/>
+            </w:pPr>
+            <w:r>
+              <w:t>Cite passages; recognise supported disclosure; inspect selected estimate</w:t>
+            </w:r>
+          </w:p>
+        </w:tc>
+        <w:tc>
+          <w:tcPr/>
+          <w:p>
+            <w:pPr>
+              <w:pStyle w:val="Compact"/>
+              <w:jc w:val="left"/>
+            </w:pPr>
+            <w:r>
+              <w:t>Trainer section key and board preview only</w:t>
+            </w:r>
+          </w:p>
+        </w:tc>
+        <w:tc>
+          <w:tcPr/>
+          <w:p>
+            <w:pPr>
+              <w:pStyle w:val="Compact"/>
+              <w:jc w:val="left"/>
+            </w:pPr>
+            <w:r>
+              <w:t>Built</w:t>
+            </w:r>
+          </w:p>
+        </w:tc>
+      </w:tr>
+      <w:tr>
+        <w:tc>
+          <w:tcPr/>
+          <w:p>
+            <w:pPr>
+              <w:pStyle w:val="Compact"/>
+              <w:jc w:val="left"/>
+            </w:pPr>
+            <w:r>
+              <w:t>AI repair and close</w:t>
+            </w:r>
+          </w:p>
+        </w:tc>
+        <w:tc>
+          <w:tcPr/>
+          <w:p>
+            <w:pPr>
+              <w:pStyle w:val="Compact"/>
+              <w:jc w:val="left"/>
+            </w:pPr>
+            <w:r>
+              <w:t>51-60 min</w:t>
+            </w:r>
+          </w:p>
+        </w:tc>
+        <w:tc>
+          <w:tcPr/>
+          <w:p>
+            <w:pPr>
+              <w:pStyle w:val="Compact"/>
+              <w:jc w:val="left"/>
+            </w:pPr>
+            <w:r>
+              <w:t>Individual then pairs</w:t>
+            </w:r>
+          </w:p>
+        </w:tc>
+        <w:tc>
+          <w:tcPr/>
+          <w:p>
+            <w:pPr>
+              <w:pStyle w:val="Compact"/>
+              <w:jc w:val="left"/>
+            </w:pPr>
+            <w:r>
+              <w:t>Worksheet</w:t>
+            </w:r>
+          </w:p>
+        </w:tc>
+        <w:tc>
+          <w:tcPr/>
+          <w:p>
+            <w:pPr>
+              <w:pStyle w:val="Compact"/>
+              <w:jc w:val="left"/>
+            </w:pPr>
+            <w:r>
+              <w:t>Source correction, final judgement and independent request</w:t>
+            </w:r>
+          </w:p>
+        </w:tc>
+        <w:tc>
+          <w:tcPr/>
+          <w:p>
+            <w:pPr>
+              <w:pStyle w:val="Compact"/>
+              <w:jc w:val="left"/>
+            </w:pPr>
+            <w:r>
+              <w:t>No external AI account; assess written reading task</w:t>
+            </w:r>
+          </w:p>
+        </w:tc>
+        <w:tc>
+          <w:tcPr/>
+          <w:p>
+            <w:pPr>
+              <w:pStyle w:val="Compact"/>
+              <w:jc w:val="left"/>
+            </w:pPr>
+            <w:r>
+              <w:t>Built</w:t>
             </w:r>
           </w:p>
         </w:tc>
@@ -5654,7 +5686,7 @@
         <w:pStyle w:val="Heading2"/>
       </w:pPr>
       <w:r>
-        <w:t>Historical, pending Day 4 review: Oct 15, Session 2: From Findings to Policy (Evidence Translation)</w:t>
+        <w:t>Oct 15, Session 2: Write a defensible recommendation (60 minutes)</w:t>
       </w:r>
     </w:p>
     <w:p>
@@ -5662,7 +5694,7 @@
         <w:pStyle w:val="FirstParagraph"/>
       </w:pPr>
       <w:r>
-        <w:t>Historical description retained pending the Day 4 daily review. Existing materials and activity rows below are not the approved shorter route. Menti and the former third-session workshop are excluded from the new programme.</w:t>
+        <w:t>Approved 6 October 2026. GreenWaste only, fictional figures. Participant pages 1 and 2 are printed double-sided, one per person. Native evidence reveals and optional room voting replace Menti. No model lab or participant coding. Print the one-page corrected findings reference separately. The optional brief template duplicates worksheet Sheet 1.</w:t>
       </w:r>
     </w:p>
     <w:tbl>
@@ -5779,79 +5811,79 @@
               <w:jc w:val="left"/>
             </w:pPr>
             <w:r>
-              <w:t xml:space="preserve">Commitment vote (before the findings and before writing)</w:t>
-            </w:r>
-          </w:p>
-        </w:tc>
-        <w:tc>
-          <w:tcPr/>
-          <w:p>
-            <w:pPr>
-              <w:pStyle w:val="Compact"/>
-              <w:jc w:val="left"/>
-            </w:pPr>
-            <w:r>
-              <w:t xml:space="preserve">~0:05 and ~1:20</w:t>
-            </w:r>
-          </w:p>
-        </w:tc>
-        <w:tc>
-          <w:tcPr/>
-          <w:p>
-            <w:pPr>
-              <w:pStyle w:val="Compact"/>
-              <w:jc w:val="left"/>
-            </w:pPr>
-            <w:r>
-              <w:t xml:space="preserve">Live poll, QR on slide</w:t>
-            </w:r>
-          </w:p>
-        </w:tc>
-        <w:tc>
-          <w:tcPr/>
-          <w:p>
-            <w:pPr>
-              <w:pStyle w:val="Compact"/>
-              <w:jc w:val="left"/>
-            </w:pPr>
-            <w:r>
-              <w:t xml:space="preserve">Menti (placeholder)</w:t>
-            </w:r>
-          </w:p>
-        </w:tc>
-        <w:tc>
-          <w:tcPr/>
-          <w:p>
-            <w:pPr>
-              <w:pStyle w:val="Compact"/>
-              <w:jc w:val="left"/>
-            </w:pPr>
-            <w:r>
-              <w:t xml:space="preserve">Recommend rollout? Yes / No / Only with changes.</w:t>
-            </w:r>
-          </w:p>
-        </w:tc>
-        <w:tc>
-          <w:tcPr/>
-          <w:p>
-            <w:pPr>
-              <w:pStyle w:val="Compact"/>
-              <w:jc w:val="left"/>
-            </w:pPr>
-            <w:r>
-              <w:t xml:space="preserve">Make: Menti poll (online). Nothing to print.</w:t>
-            </w:r>
-          </w:p>
-        </w:tc>
-        <w:tc>
-          <w:tcPr/>
-          <w:p>
-            <w:pPr>
-              <w:pStyle w:val="Compact"/>
-              <w:jc w:val="left"/>
-            </w:pPr>
-            <w:r>
-              <w:t xml:space="preserve">Poll to build</w:t>
+              <w:t>Corrected evidence</w:t>
+            </w:r>
+          </w:p>
+        </w:tc>
+        <w:tc>
+          <w:tcPr/>
+          <w:p>
+            <w:pPr>
+              <w:pStyle w:val="Compact"/>
+              <w:jc w:val="left"/>
+            </w:pPr>
+            <w:r>
+              <w:t>0-10 min</w:t>
+            </w:r>
+          </w:p>
+        </w:tc>
+        <w:tc>
+          <w:tcPr/>
+          <w:p>
+            <w:pPr>
+              <w:pStyle w:val="Compact"/>
+              <w:jc w:val="left"/>
+            </w:pPr>
+            <w:r>
+              <w:t>Individual then pairs</w:t>
+            </w:r>
+          </w:p>
+        </w:tc>
+        <w:tc>
+          <w:tcPr/>
+          <w:p>
+            <w:pPr>
+              <w:pStyle w:val="Compact"/>
+              <w:jc w:val="left"/>
+            </w:pPr>
+            <w:r>
+              <w:t>One-page findings reference</w:t>
+            </w:r>
+          </w:p>
+        </w:tc>
+        <w:tc>
+          <w:tcPr/>
+          <w:p>
+            <w:pPr>
+              <w:pStyle w:val="Compact"/>
+              <w:jc w:val="left"/>
+            </w:pPr>
+            <w:r>
+              <w:t>Saving rule, cause/reach and cost assumptions are separate</w:t>
+            </w:r>
+          </w:p>
+        </w:tc>
+        <w:tc>
+          <w:tcPr/>
+          <w:p>
+            <w:pPr>
+              <w:pStyle w:val="Compact"/>
+              <w:jc w:val="left"/>
+            </w:pPr>
+            <w:r>
+              <w:t>One findings reference plus participant two-sided sheet per person</w:t>
+            </w:r>
+          </w:p>
+        </w:tc>
+        <w:tc>
+          <w:tcPr/>
+          <w:p>
+            <w:pPr>
+              <w:pStyle w:val="Compact"/>
+              <w:jc w:val="left"/>
+            </w:pPr>
+            <w:r>
+              <w:t>Built</w:t>
             </w:r>
           </w:p>
         </w:tc>
@@ -5865,79 +5897,79 @@
               <w:jc w:val="left"/>
             </w:pPr>
             <w:r>
-              <w:t xml:space="preserve">Read the six findings</w:t>
-            </w:r>
-          </w:p>
-        </w:tc>
-        <w:tc>
-          <w:tcPr/>
-          <w:p>
-            <w:pPr>
-              <w:pStyle w:val="Compact"/>
-              <w:jc w:val="left"/>
-            </w:pPr>
-            <w:r>
-              <w:t xml:space="preserve">~0:10–0:35 · Section 1</w:t>
-            </w:r>
-          </w:p>
-        </w:tc>
-        <w:tc>
-          <w:tcPr/>
-          <w:p>
-            <w:pPr>
-              <w:pStyle w:val="Compact"/>
-              <w:jc w:val="left"/>
-            </w:pPr>
-            <w:r>
-              <w:t xml:space="preserve">Individual/pairs reading</w:t>
-            </w:r>
-          </w:p>
-        </w:tc>
-        <w:tc>
-          <w:tcPr/>
-          <w:p>
-            <w:pPr>
-              <w:pStyle w:val="Compact"/>
-              <w:jc w:val="left"/>
-            </w:pPr>
-            <w:r>
-              <w:t xml:space="preserve">Findings pack (existing)</w:t>
-            </w:r>
-          </w:p>
-        </w:tc>
-        <w:tc>
-          <w:tcPr/>
-          <w:p>
-            <w:pPr>
-              <w:pStyle w:val="Compact"/>
-              <w:jc w:val="left"/>
-            </w:pPr>
-            <w:r>
-              <w:t xml:space="preserve">Mark what each finding can and cannot bear. Print only.</w:t>
-            </w:r>
-          </w:p>
-        </w:tc>
-        <w:tc>
-          <w:tcPr/>
-          <w:p>
-            <w:pPr>
-              <w:pStyle w:val="Compact"/>
-              <w:jc w:val="left"/>
-            </w:pPr>
-            <w:r>
-              <w:t xml:space="preserve">Print: findings pack (Oct15_session2_findings.docx), 1 per participant (40).</w:t>
-            </w:r>
-          </w:p>
-        </w:tc>
-        <w:tc>
-          <w:tcPr/>
-          <w:p>
-            <w:pPr>
-              <w:pStyle w:val="Compact"/>
-              <w:jc w:val="left"/>
-            </w:pPr>
-            <w:r>
-              <w:t xml:space="preserve">Built: print</w:t>
+              <w:t>Short brief model</w:t>
+            </w:r>
+          </w:p>
+        </w:tc>
+        <w:tc>
+          <w:tcPr/>
+          <w:p>
+            <w:pPr>
+              <w:pStyle w:val="Compact"/>
+              <w:jc w:val="left"/>
+            </w:pPr>
+            <w:r>
+              <w:t>10-15 min</w:t>
+            </w:r>
+          </w:p>
+        </w:tc>
+        <w:tc>
+          <w:tcPr/>
+          <w:p>
+            <w:pPr>
+              <w:pStyle w:val="Compact"/>
+              <w:jc w:val="left"/>
+            </w:pPr>
+            <w:r>
+              <w:t>Pairs</w:t>
+            </w:r>
+          </w:p>
+        </w:tc>
+        <w:tc>
+          <w:tcPr/>
+          <w:p>
+            <w:pPr>
+              <w:pStyle w:val="Compact"/>
+              <w:jc w:val="left"/>
+            </w:pPr>
+            <w:r>
+              <w:t>Four-part example in deck</w:t>
+            </w:r>
+          </w:p>
+        </w:tc>
+        <w:tc>
+          <w:tcPr/>
+          <w:p>
+            <w:pPr>
+              <w:pStyle w:val="Compact"/>
+              <w:jc w:val="left"/>
+            </w:pPr>
+            <w:r>
+              <w:t>Finding, recommendation, risk and next evidence</w:t>
+            </w:r>
+          </w:p>
+        </w:tc>
+        <w:tc>
+          <w:tcPr/>
+          <w:p>
+            <w:pPr>
+              <w:pStyle w:val="Compact"/>
+              <w:jc w:val="left"/>
+            </w:pPr>
+            <w:r>
+              <w:t>No extra print</w:t>
+            </w:r>
+          </w:p>
+        </w:tc>
+        <w:tc>
+          <w:tcPr/>
+          <w:p>
+            <w:pPr>
+              <w:pStyle w:val="Compact"/>
+              <w:jc w:val="left"/>
+            </w:pPr>
+            <w:r>
+              <w:t>Built</w:t>
             </w:r>
           </w:p>
         </w:tc>
@@ -5951,79 +5983,79 @@
               <w:jc w:val="left"/>
             </w:pPr>
             <w:r>
-              <w:t xml:space="preserve">Where does the verdict flip? (slider)</w:t>
-            </w:r>
-          </w:p>
-        </w:tc>
-        <w:tc>
-          <w:tcPr/>
-          <w:p>
-            <w:pPr>
-              <w:pStyle w:val="Compact"/>
-              <w:jc w:val="left"/>
-            </w:pPr>
-            <w:r>
-              <w:t xml:space="preserve">~0:15 · Finding 2</w:t>
-            </w:r>
-          </w:p>
-        </w:tc>
-        <w:tc>
-          <w:tcPr/>
-          <w:p>
-            <w:pPr>
-              <w:pStyle w:val="Compact"/>
-              <w:jc w:val="left"/>
-            </w:pPr>
-            <w:r>
-              <w:t xml:space="preserve">Whole-room prediction, live slider</w:t>
-            </w:r>
-          </w:p>
-        </w:tc>
-        <w:tc>
-          <w:tcPr/>
-          <w:p>
-            <w:pPr>
-              <w:pStyle w:val="Compact"/>
-              <w:jc w:val="left"/>
-            </w:pPr>
-            <w:r>
-              <w:t xml:space="preserve">None</w:t>
-            </w:r>
-          </w:p>
-        </w:tc>
-        <w:tc>
-          <w:tcPr/>
-          <w:p>
-            <w:pPr>
-              <w:pStyle w:val="Compact"/>
-              <w:jc w:val="left"/>
-            </w:pPr>
-            <w:r>
-              <w:t xml:space="preserve">Move the 900 AED threshold; who chose it? No build.</w:t>
-            </w:r>
-          </w:p>
-        </w:tc>
-        <w:tc>
-          <w:tcPr/>
-          <w:p>
-            <w:pPr>
-              <w:pStyle w:val="Compact"/>
-              <w:jc w:val="left"/>
-            </w:pPr>
-            <w:r>
-              <w:t xml:space="preserve">Nothing to print or make.</w:t>
-            </w:r>
-          </w:p>
-        </w:tc>
-        <w:tc>
-          <w:tcPr/>
-          <w:p>
-            <w:pPr>
-              <w:pStyle w:val="Compact"/>
-              <w:jc w:val="left"/>
-            </w:pPr>
-            <w:r>
-              <w:t xml:space="preserve">In slides</w:t>
+              <w:t>Draft the brief</w:t>
+            </w:r>
+          </w:p>
+        </w:tc>
+        <w:tc>
+          <w:tcPr/>
+          <w:p>
+            <w:pPr>
+              <w:pStyle w:val="Compact"/>
+              <w:jc w:val="left"/>
+            </w:pPr>
+            <w:r>
+              <w:t>15-27 min</w:t>
+            </w:r>
+          </w:p>
+        </w:tc>
+        <w:tc>
+          <w:tcPr/>
+          <w:p>
+            <w:pPr>
+              <w:pStyle w:val="Compact"/>
+              <w:jc w:val="left"/>
+            </w:pPr>
+            <w:r>
+              <w:t>Individual</w:t>
+            </w:r>
+          </w:p>
+        </w:tc>
+        <w:tc>
+          <w:tcPr/>
+          <w:p>
+            <w:pPr>
+              <w:pStyle w:val="Compact"/>
+              <w:jc w:val="left"/>
+            </w:pPr>
+            <w:r>
+              <w:t>Participant Sheet 1</w:t>
+            </w:r>
+          </w:p>
+        </w:tc>
+        <w:tc>
+          <w:tcPr/>
+          <w:p>
+            <w:pPr>
+              <w:pStyle w:val="Compact"/>
+              <w:jc w:val="left"/>
+            </w:pPr>
+            <w:r>
+              <w:t>At most 150 words, sources open, no AI in first draft</w:t>
+            </w:r>
+          </w:p>
+        </w:tc>
+        <w:tc>
+          <w:tcPr/>
+          <w:p>
+            <w:pPr>
+              <w:pStyle w:val="Compact"/>
+              <w:jc w:val="left"/>
+            </w:pPr>
+            <w:r>
+              <w:t>Separate one-page template optional; already included in Sheet 1</w:t>
+            </w:r>
+          </w:p>
+        </w:tc>
+        <w:tc>
+          <w:tcPr/>
+          <w:p>
+            <w:pPr>
+              <w:pStyle w:val="Compact"/>
+              <w:jc w:val="left"/>
+            </w:pPr>
+            <w:r>
+              <w:t>Built</w:t>
             </w:r>
           </w:p>
         </w:tc>
@@ -6037,79 +6069,79 @@
               <w:jc w:val="left"/>
             </w:pPr>
             <w:r>
-              <w:t xml:space="preserve">Test your headline</w:t>
-            </w:r>
-          </w:p>
-        </w:tc>
-        <w:tc>
-          <w:tcPr/>
-          <w:p>
-            <w:pPr>
-              <w:pStyle w:val="Compact"/>
-              <w:jc w:val="left"/>
-            </w:pPr>
-            <w:r>
-              <w:t xml:space="preserve">~0:45 · Section 2</w:t>
-            </w:r>
-          </w:p>
-        </w:tc>
-        <w:tc>
-          <w:tcPr/>
-          <w:p>
-            <w:pPr>
-              <w:pStyle w:val="Compact"/>
-              <w:jc w:val="left"/>
-            </w:pPr>
-            <w:r>
-              <w:t xml:space="preserve">Whole room, live checker</w:t>
-            </w:r>
-          </w:p>
-        </w:tc>
-        <w:tc>
-          <w:tcPr/>
-          <w:p>
-            <w:pPr>
-              <w:pStyle w:val="Compact"/>
-              <w:jc w:val="left"/>
-            </w:pPr>
-            <w:r>
-              <w:t xml:space="preserve">None</w:t>
-            </w:r>
-          </w:p>
-        </w:tc>
-        <w:tc>
-          <w:tcPr/>
-          <w:p>
-            <w:pPr>
-              <w:pStyle w:val="Compact"/>
-              <w:jc w:val="left"/>
-            </w:pPr>
-            <w:r>
-              <w:t xml:space="preserve">Participants read out headline sentences; the trainer types them into the live cell, which checks for the number and the threshold. It is a word search: use it to start the discussion.</w:t>
-            </w:r>
-          </w:p>
-        </w:tc>
-        <w:tc>
-          <w:tcPr/>
-          <w:p>
-            <w:pPr>
-              <w:pStyle w:val="Compact"/>
-              <w:jc w:val="left"/>
-            </w:pPr>
-            <w:r>
-              <w:t xml:space="preserve">Nothing to print or make.</w:t>
-            </w:r>
-          </w:p>
-        </w:tc>
-        <w:tc>
-          <w:tcPr/>
-          <w:p>
-            <w:pPr>
-              <w:pStyle w:val="Compact"/>
-              <w:jc w:val="left"/>
-            </w:pPr>
-            <w:r>
-              <w:t xml:space="preserve">In slides</w:t>
+              <w:t>Peer review and repair</w:t>
+            </w:r>
+          </w:p>
+        </w:tc>
+        <w:tc>
+          <w:tcPr/>
+          <w:p>
+            <w:pPr>
+              <w:pStyle w:val="Compact"/>
+              <w:jc w:val="left"/>
+            </w:pPr>
+            <w:r>
+              <w:t>27-42 min</w:t>
+            </w:r>
+          </w:p>
+        </w:tc>
+        <w:tc>
+          <w:tcPr/>
+          <w:p>
+            <w:pPr>
+              <w:pStyle w:val="Compact"/>
+              <w:jc w:val="left"/>
+            </w:pPr>
+            <w:r>
+              <w:t>Pairs then individual</w:t>
+            </w:r>
+          </w:p>
+        </w:tc>
+        <w:tc>
+          <w:tcPr/>
+          <w:p>
+            <w:pPr>
+              <w:pStyle w:val="Compact"/>
+              <w:jc w:val="left"/>
+            </w:pPr>
+            <w:r>
+              <w:t>Participant Sheet 2</w:t>
+            </w:r>
+          </w:p>
+        </w:tc>
+        <w:tc>
+          <w:tcPr/>
+          <w:p>
+            <w:pPr>
+              <w:pStyle w:val="Compact"/>
+              <w:jc w:val="left"/>
+            </w:pPr>
+            <w:r>
+              <w:t>Cite finding anchor; identify material limit; revise one sentence</w:t>
+            </w:r>
+          </w:p>
+        </w:tc>
+        <w:tc>
+          <w:tcPr/>
+          <w:p>
+            <w:pPr>
+              <w:pStyle w:val="Compact"/>
+              <w:jc w:val="left"/>
+            </w:pPr>
+            <w:r>
+              <w:t>Trainer key only; no number-matching script</w:t>
+            </w:r>
+          </w:p>
+        </w:tc>
+        <w:tc>
+          <w:tcPr/>
+          <w:p>
+            <w:pPr>
+              <w:pStyle w:val="Compact"/>
+              <w:jc w:val="left"/>
+            </w:pPr>
+            <w:r>
+              <w:t>Built</w:t>
             </w:r>
           </w:p>
         </w:tc>
@@ -6123,79 +6155,79 @@
               <w:jc w:val="left"/>
             </w:pPr>
             <w:r>
-              <w:t xml:space="preserve">Write the brief</w:t>
-            </w:r>
-          </w:p>
-        </w:tc>
-        <w:tc>
-          <w:tcPr/>
-          <w:p>
-            <w:pPr>
-              <w:pStyle w:val="Compact"/>
-              <w:jc w:val="left"/>
-            </w:pPr>
-            <w:r>
-              <w:t xml:space="preserve">~0:50 · Section 2</w:t>
-            </w:r>
-          </w:p>
-        </w:tc>
-        <w:tc>
-          <w:tcPr/>
-          <w:p>
-            <w:pPr>
-              <w:pStyle w:val="Compact"/>
-              <w:jc w:val="left"/>
-            </w:pPr>
-            <w:r>
-              <w:t xml:space="preserve">Pair writing</w:t>
-            </w:r>
-          </w:p>
-        </w:tc>
-        <w:tc>
-          <w:tcPr/>
-          <w:p>
-            <w:pPr>
-              <w:pStyle w:val="Compact"/>
-              <w:jc w:val="left"/>
-            </w:pPr>
-            <w:r>
-              <w:t xml:space="preserve">Brief template (existing), 1 per pair</w:t>
-            </w:r>
-          </w:p>
-        </w:tc>
-        <w:tc>
-          <w:tcPr/>
-          <w:p>
-            <w:pPr>
-              <w:pStyle w:val="Compact"/>
-              <w:jc w:val="left"/>
-            </w:pPr>
-            <w:r>
-              <w:t xml:space="preserve">Four elements, one side of A4.</w:t>
-            </w:r>
-          </w:p>
-        </w:tc>
-        <w:tc>
-          <w:tcPr/>
-          <w:p>
-            <w:pPr>
-              <w:pStyle w:val="Compact"/>
-              <w:jc w:val="left"/>
-            </w:pPr>
-            <w:r>
-              <w:t xml:space="preserve">Print: brief template (Oct15_session2_brief_template.docx), 1 per pair (about 20).</w:t>
-            </w:r>
-          </w:p>
-        </w:tc>
-        <w:tc>
-          <w:tcPr/>
-          <w:p>
-            <w:pPr>
-              <w:pStyle w:val="Compact"/>
-              <w:jc w:val="left"/>
-            </w:pPr>
-            <w:r>
-              <w:t xml:space="preserve">Built: print</w:t>
+              <w:t>AI source check and defence</w:t>
+            </w:r>
+          </w:p>
+        </w:tc>
+        <w:tc>
+          <w:tcPr/>
+          <w:p>
+            <w:pPr>
+              <w:pStyle w:val="Compact"/>
+              <w:jc w:val="left"/>
+            </w:pPr>
+            <w:r>
+              <w:t>42-54 min</w:t>
+            </w:r>
+          </w:p>
+        </w:tc>
+        <w:tc>
+          <w:tcPr/>
+          <w:p>
+            <w:pPr>
+              <w:pStyle w:val="Compact"/>
+              <w:jc w:val="left"/>
+            </w:pPr>
+            <w:r>
+              <w:t>Pairs and room</w:t>
+            </w:r>
+          </w:p>
+        </w:tc>
+        <w:tc>
+          <w:tcPr/>
+          <w:p>
+            <w:pPr>
+              <w:pStyle w:val="Compact"/>
+              <w:jc w:val="left"/>
+            </w:pPr>
+            <w:r>
+              <w:t>Authored AI draft; native feedback</w:t>
+            </w:r>
+          </w:p>
+        </w:tc>
+        <w:tc>
+          <w:tcPr/>
+          <w:p>
+            <w:pPr>
+              <w:pStyle w:val="Compact"/>
+              <w:jc w:val="left"/>
+            </w:pPr>
+            <w:r>
+              <w:t>Accurate numbers do not establish nationwide approval</w:t>
+            </w:r>
+          </w:p>
+        </w:tc>
+        <w:tc>
+          <w:tcPr/>
+          <w:p>
+            <w:pPr>
+              <w:pStyle w:val="Compact"/>
+              <w:jc w:val="left"/>
+            </w:pPr>
+            <w:r>
+              <w:t>No AI account or new model demo</w:t>
+            </w:r>
+          </w:p>
+        </w:tc>
+        <w:tc>
+          <w:tcPr/>
+          <w:p>
+            <w:pPr>
+              <w:pStyle w:val="Compact"/>
+              <w:jc w:val="left"/>
+            </w:pPr>
+            <w:r>
+              <w:t>Built</w:t>
             </w:r>
           </w:p>
         </w:tc>
@@ -6209,251 +6241,79 @@
               <w:jc w:val="left"/>
             </w:pPr>
             <w:r>
-              <w:t xml:space="preserve">Swap and critique</w:t>
-            </w:r>
-          </w:p>
-        </w:tc>
-        <w:tc>
-          <w:tcPr/>
-          <w:p>
-            <w:pPr>
-              <w:pStyle w:val="Compact"/>
-              <w:jc w:val="left"/>
-            </w:pPr>
-            <w:r>
-              <w:t xml:space="preserve">~1:05 · Section 3</w:t>
-            </w:r>
-          </w:p>
-        </w:tc>
-        <w:tc>
-          <w:tcPr/>
-          <w:p>
-            <w:pPr>
-              <w:pStyle w:val="Compact"/>
-              <w:jc w:val="left"/>
-            </w:pPr>
-            <w:r>
-              <w:t xml:space="preserve">Peer critique</w:t>
-            </w:r>
-          </w:p>
-        </w:tc>
-        <w:tc>
-          <w:tcPr/>
-          <w:p>
-            <w:pPr>
-              <w:pStyle w:val="Compact"/>
-              <w:jc w:val="left"/>
-            </w:pPr>
-            <w:r>
-              <w:t xml:space="preserve">Peer critique sheet (pack page 1), 1 per pair</w:t>
-            </w:r>
-          </w:p>
-        </w:tc>
-        <w:tc>
-          <w:tcPr/>
-          <w:p>
-            <w:pPr>
-              <w:pStyle w:val="Compact"/>
-              <w:jc w:val="left"/>
-            </w:pPr>
-            <w:r>
-              <w:t xml:space="preserve">Pairs swap and answer three questions, then tick the six checks. A volunteer pair’s brief is run through the live checker.</w:t>
-            </w:r>
-          </w:p>
-        </w:tc>
-        <w:tc>
-          <w:tcPr/>
-          <w:p>
-            <w:pPr>
-              <w:pStyle w:val="Compact"/>
-              <w:jc w:val="left"/>
-            </w:pPr>
-            <w:r>
-              <w:t xml:space="preserve">Print: peer critique sheet (pack page 1), 1 per pair (about 20).</w:t>
-            </w:r>
-          </w:p>
-        </w:tc>
-        <w:tc>
-          <w:tcPr/>
-          <w:p>
-            <w:pPr>
-              <w:pStyle w:val="Compact"/>
-              <w:jc w:val="left"/>
-            </w:pPr>
-            <w:r>
-              <w:t xml:space="preserve">Built: print</w:t>
-            </w:r>
-          </w:p>
-        </w:tc>
-      </w:tr>
-      <w:tr>
-        <w:tc>
-          <w:tcPr/>
-          <w:p>
-            <w:pPr>
-              <w:pStyle w:val="Compact"/>
-              <w:jc w:val="left"/>
-            </w:pPr>
-            <w:r>
-              <w:t xml:space="preserve">AI Snapshot: edit the AI draft</w:t>
-            </w:r>
-          </w:p>
-        </w:tc>
-        <w:tc>
-          <w:tcPr/>
-          <w:p>
-            <w:pPr>
-              <w:pStyle w:val="Compact"/>
-              <w:jc w:val="left"/>
-            </w:pPr>
-            <w:r>
-              <w:t xml:space="preserve">~1:12 · Section 4</w:t>
-            </w:r>
-          </w:p>
-        </w:tc>
-        <w:tc>
-          <w:tcPr/>
-          <w:p>
-            <w:pPr>
-              <w:pStyle w:val="Compact"/>
-              <w:jc w:val="left"/>
-            </w:pPr>
-            <w:r>
-              <w:t xml:space="preserve">Group editing + AI</w:t>
-            </w:r>
-          </w:p>
-        </w:tc>
-        <w:tc>
-          <w:tcPr/>
-          <w:p>
-            <w:pPr>
-              <w:pStyle w:val="Compact"/>
-              <w:jc w:val="left"/>
-            </w:pPr>
-            <w:r>
-              <w:t xml:space="preserve">The AI draft (pack page 2), 1 per group; AI device</w:t>
-            </w:r>
-          </w:p>
-        </w:tc>
-        <w:tc>
-          <w:tcPr/>
-          <w:p>
-            <w:pPr>
-              <w:pStyle w:val="Compact"/>
-              <w:jc w:val="left"/>
-            </w:pPr>
-            <w:r>
-              <w:t xml:space="preserve">Groups edit the draft on paper (four flagged problems, two omissions), the trainer runs the checker on it live (it fails four of six), then groups run the better prompt.</w:t>
-            </w:r>
-          </w:p>
-        </w:tc>
-        <w:tc>
-          <w:tcPr/>
-          <w:p>
-            <w:pPr>
-              <w:pStyle w:val="Compact"/>
-              <w:jc w:val="left"/>
-            </w:pPr>
-            <w:r>
-              <w:t xml:space="preserve">Print: the AI draft (pack page 2), 1 per group (8). Bring: one device with an AI tool per group.</w:t>
-            </w:r>
-          </w:p>
-        </w:tc>
-        <w:tc>
-          <w:tcPr/>
-          <w:p>
-            <w:pPr>
-              <w:pStyle w:val="Compact"/>
-              <w:jc w:val="left"/>
-            </w:pPr>
-            <w:r>
-              <w:t xml:space="preserve">Built: print</w:t>
-            </w:r>
-          </w:p>
-        </w:tc>
-      </w:tr>
-      <w:tr>
-        <w:tc>
-          <w:tcPr/>
-          <w:p>
-            <w:pPr>
-              <w:pStyle w:val="Compact"/>
-              <w:jc w:val="left"/>
-            </w:pPr>
-            <w:r>
-              <w:t xml:space="preserve">Take-away card</w:t>
-            </w:r>
-          </w:p>
-        </w:tc>
-        <w:tc>
-          <w:tcPr/>
-          <w:p>
-            <w:pPr>
-              <w:pStyle w:val="Compact"/>
-              <w:jc w:val="left"/>
-            </w:pPr>
-            <w:r>
-              <w:t xml:space="preserve">~1:28 · Close</w:t>
-            </w:r>
-          </w:p>
-        </w:tc>
-        <w:tc>
-          <w:tcPr/>
-          <w:p>
-            <w:pPr>
-              <w:pStyle w:val="Compact"/>
-              <w:jc w:val="left"/>
-            </w:pPr>
-            <w:r>
-              <w:t xml:space="preserve">Handout</w:t>
-            </w:r>
-          </w:p>
-        </w:tc>
-        <w:tc>
-          <w:tcPr/>
-          <w:p>
-            <w:pPr>
-              <w:pStyle w:val="Compact"/>
-              <w:jc w:val="left"/>
-            </w:pPr>
-            <w:r>
-              <w:t xml:space="preserve">Pocket cards</w:t>
-            </w:r>
-          </w:p>
-        </w:tc>
-        <w:tc>
-          <w:tcPr/>
-          <w:p>
-            <w:pPr>
-              <w:pStyle w:val="Compact"/>
-              <w:jc w:val="left"/>
-            </w:pPr>
-            <w:r>
-              <w:t xml:space="preserve">What makes a brief trustworthy: six rules.</w:t>
-            </w:r>
-          </w:p>
-        </w:tc>
-        <w:tc>
-          <w:tcPr/>
-          <w:p>
-            <w:pPr>
-              <w:pStyle w:val="Compact"/>
-              <w:jc w:val="left"/>
-            </w:pPr>
-            <w:r>
-              <w:t xml:space="preserve">Print and cut: take-away cards, 1 per participant (40).</w:t>
-            </w:r>
-          </w:p>
-        </w:tc>
-        <w:tc>
-          <w:tcPr/>
-          <w:p>
-            <w:pPr>
-              <w:pStyle w:val="Compact"/>
-              <w:jc w:val="left"/>
-            </w:pPr>
-            <w:r>
-              <w:t xml:space="preserve">Built: print and cut</w:t>
+              <w:t>Final request and reading retry</w:t>
+            </w:r>
+          </w:p>
+        </w:tc>
+        <w:tc>
+          <w:tcPr/>
+          <w:p>
+            <w:pPr>
+              <w:pStyle w:val="Compact"/>
+              <w:jc w:val="left"/>
+            </w:pPr>
+            <w:r>
+              <w:t>54-60 min</w:t>
+            </w:r>
+          </w:p>
+        </w:tc>
+        <w:tc>
+          <w:tcPr/>
+          <w:p>
+            <w:pPr>
+              <w:pStyle w:val="Compact"/>
+              <w:jc w:val="left"/>
+            </w:pPr>
+            <w:r>
+              <w:t>Individual</w:t>
+            </w:r>
+          </w:p>
+        </w:tc>
+        <w:tc>
+          <w:tcPr/>
+          <w:p>
+            <w:pPr>
+              <w:pStyle w:val="Compact"/>
+              <w:jc w:val="left"/>
+            </w:pPr>
+            <w:r>
+              <w:t>Worksheet; targeted retry if needed</w:t>
+            </w:r>
+          </w:p>
+        </w:tc>
+        <w:tc>
+          <w:tcPr/>
+          <w:p>
+            <w:pPr>
+              <w:pStyle w:val="Compact"/>
+              <w:jc w:val="left"/>
+            </w:pPr>
+            <w:r>
+              <w:t>Request and purpose without AI; record revised reading score separately</w:t>
+            </w:r>
+          </w:p>
+        </w:tc>
+        <w:tc>
+          <w:tcPr/>
+          <w:p>
+            <w:pPr>
+              <w:pStyle w:val="Compact"/>
+              <w:jc w:val="left"/>
+            </w:pPr>
+            <w:r>
+              <w:t>Use Session 1 trainer retry key; optional scrap slip</w:t>
+            </w:r>
+          </w:p>
+        </w:tc>
+        <w:tc>
+          <w:tcPr/>
+          <w:p>
+            <w:pPr>
+              <w:pStyle w:val="Compact"/>
+              <w:jc w:val="left"/>
+            </w:pPr>
+            <w:r>
+              <w:t>Built</w:t>
             </w:r>
           </w:p>
         </w:tc>

</xml_diff>

<commit_message>
Teach regression vocabulary first and standardize case notices
Reorder the first two Day 1 sessions, rebuild the five-term lesson and its worksheets, and refresh the hub and week downloads.

Co-Authored-By: Codex <noreply@openai.com>
</commit_message>
<xml_diff>
--- a/Module_2_Oct_2026_v2/Module2_exercise_plan_v3.docx
+++ b/Module_2_Oct_2026_v2/Module2_exercise_plan_v3.docx
@@ -8,7 +8,7 @@
         <w:pStyle w:val="Heading1"/>
       </w:pPr>
       <w:r>
-        <w:t xml:space="preserve">Module 2: Exercise Plan</w:t>
+        <w:t>Module 2: Exercise Plan</w:t>
       </w:r>
     </w:p>
     <w:p>
@@ -16,7 +16,7 @@
         <w:pStyle w:val="FirstParagraph"/>
       </w:pPr>
       <w:r>
-        <w:t xml:space="preserve">Running brief for PwC · Abu Dhabi Impact Evaluation Training · October 2026 · Version 3, 6 Oct</w:t>
+        <w:t>Running brief for PwC · Abu Dhabi Impact Evaluation Training · October 2026 · Version 3, 6 Oct</w:t>
       </w:r>
     </w:p>
     <w:p>
@@ -24,7 +24,7 @@
         <w:pStyle w:val="BodyText"/>
       </w:pPr>
       <w:r>
-        <w:t xml:space="preserve">This document lists every in-session exercise across Module 2, so PwC can build the materials for each one. For each exercise it gives what it is, roughly when in the session it appears, its type, the materials needed, and a description of what PwC should build.</w:t>
+        <w:t>This document lists every in-session exercise across Module 2, so PwC can build the materials for each one. For each exercise it gives what it is, roughly when in the session it appears, its type, the materials needed, and a description of what PwC should build.</w:t>
       </w:r>
     </w:p>
     <w:p>
@@ -32,7 +32,7 @@
         <w:pStyle w:val="BodyText"/>
       </w:pPr>
       <w:r>
-        <w:t xml:space="preserve">Where an exercise is not fully built into the slides, the slide carries a placeholder (a short Menti quiz or the exercise instructions) and the build details live here. The slides carry the in-room instructions; this doc is the build brief.</w:t>
+        <w:t>Where an exercise is not fully built into the slides, the slide carries a placeholder (a short Menti quiz or the exercise instructions) and the build details live here. The slides carry the in-room instructions; this doc is the build brief.</w:t>
       </w:r>
     </w:p>
     <w:p>
@@ -56,10 +56,10 @@
         <w:pStyle w:val="BodyText"/>
       </w:pPr>
       <w:r>
-        <w:t xml:space="preserve">Four sessions use a wall board, so the room sees every group’s answer at once without anyone voting in front of their peers: Oct 12 S1 (an optional triage grid beside the worksheet, now with four excerpts), Oct 13 S2 (the jump at the line: eight cards and a number line), Oct 14 S1 (the ratio wall) and Oct 15 S1 (the credibility grid, two sheets). Each board is a ready-made poster: send its PDF (</w:t>
+        <w:t>Four sessions use a wall board, so the room sees every group’s answer at once without anyone voting in front of their peers: Oct 12 S2 (an optional triage grid beside the worksheet, now with four excerpts), Oct 13 S2 (the jump at the line: eight cards and a number line), Oct 14 S1 (the ratio wall) and Oct 15 S1 (the credibility grid, two sheets). Each board is a ready-made poster: send its PDF (</w:t>
       </w:r>
       <w:r>
-        <w:t xml:space="preserve">_board_A1.pdf, in the Module_2_Oct_2026_v2 folder) to the printer at A1 landscape and tape it up; nothing to cut or assemble. A preview and the setup notes are in each pack’s facilitator key. Oct 13 S3’s find the twins also gets profile cards per group, with an optional walking version.</w:t>
+        <w:t>_board_A1.pdf, in the Module_2_Oct_2026_v2 folder) to the printer at A1 landscape and tape it up; nothing to cut or assemble. A preview and the setup notes are in each pack’s facilitator key. Oct 13 S3’s find the twins also gets profile cards per group, with an optional walking version.</w:t>
       </w:r>
     </w:p>
     <w:bookmarkStart w:id="20" w:name="room-kit-for-the-week"/>
@@ -68,7 +68,7 @@
         <w:pStyle w:val="Heading3"/>
       </w:pPr>
       <w:r>
-        <w:t xml:space="preserve">Room kit for the week</w:t>
+        <w:t>Room kit for the week</w:t>
       </w:r>
     </w:p>
     <w:p>
@@ -99,19 +99,19 @@
               <w:jc w:val="left"/>
             </w:pPr>
             <w:r>
-              <w:t xml:space="preserve">Item</w:t>
-            </w:r>
-          </w:p>
-        </w:tc>
-        <w:tc>
-          <w:tcPr/>
-          <w:p>
-            <w:pPr>
-              <w:pStyle w:val="Compact"/>
-              <w:jc w:val="left"/>
-            </w:pPr>
-            <w:r>
-              <w:t xml:space="preserve">What and how many</w:t>
+              <w:t>Item</w:t>
+            </w:r>
+          </w:p>
+        </w:tc>
+        <w:tc>
+          <w:tcPr/>
+          <w:p>
+            <w:pPr>
+              <w:pStyle w:val="Compact"/>
+              <w:jc w:val="left"/>
+            </w:pPr>
+            <w:r>
+              <w:t>What and how many</w:t>
             </w:r>
           </w:p>
         </w:tc>
@@ -125,19 +125,19 @@
               <w:jc w:val="left"/>
             </w:pPr>
             <w:r>
-              <w:t xml:space="preserve">A1 posters</w:t>
-            </w:r>
-          </w:p>
-        </w:tc>
-        <w:tc>
-          <w:tcPr/>
-          <w:p>
-            <w:pPr>
-              <w:pStyle w:val="Compact"/>
-              <w:jc w:val="left"/>
-            </w:pPr>
-            <w:r>
-              <w:t xml:space="preserve">Five A1 landscape prints: Oct12_session1_board_A1.pdf (optional), Oct13_session2_board_A1.pdf, Oct14_session1_board_A1.pdf, and Oct15_session1_board_A1.pdf (two sheets).</w:t>
+              <w:t>A1 posters</w:t>
+            </w:r>
+          </w:p>
+        </w:tc>
+        <w:tc>
+          <w:tcPr/>
+          <w:p>
+            <w:pPr>
+              <w:pStyle w:val="Compact"/>
+              <w:jc w:val="left"/>
+            </w:pPr>
+            <w:r>
+              <w:t>Five A1 landscape prints: Oct12_session1_board_A1.pdf (optional), Oct13_session2_board_A1.pdf, Oct14_session1_board_A1.pdf, and Oct15_session1_board_A1.pdf (two sheets).</w:t>
             </w:r>
           </w:p>
         </w:tc>
@@ -151,19 +151,19 @@
               <w:jc w:val="left"/>
             </w:pPr>
             <w:r>
-              <w:t xml:space="preserve">Markers</w:t>
-            </w:r>
-          </w:p>
-        </w:tc>
-        <w:tc>
-          <w:tcPr/>
-          <w:p>
-            <w:pPr>
-              <w:pStyle w:val="Compact"/>
-              <w:jc w:val="left"/>
-            </w:pPr>
-            <w:r>
-              <w:t xml:space="preserve">8 markers in 8 different colours, one per group (Oct 12 S1 board), plus one dark marker per group for sticky notes.</w:t>
+              <w:t>Markers</w:t>
+            </w:r>
+          </w:p>
+        </w:tc>
+        <w:tc>
+          <w:tcPr/>
+          <w:p>
+            <w:pPr>
+              <w:pStyle w:val="Compact"/>
+              <w:jc w:val="left"/>
+            </w:pPr>
+            <w:r>
+              <w:t>8 markers in 8 different colours, one per group (Oct 12 S2 board), plus one dark marker per group for sticky notes.</w:t>
             </w:r>
           </w:p>
         </w:tc>
@@ -177,19 +177,19 @@
               <w:jc w:val="left"/>
             </w:pPr>
             <w:r>
-              <w:t xml:space="preserve">Sticky notes</w:t>
-            </w:r>
-          </w:p>
-        </w:tc>
-        <w:tc>
-          <w:tcPr/>
-          <w:p>
-            <w:pPr>
-              <w:pStyle w:val="Compact"/>
-              <w:jc w:val="left"/>
-            </w:pPr>
-            <w:r>
-              <w:t xml:space="preserve">About 160 small notes (38 x 51 mm) for the Oct 15 S1 grid, and 8 regular notes each for Oct 13 S2 and Oct 14 S1, plus spares.</w:t>
+              <w:t>Sticky notes</w:t>
+            </w:r>
+          </w:p>
+        </w:tc>
+        <w:tc>
+          <w:tcPr/>
+          <w:p>
+            <w:pPr>
+              <w:pStyle w:val="Compact"/>
+              <w:jc w:val="left"/>
+            </w:pPr>
+            <w:r>
+              <w:t>About 160 small notes (38 x 51 mm) for the Oct 15 S1 grid, and 8 regular notes each for Oct 13 S2 and Oct 14 S1, plus spares.</w:t>
             </w:r>
           </w:p>
         </w:tc>
@@ -203,19 +203,19 @@
               <w:jc w:val="left"/>
             </w:pPr>
             <w:r>
-              <w:t xml:space="preserve">Tape</w:t>
-            </w:r>
-          </w:p>
-        </w:tc>
-        <w:tc>
-          <w:tcPr/>
-          <w:p>
-            <w:pPr>
-              <w:pStyle w:val="Compact"/>
-              <w:jc w:val="left"/>
-            </w:pPr>
-            <w:r>
-              <w:t xml:space="preserve">Masking tape or poster putty for the posters (check the venue allows it on the walls).</w:t>
+              <w:t>Tape</w:t>
+            </w:r>
+          </w:p>
+        </w:tc>
+        <w:tc>
+          <w:tcPr/>
+          <w:p>
+            <w:pPr>
+              <w:pStyle w:val="Compact"/>
+              <w:jc w:val="left"/>
+            </w:pPr>
+            <w:r>
+              <w:t>Masking tape or poster putty for the posters (check the venue allows it on the walls).</w:t>
             </w:r>
           </w:p>
         </w:tc>
@@ -229,19 +229,19 @@
               <w:jc w:val="left"/>
             </w:pPr>
             <w:r>
-              <w:t xml:space="preserve">Cutting</w:t>
-            </w:r>
-          </w:p>
-        </w:tc>
-        <w:tc>
-          <w:tcPr/>
-          <w:p>
-            <w:pPr>
-              <w:pStyle w:val="Compact"/>
-              <w:jc w:val="left"/>
-            </w:pPr>
-            <w:r>
-              <w:t xml:space="preserve">Scissors or a guillotine: excerpt slips, profile cards, scenario cards and take-away cards.</w:t>
+              <w:t>Cutting</w:t>
+            </w:r>
+          </w:p>
+        </w:tc>
+        <w:tc>
+          <w:tcPr/>
+          <w:p>
+            <w:pPr>
+              <w:pStyle w:val="Compact"/>
+              <w:jc w:val="left"/>
+            </w:pPr>
+            <w:r>
+              <w:t>Scissors or a guillotine: excerpt slips, profile cards, scenario cards and take-away cards.</w:t>
             </w:r>
           </w:p>
         </w:tc>
@@ -255,7 +255,7 @@
               <w:jc w:val="left"/>
             </w:pPr>
             <w:r>
-              <w:t xml:space="preserve">Devices</w:t>
+              <w:t>Devices</w:t>
             </w:r>
           </w:p>
         </w:tc>
@@ -280,7 +280,7 @@
         <w:pStyle w:val="Heading2"/>
       </w:pPr>
       <w:r>
-        <w:t>Oct 12, Session 1: Question a claim (60 minutes)</w:t>
+        <w:t>Oct 12, Session 1: Read a regression table (60 minutes)</w:t>
       </w:r>
     </w:p>
     <w:p>
@@ -288,7 +288,7 @@
         <w:pStyle w:val="FirstParagraph"/>
       </w:pPr>
       <w:r>
-        <w:t>Approved 6 October 2026. Session length 60 minutes. GreenWaste only, fictional figures. Print the first two pages of Oct12_session1_materials.docx double-sided for participants. Remaining pages are trainer material; page 3 contains one card set per group.</w:t>
+        <w:t>Updated 6 October 2026. Session length 60 minutes. Five terms first: mean, treatment effect, coefficient, p-value and confidence interval. Print participant pages 1 and 2 of Oct12_session1_materials.docx double-sided. Pages 3 and 4 are trainer keys.</w:t>
       </w:r>
     </w:p>
     <w:tbl>
@@ -401,39 +401,39 @@
           <w:tcPr/>
           <w:p>
             <w:r>
-              <w:t>Entry reading task</w:t>
-            </w:r>
-          </w:p>
-        </w:tc>
-        <w:tc>
-          <w:tcPr/>
-          <w:p>
-            <w:r>
-              <w:t>Start of session</w:t>
-            </w:r>
-          </w:p>
-        </w:tc>
-        <w:tc>
-          <w:tcPr/>
-          <w:p>
-            <w:r>
-              <w:t>Individual reading</w:t>
-            </w:r>
-          </w:p>
-        </w:tc>
-        <w:tc>
-          <w:tcPr/>
-          <w:p>
-            <w:r>
-              <w:t>Sheet 1</w:t>
-            </w:r>
-          </w:p>
-        </w:tc>
-        <w:tc>
-          <w:tcPr/>
-          <w:p>
-            <w:r>
-              <w:t>No AI or explanation first. Keep the opening decision and question for later review.</w:t>
+              <w:t>Five-term entry and mean</w:t>
+            </w:r>
+          </w:p>
+        </w:tc>
+        <w:tc>
+          <w:tcPr/>
+          <w:p>
+            <w:r>
+              <w:t>0-11 min</w:t>
+            </w:r>
+          </w:p>
+        </w:tc>
+        <w:tc>
+          <w:tcPr/>
+          <w:p>
+            <w:r>
+              <w:t>Individual then pairs</w:t>
+            </w:r>
+          </w:p>
+        </w:tc>
+        <w:tc>
+          <w:tcPr/>
+          <w:p>
+            <w:r>
+              <w:t>Worksheet; ten recorded values</w:t>
+            </w:r>
+          </w:p>
+        </w:tc>
+        <w:tc>
+          <w:tcPr/>
+          <w:p>
+            <w:r>
+              <w:t>Mean total/count; unusual values; terms are essential reading vocabulary</w:t>
             </w:r>
           </w:p>
         </w:tc>
@@ -459,55 +459,55 @@
           <w:tcPr/>
           <w:p>
             <w:r>
-              <w:t>Extension choice and evidence reveal</w:t>
-            </w:r>
-          </w:p>
-        </w:tc>
-        <w:tc>
-          <w:tcPr/>
-          <w:p>
-            <w:r>
-              <w:t>After case introduction</w:t>
-            </w:r>
-          </w:p>
-        </w:tc>
-        <w:tc>
-          <w:tcPr/>
-          <w:p>
-            <w:r>
-              <w:t>Choice then reveal</w:t>
-            </w:r>
-          </w:p>
-        </w:tc>
-        <w:tc>
-          <w:tcPr/>
-          <w:p>
-            <w:r>
-              <w:t>Local deck controls; optional room poll</w:t>
-            </w:r>
-          </w:p>
-        </w:tc>
-        <w:tc>
-          <w:tcPr/>
-          <w:p>
-            <w:r>
-              <w:t>Choose Extend / Do not extend / Ask first. Reveal the non-participant landfill change only after reasons.</w:t>
-            </w:r>
-          </w:p>
-        </w:tc>
-        <w:tc>
-          <w:tcPr/>
-          <w:p>
-            <w:r>
-              <w:t>Test room phones; otherwise labelled cards</w:t>
-            </w:r>
-          </w:p>
-        </w:tc>
-        <w:tc>
-          <w:tcPr/>
-          <w:p>
-            <w:r>
-              <w:t>Built; venue check pending</w:t>
+              <w:t>Effect and coefficients</w:t>
+            </w:r>
+          </w:p>
+        </w:tc>
+        <w:tc>
+          <w:tcPr/>
+          <w:p>
+            <w:r>
+              <w:t>11-27 min</w:t>
+            </w:r>
+          </w:p>
+        </w:tc>
+        <w:tc>
+          <w:tcPr/>
+          <w:p>
+            <w:r>
+              <w:t>Pairs then trainer Run</w:t>
+            </w:r>
+          </w:p>
+        </w:tc>
+        <w:tc>
+          <w:tcPr/>
+          <w:p>
+            <w:r>
+              <w:t>Actual two-row regression; worksheet</w:t>
+            </w:r>
+          </w:p>
+        </w:tc>
+        <w:tc>
+          <w:tcPr/>
+          <w:p>
+            <w:r>
+              <w:t>Programme effect requires credible comparison; identify baseline and change rows; one short Run</w:t>
+            </w:r>
+          </w:p>
+        </w:tc>
+        <w:tc>
+          <w:tcPr/>
+          <w:p>
+            <w:r>
+              <w:t>Printed regression result as fallback; trainer opens browser R early</w:t>
+            </w:r>
+          </w:p>
+        </w:tc>
+        <w:tc>
+          <w:tcPr/>
+          <w:p>
+            <w:r>
+              <w:t>Built</w:t>
             </w:r>
           </w:p>
         </w:tc>
@@ -517,47 +517,47 @@
           <w:tcPr/>
           <w:p>
             <w:r>
-              <w:t>Ten businesses</w:t>
-            </w:r>
-          </w:p>
-        </w:tc>
-        <w:tc>
-          <w:tcPr/>
-          <w:p>
-            <w:r>
-              <w:t>Before triage</w:t>
-            </w:r>
-          </w:p>
-        </w:tc>
-        <w:tc>
-          <w:tcPr/>
-          <w:p>
-            <w:r>
-              <w:t>Visual reading</w:t>
-            </w:r>
-          </w:p>
-        </w:tc>
-        <w:tc>
-          <w:tcPr/>
-          <w:p>
-            <w:r>
-              <w:t>Sheet 1 and ten-business display</w:t>
-            </w:r>
-          </w:p>
-        </w:tc>
-        <w:tc>
-          <w:tcPr/>
-          <w:p>
-            <w:r>
-              <w:t>Spot the large business and explain why the mean may describe few businesses. No long arithmetic.</w:t>
-            </w:r>
-          </w:p>
-        </w:tc>
-        <w:tc>
-          <w:tcPr/>
-          <w:p>
-            <w:r>
-              <w:t>Included on Sheet 1</w:t>
+              <w:t>Interval and p-value</w:t>
+            </w:r>
+          </w:p>
+        </w:tc>
+        <w:tc>
+          <w:tcPr/>
+          <w:p>
+            <w:r>
+              <w:t>27-40 min</w:t>
+            </w:r>
+          </w:p>
+        </w:tc>
+        <w:tc>
+          <w:tcPr/>
+          <w:p>
+            <w:r>
+              <w:t>Individual then pairs</w:t>
+            </w:r>
+          </w:p>
+        </w:tc>
+        <w:tc>
+          <w:tcPr/>
+          <w:p>
+            <w:r>
+              <w:t>Regression table; native feedback</w:t>
+            </w:r>
+          </w:p>
+        </w:tc>
+        <w:tc>
+          <w:tcPr/>
+          <w:p>
+            <w:r>
+              <w:t>Uncertainty around estimate, not individual spread; significance is not cause or policy importance</w:t>
+            </w:r>
+          </w:p>
+        </w:tc>
+        <w:tc>
+          <w:tcPr/>
+          <w:p>
+            <w:r>
+              <w:t>No additional print</w:t>
             </w:r>
           </w:p>
         </w:tc>
@@ -575,47 +575,47 @@
           <w:tcPr/>
           <w:p>
             <w:r>
-              <w:t>Four-claim triage</w:t>
-            </w:r>
-          </w:p>
-        </w:tc>
-        <w:tc>
-          <w:tcPr/>
-          <w:p>
-            <w:r>
-              <w:t>Main practice</w:t>
-            </w:r>
-          </w:p>
-        </w:tc>
-        <w:tc>
-          <w:tcPr/>
-          <w:p>
-            <w:r>
-              <w:t>Group cards and reasons</w:t>
-            </w:r>
-          </w:p>
-        </w:tc>
-        <w:tc>
-          <w:tcPr/>
-          <w:p>
-            <w:r>
-              <w:t>Sheet 2; four claim slips</w:t>
-            </w:r>
-          </w:p>
-        </w:tc>
-        <w:tc>
-          <w:tcPr/>
-          <w:p>
-            <w:r>
-              <w:t>Preserve Fiona’s four claims. Name the missing question and explain the decision. Discuss two disagreements.</w:t>
-            </w:r>
-          </w:p>
-        </w:tc>
-        <w:tc>
-          <w:tcPr/>
-          <w:p>
-            <w:r>
-              <w:t>One card page per group, cut; optional existing A1 board</w:t>
+              <w:t>Saving rule and independent reading</w:t>
+            </w:r>
+          </w:p>
+        </w:tc>
+        <w:tc>
+          <w:tcPr/>
+          <w:p>
+            <w:r>
+              <w:t>40-55 min</w:t>
+            </w:r>
+          </w:p>
+        </w:tc>
+        <w:tc>
+          <w:tcPr/>
+          <w:p>
+            <w:r>
+              <w:t>Individual then pairs</w:t>
+            </w:r>
+          </w:p>
+        </w:tc>
+        <w:tc>
+          <w:tcPr/>
+          <w:p>
+            <w:r>
+              <w:t>Participant sheet</w:t>
+            </w:r>
+          </w:p>
+        </w:tc>
+        <w:tc>
+          <w:tcPr/>
+          <w:p>
+            <w:r>
+              <w:t>Trace coefficient, interval and p-value; explain all five terms; source check and feedback</w:t>
+            </w:r>
+          </w:p>
+        </w:tc>
+        <w:tc>
+          <w:tcPr/>
+          <w:p>
+            <w:r>
+              <w:t>Protect ten minutes of reading practice</w:t>
             </w:r>
           </w:p>
         </w:tc>
@@ -633,47 +633,47 @@
           <w:tcPr/>
           <w:p>
             <w:r>
-              <w:t>AI claim check and individual close</w:t>
-            </w:r>
-          </w:p>
-        </w:tc>
-        <w:tc>
-          <w:tcPr/>
-          <w:p>
-            <w:r>
-              <w:t>End of session</w:t>
-            </w:r>
-          </w:p>
-        </w:tc>
-        <w:tc>
-          <w:tcPr/>
-          <w:p>
-            <w:r>
-              <w:t>Source checking then retrieval</w:t>
-            </w:r>
-          </w:p>
-        </w:tc>
-        <w:tc>
-          <w:tcPr/>
-          <w:p>
-            <w:r>
-              <w:t>Deck and worksheet</w:t>
-            </w:r>
-          </w:p>
-        </w:tc>
-        <w:tc>
-          <w:tcPr/>
-          <w:p>
-            <w:r>
-              <w:t>Check an authored AI causal claim; finish with one useful question and why it matters.</w:t>
-            </w:r>
-          </w:p>
-        </w:tc>
-        <w:tc>
-          <w:tcPr/>
-          <w:p>
-            <w:r>
-              <w:t>No AI account required</w:t>
+              <w:t>AI repair and reading close</w:t>
+            </w:r>
+          </w:p>
+        </w:tc>
+        <w:tc>
+          <w:tcPr/>
+          <w:p>
+            <w:r>
+              <w:t>55-60 min</w:t>
+            </w:r>
+          </w:p>
+        </w:tc>
+        <w:tc>
+          <w:tcPr/>
+          <w:p>
+            <w:r>
+              <w:t>Individual</w:t>
+            </w:r>
+          </w:p>
+        </w:tc>
+        <w:tc>
+          <w:tcPr/>
+          <w:p>
+            <w:r>
+              <w:t>Authored AI draft; worksheet</w:t>
+            </w:r>
+          </w:p>
+        </w:tc>
+        <w:tc>
+          <w:tcPr/>
+          <w:p>
+            <w:r>
+              <w:t>Repair causal and policy overclaims; independent source-based question</w:t>
+            </w:r>
+          </w:p>
+        </w:tc>
+        <w:tc>
+          <w:tcPr/>
+          <w:p>
+            <w:r>
+              <w:t>No external AI account required; trainer key pages separate</w:t>
             </w:r>
           </w:p>
         </w:tc>
@@ -694,7 +694,7 @@
         <w:pStyle w:val="Heading2"/>
       </w:pPr>
       <w:r>
-        <w:t>Oct 12, Session 2: Read a reported result (60 minutes)</w:t>
+        <w:t>Oct 12, Session 2: Question a claim (60 minutes)</w:t>
       </w:r>
     </w:p>
     <w:p>
@@ -702,7 +702,7 @@
         <w:pStyle w:val="FirstParagraph"/>
       </w:pPr>
       <w:r>
-        <w:t>Approved 6 October 2026. Session length 60 minutes. GreenWaste only, fictional figures. Print the first two pages of Oct12_session2_materials.docx double-sided for participants. Remaining pages are trainer material.</w:t>
+        <w:t>Updated 6 October 2026. Session length 60 minutes. Apply the five terms to claim checking. Print participant pages 1 and 2 of Oct12_session2_materials.docx double-sided. Remaining pages are trainer material; page 3 contains one card set per group.</w:t>
       </w:r>
     </w:p>
     <w:tbl>
@@ -815,47 +815,47 @@
           <w:tcPr/>
           <w:p>
             <w:r>
-              <w:t>Report mark-up</w:t>
-            </w:r>
-          </w:p>
-        </w:tc>
-        <w:tc>
-          <w:tcPr/>
-          <w:p>
-            <w:r>
-              <w:t>Main task</w:t>
-            </w:r>
-          </w:p>
-        </w:tc>
-        <w:tc>
-          <w:tcPr/>
-          <w:p>
-            <w:r>
-              <w:t>Individual then pairs</w:t>
-            </w:r>
-          </w:p>
-        </w:tc>
-        <w:tc>
-          <w:tcPr/>
-          <w:p>
-            <w:r>
-              <w:t>Two-sided participant sheet</w:t>
-            </w:r>
-          </w:p>
-        </w:tc>
-        <w:tc>
-          <w:tcPr/>
-          <w:p>
-            <w:r>
-              <w:t>Circle coefficient, box interval, underline comparison. Find units, period and the rule before giving a decision.</w:t>
-            </w:r>
-          </w:p>
-        </w:tc>
-        <w:tc>
-          <w:tcPr/>
-          <w:p>
-            <w:r>
-              <w:t>One two-sided sheet per person</w:t>
+              <w:t>Entry reading task</w:t>
+            </w:r>
+          </w:p>
+        </w:tc>
+        <w:tc>
+          <w:tcPr/>
+          <w:p>
+            <w:r>
+              <w:t>Start of session</w:t>
+            </w:r>
+          </w:p>
+        </w:tc>
+        <w:tc>
+          <w:tcPr/>
+          <w:p>
+            <w:r>
+              <w:t>Individual reading</w:t>
+            </w:r>
+          </w:p>
+        </w:tc>
+        <w:tc>
+          <w:tcPr/>
+          <w:p>
+            <w:r>
+              <w:t>Sheet 1</w:t>
+            </w:r>
+          </w:p>
+        </w:tc>
+        <w:tc>
+          <w:tcPr/>
+          <w:p>
+            <w:r>
+              <w:t>No AI or explanation first. Keep the opening decision and question for later review.</w:t>
+            </w:r>
+          </w:p>
+        </w:tc>
+        <w:tc>
+          <w:tcPr/>
+          <w:p>
+            <w:r>
+              <w:t>One two-sided participant sheet per person</w:t>
             </w:r>
           </w:p>
         </w:tc>
@@ -873,55 +873,55 @@
           <w:tcPr/>
           <w:p>
             <w:r>
-              <w:t>Short trainer calculation</w:t>
-            </w:r>
-          </w:p>
-        </w:tc>
-        <w:tc>
-          <w:tcPr/>
-          <w:p>
-            <w:r>
-              <w:t>Find its row</w:t>
-            </w:r>
-          </w:p>
-        </w:tc>
-        <w:tc>
-          <w:tcPr/>
-          <w:p>
-            <w:r>
-              <w:t>Prediction then trainer Run</w:t>
-            </w:r>
-          </w:p>
-        </w:tc>
-        <w:tc>
-          <w:tcPr/>
-          <w:p>
-            <w:r>
-              <w:t>webR cell; printed result fallback</w:t>
-            </w:r>
-          </w:p>
-        </w:tc>
-        <w:tc>
-          <w:tcPr/>
-          <w:p>
-            <w:r>
-              <w:t>Run one before/after subtraction. Participants read the output; they do not write or debug code.</w:t>
-            </w:r>
-          </w:p>
-        </w:tc>
-        <w:tc>
-          <w:tcPr/>
-          <w:p>
-            <w:r>
-              <w:t>Open deck early; no extra print</w:t>
-            </w:r>
-          </w:p>
-        </w:tc>
-        <w:tc>
-          <w:tcPr/>
-          <w:p>
-            <w:r>
-              <w:t>Built</w:t>
+              <w:t>Extension choice and evidence reveal</w:t>
+            </w:r>
+          </w:p>
+        </w:tc>
+        <w:tc>
+          <w:tcPr/>
+          <w:p>
+            <w:r>
+              <w:t>After case introduction</w:t>
+            </w:r>
+          </w:p>
+        </w:tc>
+        <w:tc>
+          <w:tcPr/>
+          <w:p>
+            <w:r>
+              <w:t>Choice then reveal</w:t>
+            </w:r>
+          </w:p>
+        </w:tc>
+        <w:tc>
+          <w:tcPr/>
+          <w:p>
+            <w:r>
+              <w:t>Local deck controls; optional room poll</w:t>
+            </w:r>
+          </w:p>
+        </w:tc>
+        <w:tc>
+          <w:tcPr/>
+          <w:p>
+            <w:r>
+              <w:t>Choose Extend / Do not extend / Ask first. Reveal the non-participant landfill change only after reasons.</w:t>
+            </w:r>
+          </w:p>
+        </w:tc>
+        <w:tc>
+          <w:tcPr/>
+          <w:p>
+            <w:r>
+              <w:t>Test room phones; otherwise labelled cards</w:t>
+            </w:r>
+          </w:p>
+        </w:tc>
+        <w:tc>
+          <w:tcPr/>
+          <w:p>
+            <w:r>
+              <w:t>Built; venue check pending</w:t>
             </w:r>
           </w:p>
         </w:tc>
@@ -931,47 +931,47 @@
           <w:tcPr/>
           <w:p>
             <w:r>
-              <w:t>AI summary repair</w:t>
-            </w:r>
-          </w:p>
-        </w:tc>
-        <w:tc>
-          <w:tcPr/>
-          <w:p>
-            <w:r>
-              <w:t>End of session</w:t>
-            </w:r>
-          </w:p>
-        </w:tc>
-        <w:tc>
-          <w:tcPr/>
-          <w:p>
-            <w:r>
-              <w:t>Source checking</w:t>
-            </w:r>
-          </w:p>
-        </w:tc>
-        <w:tc>
-          <w:tcPr/>
-          <w:p>
-            <w:r>
-              <w:t>Sheet 2 and deck</w:t>
-            </w:r>
-          </w:p>
-        </w:tc>
-        <w:tc>
-          <w:tcPr/>
-          <w:p>
-            <w:r>
-              <w:t>Keep the observed fall; remove an unsupported causal and scale-up conclusion. Verify against source evidence.</w:t>
-            </w:r>
-          </w:p>
-        </w:tc>
-        <w:tc>
-          <w:tcPr/>
-          <w:p>
-            <w:r>
-              <w:t>Included on Sheet 2</w:t>
+              <w:t>Ten businesses</w:t>
+            </w:r>
+          </w:p>
+        </w:tc>
+        <w:tc>
+          <w:tcPr/>
+          <w:p>
+            <w:r>
+              <w:t>Before triage</w:t>
+            </w:r>
+          </w:p>
+        </w:tc>
+        <w:tc>
+          <w:tcPr/>
+          <w:p>
+            <w:r>
+              <w:t>Visual reading</w:t>
+            </w:r>
+          </w:p>
+        </w:tc>
+        <w:tc>
+          <w:tcPr/>
+          <w:p>
+            <w:r>
+              <w:t>Sheet 1 and ten-business display</w:t>
+            </w:r>
+          </w:p>
+        </w:tc>
+        <w:tc>
+          <w:tcPr/>
+          <w:p>
+            <w:r>
+              <w:t>Spot the large business and explain why the mean may describe few businesses. No long arithmetic.</w:t>
+            </w:r>
+          </w:p>
+        </w:tc>
+        <w:tc>
+          <w:tcPr/>
+          <w:p>
+            <w:r>
+              <w:t>Included on Sheet 1</w:t>
             </w:r>
           </w:p>
         </w:tc>
@@ -989,47 +989,105 @@
           <w:tcPr/>
           <w:p>
             <w:r>
-              <w:t>Independent decision sentence</w:t>
-            </w:r>
-          </w:p>
-        </w:tc>
-        <w:tc>
-          <w:tcPr/>
-          <w:p>
-            <w:r>
-              <w:t>Close</w:t>
-            </w:r>
-          </w:p>
-        </w:tc>
-        <w:tc>
-          <w:tcPr/>
-          <w:p>
-            <w:r>
-              <w:t>Individual reading</w:t>
-            </w:r>
-          </w:p>
-        </w:tc>
-        <w:tc>
-          <w:tcPr/>
-          <w:p>
-            <w:r>
-              <w:t>Worksheet</w:t>
-            </w:r>
-          </w:p>
-        </w:tc>
-        <w:tc>
-          <w:tcPr/>
-          <w:p>
-            <w:r>
-              <w:t>State result with units, a limit and next question. Significance does not establish cause or meet the rule.</w:t>
-            </w:r>
-          </w:p>
-        </w:tc>
-        <w:tc>
-          <w:tcPr/>
-          <w:p>
-            <w:r>
-              <w:t>Included on worksheet</w:t>
+              <w:t>Four-claim triage</w:t>
+            </w:r>
+          </w:p>
+        </w:tc>
+        <w:tc>
+          <w:tcPr/>
+          <w:p>
+            <w:r>
+              <w:t>Main practice</w:t>
+            </w:r>
+          </w:p>
+        </w:tc>
+        <w:tc>
+          <w:tcPr/>
+          <w:p>
+            <w:r>
+              <w:t>Group cards and reasons</w:t>
+            </w:r>
+          </w:p>
+        </w:tc>
+        <w:tc>
+          <w:tcPr/>
+          <w:p>
+            <w:r>
+              <w:t>Sheet 2; four claim slips</w:t>
+            </w:r>
+          </w:p>
+        </w:tc>
+        <w:tc>
+          <w:tcPr/>
+          <w:p>
+            <w:r>
+              <w:t>Preserve Fiona’s four claims. Name the missing question and explain the decision. Discuss two disagreements.</w:t>
+            </w:r>
+          </w:p>
+        </w:tc>
+        <w:tc>
+          <w:tcPr/>
+          <w:p>
+            <w:r>
+              <w:t>One card page per group, cut; optional existing A1 board</w:t>
+            </w:r>
+          </w:p>
+        </w:tc>
+        <w:tc>
+          <w:tcPr/>
+          <w:p>
+            <w:r>
+              <w:t>Built</w:t>
+            </w:r>
+          </w:p>
+        </w:tc>
+      </w:tr>
+      <w:tr>
+        <w:tc>
+          <w:tcPr/>
+          <w:p>
+            <w:r>
+              <w:t>AI claim check and individual close</w:t>
+            </w:r>
+          </w:p>
+        </w:tc>
+        <w:tc>
+          <w:tcPr/>
+          <w:p>
+            <w:r>
+              <w:t>End of session</w:t>
+            </w:r>
+          </w:p>
+        </w:tc>
+        <w:tc>
+          <w:tcPr/>
+          <w:p>
+            <w:r>
+              <w:t>Source checking then retrieval</w:t>
+            </w:r>
+          </w:p>
+        </w:tc>
+        <w:tc>
+          <w:tcPr/>
+          <w:p>
+            <w:r>
+              <w:t>Deck and worksheet</w:t>
+            </w:r>
+          </w:p>
+        </w:tc>
+        <w:tc>
+          <w:tcPr/>
+          <w:p>
+            <w:r>
+              <w:t>Check an authored AI causal claim; finish with one useful question and why it matters.</w:t>
+            </w:r>
+          </w:p>
+        </w:tc>
+        <w:tc>
+          <w:tcPr/>
+          <w:p>
+            <w:r>
+              <w:t>No AI account required</w:t>
             </w:r>
           </w:p>
         </w:tc>

</xml_diff>